<commit_message>
Expand Discussion and add cited literature (20 references)
Rewrite the Discussion into four engaged subsections with citations to the
sling-specific literature: (1) specialty distribution and the historical
reversal from urology-majority Medicare practice (James, Cantrell, Rogo-Gupta)
to URPS-majority, with the dual-pathway (ABOG+ABU) rationale (Tabakin, Wang);
(2) procedural concentration and the volume-outcome relationship (Berger,
Cartier, Brennand, Holdo); (3) temporal trends and workforce dynamics
(Siegal, Lee) framed by the entrant/exit decomposition; plus updated
limitations and strengths. Rebuild the reference list from 7 generic to 20
real citations and renumber the Introduction superscripts accordingly. docx
re-rendered.

Co-Authored-By: Claude Opus 4.8 (1M context) <noreply@anthropic.com>
</commit_message>
<xml_diff>
--- a/output/manuscript.docx
+++ b/output/manuscript.docx
@@ -214,7 +214,7 @@
         <w:rPr>
           <w:vertAlign w:val="superscript"/>
         </w:rPr>
-        <w:t xml:space="preserve">3,4</w:t>
+        <w:t xml:space="preserve">4,5</w:t>
       </w:r>
       <w:r>
         <w:t xml:space="preserve"> </w:t>
@@ -229,18 +229,6 @@
       </w:pPr>
       <w:r>
         <w:t xml:space="preserve">Several trends make this analysis timely. First, the subspecialty of Female Pelvic Medicine and Reconstructive Surgery—recently renamed Urogynecology and Reconstructive Pelvic Surgery (URPS)—has grown substantially since achieving American Board of Medical Specialties (ABMS) recognition in 2013,</w:t>
-      </w:r>
-      <w:r>
-        <w:rPr>
-          <w:vertAlign w:val="superscript"/>
-        </w:rPr>
-        <w:t xml:space="preserve">5</w:t>
-      </w:r>
-      <w:r>
-        <w:t xml:space="preserve"> </w:t>
-      </w:r>
-      <w:r>
-        <w:t xml:space="preserve">and is certifiable through both obstetrics-gynecology (ABOG) and urology (ABU) training pathways. Second, the US Food and Drug Administration’s reclassification of urogynecologic surgical mesh as a Class III device in 2016 and subsequent market withdrawal orders may have shifted the procedural landscape.</w:t>
       </w:r>
       <w:r>
         <w:rPr>
@@ -252,13 +240,25 @@
         <w:t xml:space="preserve"> </w:t>
       </w:r>
       <w:r>
-        <w:t xml:space="preserve">Third, there is growing interest in procedural concentration—the degree to which a small number of providers account for a disproportionate share of procedures—as a metric relevant to quality improvement and resource allocation.</w:t>
+        <w:t xml:space="preserve">and is certifiable through both obstetrics-gynecology (ABOG) and urology (ABU) training pathways. Second, the US Food and Drug Administration’s actions on urogynecologic surgical mesh, culminating in the 2019 order to stop selling transvaginal mesh for prolapse, reshaped public perception and may have shifted the procedural landscape for slings.</w:t>
       </w:r>
       <w:r>
         <w:rPr>
           <w:vertAlign w:val="superscript"/>
         </w:rPr>
         <w:t xml:space="preserve">7</w:t>
+      </w:r>
+      <w:r>
+        <w:t xml:space="preserve"> </w:t>
+      </w:r>
+      <w:r>
+        <w:t xml:space="preserve">Third, there is growing interest in procedural concentration—the degree to which a small number of providers account for a disproportionate share of procedures—as a metric relevant to quality improvement and resource allocation.</w:t>
+      </w:r>
+      <w:r>
+        <w:rPr>
+          <w:vertAlign w:val="superscript"/>
+        </w:rPr>
+        <w:t xml:space="preserve">8</w:t>
       </w:r>
     </w:p>
     <w:p>
@@ -738,16 +738,16 @@
         <w:pStyle w:val="FirstParagraph"/>
       </w:pPr>
       <w:r>
-        <w:t xml:space="preserve">This national analysis of Medicare claims from 2013 to 2023 shows that URPS physicians perform the majority of midurethral sling procedures (60.8%), with the highest adjusted per-physician volume and the most equitable within-group distribution. The combined gynecologic share increased significantly over the decade, from 60.8% to 70.1%.</w:t>
-      </w:r>
-    </w:p>
-    <w:bookmarkStart w:id="22" w:name="X5a9d6874d63483c97c55807399276ca37c3cb58"/>
+        <w:t xml:space="preserve">This national analysis of Medicare claims from 2013 to 2023 shows that URPS physicians perform the majority of midurethral sling procedures (60.8%), with the highest adjusted per-physician volume and the most equitable within-group distribution. The combined gynecologic share increased significantly over the decade, and workforce decomposition attributes that rise to non-URPS attrition and URPS entry rather than to intensifying individual practice or concentrating care.</w:t>
+      </w:r>
+    </w:p>
+    <w:bookmarkStart w:id="22" w:name="X91e1c95b037f473535ecf00410a7735e835e926"/>
     <w:p>
       <w:pPr>
         <w:pStyle w:val="Heading3"/>
       </w:pPr>
       <w:r>
-        <w:t xml:space="preserve">Subspecialty Dominance and Both Training Pathways</w:t>
+        <w:t xml:space="preserve">Specialty Distribution and the Historical Reversal</w:t>
       </w:r>
     </w:p>
     <w:p>
@@ -755,33 +755,85 @@
         <w:pStyle w:val="FirstParagraph"/>
       </w:pPr>
       <w:r>
-        <w:t xml:space="preserve">A key methodological contribution is the identification of urogynecologists through</w:t>
-      </w:r>
-      <w:r>
-        <w:t xml:space="preserve"> </w:t>
+        <w:t xml:space="preserve">Our finding that fellowship-trained urogynecologists perform roughly three-fifths of Medicare slings, with gynecologists collectively performing the majority, is consistent with contemporary practice-pattern data but marks a reversal from earlier Medicare-specific analyses. Using ACS-NSQIP (2006–2013), James et al. found gynecologists performed 74.2% of sling procedures versus 25.8% by urologists,</w:t>
       </w:r>
       <w:r>
         <w:rPr>
-          <w:b/>
-          <w:bCs/>
+          <w:vertAlign w:val="superscript"/>
         </w:rPr>
-        <w:t xml:space="preserve">both</w:t>
-      </w:r>
-      <w:r>
-        <w:t xml:space="preserve"> </w:t>
-      </w:r>
-      <w:r>
-        <w:t xml:space="preserve">certifying pathways — ABOG (OB/GYN) and ABU (urology). Cross-referencing the ABU roster reassigned 150 urology-typed providers (8.2% of all slings) to URPS, sharpening the finding that midurethral sling surgery in Medicare is predominantly performed by fellowship-trained urogynecologists. The finding is robust: the pooled URPS Gini changed negligibly (0.51 → 0.52) under the reclassification.</w:t>
+        <w:t xml:space="preserve">9</w:t>
+      </w:r>
+      <w:r>
+        <w:t xml:space="preserve"> </w:t>
+      </w:r>
+      <w:r>
+        <w:t xml:space="preserve">and Cantrell et al. reported that urogynecologists performed 54% of stress-incontinence procedures at academic centers (2009–2014).</w:t>
+      </w:r>
+      <w:r>
+        <w:rPr>
+          <w:vertAlign w:val="superscript"/>
+        </w:rPr>
+        <w:t xml:space="preserve">10</w:t>
+      </w:r>
+      <w:r>
+        <w:t xml:space="preserve"> </w:t>
+      </w:r>
+      <w:r>
+        <w:t xml:space="preserve">In the Medicare population specifically, however, Rogo-Gupta et al. found that urologists performed the majority of sling operations in 2002–2007.</w:t>
+      </w:r>
+      <w:r>
+        <w:rPr>
+          <w:vertAlign w:val="superscript"/>
+        </w:rPr>
+        <w:t xml:space="preserve">11</w:t>
+      </w:r>
+      <w:r>
+        <w:t xml:space="preserve"> </w:t>
+      </w:r>
+      <w:r>
+        <w:t xml:space="preserve">Our data, spanning 2013–2023, show that this historical pattern has reversed, with URPS now accounting for the single largest share.</w:t>
+      </w:r>
+    </w:p>
+    <w:p>
+      <w:pPr>
+        <w:pStyle w:val="BodyText"/>
+      </w:pPr>
+      <w:r>
+        <w:t xml:space="preserve">Identifying urogynecologists through both the ABOG (obstetrics-gynecology) and ABU (urology) certifying pathways is central to this result, because URPS is certifiable from either residency. Cross-referencing the ABU roster reassigned 150 urology-typed physicians (8.2% of all slings) to URPS, and the finding was robust — the pooled URPS Gini changed negligibly (0.51 → 0.52). A pathway-agnostic definition is important given that urology- and gynecology-based URPS fellows accrue different intraoperative case volumes during training</w:t>
+      </w:r>
+      <w:r>
+        <w:rPr>
+          <w:vertAlign w:val="superscript"/>
+        </w:rPr>
+        <w:t xml:space="preserve">14</w:t>
+      </w:r>
+      <w:r>
+        <w:t xml:space="preserve"> </w:t>
+      </w:r>
+      <w:r>
+        <w:t xml:space="preserve">and that FPMRS exposure during urology residency is variable;</w:t>
+      </w:r>
+      <w:r>
+        <w:rPr>
+          <w:vertAlign w:val="superscript"/>
+        </w:rPr>
+        <w:t xml:space="preserve">15</w:t>
+      </w:r>
+      <w:r>
+        <w:t xml:space="preserve"> </w:t>
+      </w:r>
+      <w:r>
+        <w:t xml:space="preserve">classifying urology-pathway urogynecologists as general urologists would understate the true subspecialty share.</w:t>
       </w:r>
     </w:p>
     <w:bookmarkEnd w:id="22"/>
-    <w:bookmarkStart w:id="23" w:name="procedural-concentration"/>
+    <w:bookmarkStart w:id="23" w:name="X20e52b27fb040b539cc76dcaad27d56a4599e1f"/>
     <w:p>
       <w:pPr>
         <w:pStyle w:val="Heading3"/>
       </w:pPr>
       <w:r>
-        <w:t xml:space="preserve">Procedural Concentration</w:t>
+        <w:t xml:space="preserve">Procedural Concentration and the Volume–Outcome Relationship</w:t>
       </w:r>
     </w:p>
     <w:p>
@@ -789,17 +841,73 @@
         <w:pStyle w:val="FirstParagraph"/>
       </w:pPr>
       <w:r>
-        <w:t xml:space="preserve">Reporting the Gini coefficient and HHI together makes the concentration finding difficult to attribute to a single metric: the two answer related but distinct questions and agree here. The low absolute HHI for the three main groups (27–89) shows that, although volume is unequally distributed (Gini 0.51–0.55), no individual surgeon approaches a dominant share — this is inequality across many surgeons, not domination by a few. Reporting each physician as the production unit follows workforce-concentration analyses in other surgical specialties; it is explicitly a surgeon-level, not a market-competition, measure.</w:t>
+        <w:t xml:space="preserve">Reporting the Gini coefficient and the Herfindahl–Hirschman Index together makes the concentration finding difficult to attribute to a single metric: the two answer related but distinct questions and agree here. Moderate inequality (Gini 0.51–0.55) coexists with very low absolute HHI (27–89 of 10,000), indicating that sling volume is spread unevenly across many surgeons rather than dominated by a few. Treating each physician as the operative production unit is a surgeon-level, not a market-competition, measure and follows workforce-concentration approaches used in other surgical specialties.</w:t>
+      </w:r>
+    </w:p>
+    <w:p>
+      <w:pPr>
+        <w:pStyle w:val="BodyText"/>
+      </w:pPr>
+      <w:r>
+        <w:t xml:space="preserve">These patterns have clinical significance given the established volume–outcome relationship for midurethral slings. Berger et al. found that higher-volume surgeons had a substantially lower adjusted risk of reoperation for sling failure,</w:t>
+      </w:r>
+      <w:r>
+        <w:rPr>
+          <w:vertAlign w:val="superscript"/>
+        </w:rPr>
+        <w:t xml:space="preserve">16</w:t>
+      </w:r>
+      <w:r>
+        <w:t xml:space="preserve"> </w:t>
+      </w:r>
+      <w:r>
+        <w:t xml:space="preserve">and a systematic review by Cartier et al. found that low-volume surgeons had higher odds of both mesh revision and repeat incontinence procedures.</w:t>
+      </w:r>
+      <w:r>
+        <w:rPr>
+          <w:vertAlign w:val="superscript"/>
+        </w:rPr>
+        <w:t xml:space="preserve">17</w:t>
+      </w:r>
+      <w:r>
+        <w:t xml:space="preserve"> </w:t>
+      </w:r>
+      <w:r>
+        <w:t xml:space="preserve">Brennand and Quan identified a threshold effect, with revision odds declining above roughly 50 cases per year,</w:t>
+      </w:r>
+      <w:r>
+        <w:rPr>
+          <w:vertAlign w:val="superscript"/>
+        </w:rPr>
+        <w:t xml:space="preserve">18</w:t>
+      </w:r>
+      <w:r>
+        <w:t xml:space="preserve"> </w:t>
+      </w:r>
+      <w:r>
+        <w:t xml:space="preserve">and Holdø and Svenningsen found that greater surgeon experience and annual volume improved objective cure rates.</w:t>
+      </w:r>
+      <w:r>
+        <w:rPr>
+          <w:vertAlign w:val="superscript"/>
+        </w:rPr>
+        <w:t xml:space="preserve">19</w:t>
+      </w:r>
+      <w:r>
+        <w:t xml:space="preserve"> </w:t>
+      </w:r>
+      <w:r>
+        <w:t xml:space="preserve">The median observed volumes here (15–19 procedures/year) fall below these thresholds, but the PUF captures only Medicare fee-for-service claims; true per-surgeon volumes — including commercially insured, Medicare Advantage, and younger patients — are higher, and the reported concentration is a lower bound because sub-11-beneficiary providers are suppressed.</w:t>
       </w:r>
     </w:p>
     <w:bookmarkEnd w:id="23"/>
-    <w:bookmarkStart w:id="24" w:name="X78fd0565d65e06e5712212d4c8fe5b6dd524af5"/>
+    <w:bookmarkStart w:id="24" w:name="X72407f3d2516cff3e371fde2da482981afe0115"/>
     <w:p>
       <w:pPr>
         <w:pStyle w:val="Heading3"/>
       </w:pPr>
       <w:r>
-        <w:t xml:space="preserve">Temporal Trends and Workforce Implications</w:t>
+        <w:t xml:space="preserve">Temporal Trends, Workforce Dynamics, and the Evolving SUI Landscape</w:t>
       </w:r>
     </w:p>
     <w:p>
@@ -807,7 +915,43 @@
         <w:pStyle w:val="FirstParagraph"/>
       </w:pPr>
       <w:r>
-        <w:t xml:space="preserve">The repeated-measures model clarifies the mechanism behind the rising gynecologic share. Individual physician volume did not change over time (year RR 1.00), but the number of non-URPS surgeons fell sharply while URPS numbers held steady. The market-share shift is therefore a workforce-composition change — non-URPS attrition — rather than a change in how much any individual operates. The significant 2020 decline (RR 0.89) is consistent with pandemic-related deferral of elective surgery and was robust to excluding 2020.</w:t>
+        <w:t xml:space="preserve">The repeated-measures model and workforce decomposition together clarify the mechanism behind the rising gynecologic share. Individual physician volume did not change over time (year rate ratio 1.00), while the number of non-URPS surgeons fell sharply and URPS numbers held steady; entrant analysis showed URPS contributing the largest inflow of newly observable surgeons and urology exhibiting churn (many entrants offset by more exits) alongside net decline. The market-share shift is therefore a change in workforce composition superimposed on a shrinking total pool, not intensification of individual practice or concentration of care. This mechanism echoes prior work: Siegal et al. showed that the post-2011 decline in sling placement was driven primarily by non-FPMRS providers, while FPMRS providers maintained their volumes,</w:t>
+      </w:r>
+      <w:r>
+        <w:rPr>
+          <w:vertAlign w:val="superscript"/>
+        </w:rPr>
+        <w:t xml:space="preserve">12</w:t>
+      </w:r>
+      <w:r>
+        <w:t xml:space="preserve"> </w:t>
+      </w:r>
+      <w:r>
+        <w:t xml:space="preserve">and Lee et al. documented an approximately 50% national decline in incontinence surgery from 2004 to 2013.</w:t>
+      </w:r>
+      <w:r>
+        <w:rPr>
+          <w:vertAlign w:val="superscript"/>
+        </w:rPr>
+        <w:t xml:space="preserve">13</w:t>
+      </w:r>
+      <w:r>
+        <w:t xml:space="preserve"> </w:t>
+      </w:r>
+      <w:r>
+        <w:t xml:space="preserve">The significant 2020 decline (rate ratio 0.89) is consistent with pandemic-related deferral of elective surgery and was robust to excluding 2020. Finally, the SUI treatment landscape continues to diversify — urethral bulking agents are now positioned alongside slings as a first-line surgical option</w:t>
+      </w:r>
+      <w:r>
+        <w:rPr>
+          <w:vertAlign w:val="superscript"/>
+        </w:rPr>
+        <w:t xml:space="preserve">3,20</w:t>
+      </w:r>
+      <w:r>
+        <w:t xml:space="preserve"> </w:t>
+      </w:r>
+      <w:r>
+        <w:t xml:space="preserve">— and whether this differentially affects specialty-specific sling volumes warrants continued surveillance.</w:t>
       </w:r>
     </w:p>
     <w:bookmarkEnd w:id="24"/>
@@ -883,7 +1027,7 @@
         </w:numPr>
       </w:pPr>
       <w:r>
-        <w:t xml:space="preserve">Ford AA, Rogerson L, Cody JD, Aluko P, Ogah JA. Mid-urethral sling operations for stress urinary incontinence in women. Cochrane Database Syst Rev. 2017;7(7):CD006375.</w:t>
+        <w:t xml:space="preserve">Wu JM. Stress incontinence in women. N Engl J Med. 2021;384(25):2428-2436.</w:t>
       </w:r>
     </w:p>
     <w:p>
@@ -894,7 +1038,7 @@
         </w:numPr>
       </w:pPr>
       <w:r>
-        <w:t xml:space="preserve">Kobashi KC, Albo ME, Dmochowski RR, et al. Surgical treatment of female stress urinary incontinence: AUA/SUFU guideline. J Urol. 2017;198(4):875-883.</w:t>
+        <w:t xml:space="preserve">Ford AA, Rogerson L, Cody JD, Aluko P, Ogah JA. Mid-urethral sling operations for stress urinary incontinence in women. Cochrane Database Syst Rev. 2017;7(7):CD006375.</w:t>
       </w:r>
     </w:p>
     <w:p>
@@ -905,7 +1049,7 @@
         </w:numPr>
       </w:pPr>
       <w:r>
-        <w:t xml:space="preserve">Birkmeyer JD, Stukel TA, Siewers AE, Goodney PP, Wennberg DE, Lucas FL. Surgeon volume and operative mortality in the United States. N Engl J Med. 2003;349(22):2117-2127.</w:t>
+        <w:t xml:space="preserve">Kobashi KC, Vasavada S, Bloschichak A, et al. Updates to surgical treatment of female stress urinary incontinence (SUI): AUA/SUFU guideline (2023). J Urol. 2023;209(6):1091-1098.</w:t>
       </w:r>
     </w:p>
     <w:p>
@@ -916,7 +1060,7 @@
         </w:numPr>
       </w:pPr>
       <w:r>
-        <w:t xml:space="preserve">Reames BN, Ghaferi AA, Birkmeyer JD, Dimick JB. Hospital volume and operative mortality in the modern era. Ann Surg. 2014;260(2):244-251.</w:t>
+        <w:t xml:space="preserve">Birkmeyer JD, Stukel TA, Siewers AE, Goodney PP, Wennberg DE, Lucas FL. Surgeon volume and operative mortality in the United States. N Engl J Med. 2003;349(22):2117-2127.</w:t>
       </w:r>
     </w:p>
     <w:p>
@@ -927,7 +1071,7 @@
         </w:numPr>
       </w:pPr>
       <w:r>
-        <w:t xml:space="preserve">American Board of Medical Specialties. ABMS announces approval of new subspecialty certificate in female pelvic medicine and reconstructive surgery. 2011. Available at: https://www.abms.org.</w:t>
+        <w:t xml:space="preserve">Reames BN, Ghaferi AA, Birkmeyer JD, Dimick JB. Hospital volume and operative mortality in the modern era. Ann Surg. 2014;260(2):244-251.</w:t>
       </w:r>
     </w:p>
     <w:p>
@@ -938,7 +1082,7 @@
         </w:numPr>
       </w:pPr>
       <w:r>
-        <w:t xml:space="preserve">US Food and Drug Administration. FDA takes action to protect women’s health, orders manufacturers of surgical mesh intended for transvaginal repair of pelvic organ prolapse to stop selling all devices. April 16, 2019. Available at: https://www.fda.gov.</w:t>
+        <w:t xml:space="preserve">American Board of Medical Specialties. ABMS announces approval of new subspecialty certificate in female pelvic medicine and reconstructive surgery. 2011. Available at: https://www.abms.org.</w:t>
       </w:r>
     </w:p>
     <w:p>
@@ -949,7 +1093,150 @@
         </w:numPr>
       </w:pPr>
       <w:r>
+        <w:t xml:space="preserve">Berger AA, Tan-Kim J, Menefee SA. The impact of the 2011 US Food and Drug Administration transvaginal mesh communication on utilization of synthetic mid-urethral sling procedures. Int Urogynecol J. 2021;32(8):2227-2231.</w:t>
+      </w:r>
+    </w:p>
+    <w:p>
+      <w:pPr>
+        <w:numPr>
+          <w:ilvl w:val="0"/>
+          <w:numId w:val="1001"/>
+        </w:numPr>
+      </w:pPr>
+      <w:r>
         <w:t xml:space="preserve">Stitzenberg KB, Sigurdson ER, Egleston BL, Starkey RB, Meropol NJ. Centralization of cancer surgery: implications for patient access to optimal care. J Clin Oncol. 2009;27(28):4671-4678.</w:t>
+      </w:r>
+    </w:p>
+    <w:p>
+      <w:pPr>
+        <w:numPr>
+          <w:ilvl w:val="0"/>
+          <w:numId w:val="1001"/>
+        </w:numPr>
+      </w:pPr>
+      <w:r>
+        <w:t xml:space="preserve">James MB, Theofanides MC, Sui W, Onyeji I, Badalato GM, Chung DE. Sling procedures for the treatment of stress urinary incontinence: comparison of national practice patterns between urologists and gynecologists. J Urol. 2017;198(6):1386-1391.</w:t>
+      </w:r>
+    </w:p>
+    <w:p>
+      <w:pPr>
+        <w:numPr>
+          <w:ilvl w:val="0"/>
+          <w:numId w:val="1001"/>
+        </w:numPr>
+      </w:pPr>
+      <w:r>
+        <w:t xml:space="preserve">Cantrell AB, Rothschild J, Durbin-Johnson B, Gonzalez R, Kurzrock EA. Surgical trends in the correction of female stress urinary incontinence in academic centers within the United States. Neurourol Urodyn. 2017;36(2):394-398.</w:t>
+      </w:r>
+    </w:p>
+    <w:p>
+      <w:pPr>
+        <w:numPr>
+          <w:ilvl w:val="0"/>
+          <w:numId w:val="1001"/>
+        </w:numPr>
+      </w:pPr>
+      <w:r>
+        <w:t xml:space="preserve">Rogo-Gupta L, Litwin MS, Saigal CS, Anger JT; Urologic Diseases in America Project. Trends in the surgical management of stress urinary incontinence among female Medicare beneficiaries, 2002-2007. Urology. 2013;82(1):38-41.</w:t>
+      </w:r>
+    </w:p>
+    <w:p>
+      <w:pPr>
+        <w:numPr>
+          <w:ilvl w:val="0"/>
+          <w:numId w:val="1001"/>
+        </w:numPr>
+      </w:pPr>
+      <w:r>
+        <w:t xml:space="preserve">Siegal AR, Huang Z, Gross MD, Mehraban-Far S, Weissbart SJ, Kim JM. Trends of mesh utilization for stress urinary incontinence before and after the 2011 Food and Drug Administration notification between FPMRS-certified and non-FPMRS-certified physicians: a statewide all-payer database analysis. Urology. 2021;150:151-157.</w:t>
+      </w:r>
+    </w:p>
+    <w:p>
+      <w:pPr>
+        <w:numPr>
+          <w:ilvl w:val="0"/>
+          <w:numId w:val="1001"/>
+        </w:numPr>
+      </w:pPr>
+      <w:r>
+        <w:t xml:space="preserve">Lee UJ, Feinstein L, Ward JB, et al; Urologic Diseases in America Project. National trends in the surgical management of urinary incontinence among insured women, 2004 to 2013. J Urol. 2020;203(2):365-371.</w:t>
+      </w:r>
+    </w:p>
+    <w:p>
+      <w:pPr>
+        <w:numPr>
+          <w:ilvl w:val="0"/>
+          <w:numId w:val="1001"/>
+        </w:numPr>
+      </w:pPr>
+      <w:r>
+        <w:t xml:space="preserve">Tabakin AL, Sawhney R, Daily AM, Winkler HA, Shalom DF, Tam J, Lee W. Case log trends of urogynecology and reconstructive pelvic surgery fellows: a comparison of urology- and gynecology-based fellowship programs. Neurourol Urodyn. 2024;43(8):1970-1976.</w:t>
+      </w:r>
+    </w:p>
+    <w:p>
+      <w:pPr>
+        <w:numPr>
+          <w:ilvl w:val="0"/>
+          <w:numId w:val="1001"/>
+        </w:numPr>
+      </w:pPr>
+      <w:r>
+        <w:t xml:space="preserve">Wang CN, Su IW, Smith AL, Badalato GM, Chung DE. Current exposure to female pelvic medicine and reconstructive surgery faculty during urology residency. Neurourol Urodyn. 2023;42(7):1569-1573.</w:t>
+      </w:r>
+    </w:p>
+    <w:p>
+      <w:pPr>
+        <w:numPr>
+          <w:ilvl w:val="0"/>
+          <w:numId w:val="1001"/>
+        </w:numPr>
+      </w:pPr>
+      <w:r>
+        <w:t xml:space="preserve">Berger AA, Tan-Kim J, Menefee SA. Surgeon volume and reoperation risk after midurethral sling surgery. Am J Obstet Gynecol. 2019;221(5):523.e1-523.e8.</w:t>
+      </w:r>
+    </w:p>
+    <w:p>
+      <w:pPr>
+        <w:numPr>
+          <w:ilvl w:val="0"/>
+          <w:numId w:val="1001"/>
+        </w:numPr>
+      </w:pPr>
+      <w:r>
+        <w:t xml:space="preserve">Cartier S, Cerantola GM, Leung AA, Brennand E. The impact of surgeon operative volume on risk of reoperation within 5 years of mid-urethral sling: a systematic review. Int Urogynecol J. 2023;34(5):981-992.</w:t>
+      </w:r>
+    </w:p>
+    <w:p>
+      <w:pPr>
+        <w:numPr>
+          <w:ilvl w:val="0"/>
+          <w:numId w:val="1001"/>
+        </w:numPr>
+      </w:pPr>
+      <w:r>
+        <w:t xml:space="preserve">Brennand EA, Quan H. Evaluation of the effect of surgeon’s operative volume and specialty on likelihood of revision after mesh midurethral sling placement. Obstet Gynecol. 2019;133(6):1099-1108.</w:t>
+      </w:r>
+    </w:p>
+    <w:p>
+      <w:pPr>
+        <w:numPr>
+          <w:ilvl w:val="0"/>
+          <w:numId w:val="1001"/>
+        </w:numPr>
+      </w:pPr>
+      <w:r>
+        <w:t xml:space="preserve">Holdø B, Svenningsen R. The impact from surgical experience on short- and long-term success rates after mid-urethral sling surgery. Int Urogynecol J. 2026 (epub ahead of print).</w:t>
+      </w:r>
+    </w:p>
+    <w:p>
+      <w:pPr>
+        <w:numPr>
+          <w:ilvl w:val="0"/>
+          <w:numId w:val="1001"/>
+        </w:numPr>
+      </w:pPr>
+      <w:r>
+        <w:t xml:space="preserve">Gallo K, Weiner H, Mishra K. An update on surgical management for stress urinary incontinence. Curr Opin Obstet Gynecol. 2024;36(6):433-438.</w:t>
       </w:r>
     </w:p>
     <w:p>

</xml_diff>

<commit_message>
Remove all em dashes from the manuscript
Replace all 56 em dashes with commas, colons, semicolons, parentheses, or
restructured sentences, per the user's standing style rule to never use the
em dash. Table "not applicable" cells now read "n/a" instead of an em dash.
Numeric en dashes in ranges (2013-2023, 14-27) and the compound terms
Herfindahl-Hirschman and volume-outcome are retained. Content unchanged;
docx re-rendered.
</commit_message>
<xml_diff>
--- a/output/manuscript.docx
+++ b/output/manuscript.docx
@@ -40,7 +40,7 @@
         <w:t xml:space="preserve"> </w:t>
       </w:r>
       <w:r>
-        <w:t xml:space="preserve">(1) URPS combines both training pathways — ABOG (OB/GYN) urogynecologists and</w:t>
+        <w:t xml:space="preserve">(1) URPS combines both training pathways, ABOG (OB/GYN) urogynecologists and</w:t>
       </w:r>
       <w:r>
         <w:t xml:space="preserve"> </w:t>
@@ -145,7 +145,7 @@
         <w:t xml:space="preserve"> </w:t>
       </w:r>
       <w:r>
-        <w:t xml:space="preserve">A total of 1,745 unique physicians billed CPT 57288 (131,637 procedures; 6,202 physician-years) after excluding the truncated 2017 file. URPS physicians represented the largest group — 753 physicians, 80,033 procedures (60.8%), median 19 procedures/year (p25–p75, 14–27) — followed by non-URPS urology (665 physicians; 26.1%; median 16), General OB/GYN (330; 12.5%; median 15), and MIGS (10; 0.7%; median 16). Observed annual procedures declined (16,399 in 2013 to 12,223 in 2023; −469/year, p = 0.03), reaching a low in 2020 (9,228) with partial recovery. In a Poisson GEE clustered by NPI, adjusted annual volume was significantly lower than URPS for every group — urology (rate ratio 0.82, 95% CI 0.70–0.95), General OB/GYN (0.67, 0.50–0.90), and MIGS (0.56, 0.40–0.76) — with a ~11% decline in 2020 (RR 0.89, 0.85–0.92, p &lt; 0.001) and no overall per-physician time trend (RR 1.00, p = 0.52). Among the three well-populated groups, pooled multi-year concentration was modest and lowest for URPS (Gini 0.51, HHI 27; top 20% performed 53.4%); within-year concentration was low and stable (annual Gini ≈ 0.27; no trend, p = 0.82). MIGS (n = 10) is reported descriptively. Modeled by specialty, URPS share rose (+0.90 pp/year, p &lt; 0.001) while urology (−0.55, p = 0.004) and General OB/GYN (−0.42, p = 0.006) declined; the combined URPS increase was significant under every classification scheme, bracketed by fixed-membership classification (lower bound: gynecologic share 60.8% → 70.1%, +0.84 pp/year) and time-varying certification-gated classification (upper bound, as certification lags practice onset: URPS share 46.3% → 74.2%, +2.28 pp/year). Newly observable entrant surgeons (absent the prior two observable years) performed 7–23% of annual volume at low median volume (~13); URPS contributed the most entrants (440 over the period) while urology showed substantial churn (373 entrants despite a declining share).</w:t>
+        <w:t xml:space="preserve">A total of 1,745 unique physicians billed CPT 57288 (131,637 procedures; 6,202 physician-years) after excluding the truncated 2017 file. URPS physicians represented the largest group, with 753 physicians, 80,033 procedures (60.8%), and a median of 19 procedures/year (p25–p75, 14–27); non-URPS urology followed (665 physicians; 26.1%; median 16), then General OB/GYN (330; 12.5%; median 15) and MIGS (10; 0.7%; median 16). Observed annual procedures declined (16,399 in 2013 to 12,223 in 2023; −469/year, p = 0.03), reaching a low in 2020 (9,228) with partial recovery. In a Poisson GEE clustered by NPI, adjusted annual volume was significantly lower than URPS for every group (urology rate ratio 0.82, 95% CI 0.70–0.95; General OB/GYN 0.67, 0.50–0.90; MIGS 0.56, 0.40–0.76), with a ~11% decline in 2020 (RR 0.89, 0.85–0.92, p &lt; 0.001) and no overall per-physician time trend (RR 1.00, p = 0.52). Among the three well-populated groups, pooled multi-year concentration was modest and lowest for URPS (Gini 0.51, HHI 27; top 20% performed 53.4%); within-year concentration was low and stable (annual Gini ≈ 0.27; no trend, p = 0.82). MIGS (n = 10) is reported descriptively. Modeled by specialty, URPS share rose (+0.90 pp/year, p &lt; 0.001) while urology (−0.55, p = 0.004) and General OB/GYN (−0.42, p = 0.006) declined; the combined URPS increase was significant under every classification scheme, bracketed by fixed-membership classification (lower bound: gynecologic share 60.8% → 70.1%, +0.84 pp/year) and time-varying certification-gated classification (upper bound, as certification lags practice onset: URPS share 46.3% → 74.2%, +2.28 pp/year). Newly observable entrant surgeons (absent the prior two observable years) performed 7–23% of annual volume at low median volume (~13); URPS contributed the most entrants (440 over the period) while urology showed substantial churn (373 entrants despite a declining share).</w:t>
       </w:r>
     </w:p>
     <w:p>
@@ -208,7 +208,7 @@
         <w:pStyle w:val="BodyText"/>
       </w:pPr>
       <w:r>
-        <w:t xml:space="preserve">Understanding who performs midurethral slings—and how procedure volume is distributed within each specialty—has direct implications for surgical quality, training requirements, and workforce planning. The volume-outcome relationship in surgery is well established: higher-volume surgeons and hospitals tend to achieve better patient outcomes across a range of procedures.</w:t>
+        <w:t xml:space="preserve">Understanding who performs midurethral slings, and how procedure volume is distributed within each specialty, has direct implications for surgical quality, training requirements, and workforce planning. The volume-outcome relationship in surgery is well established: higher-volume surgeons and hospitals tend to achieve better patient outcomes across a range of procedures.</w:t>
       </w:r>
       <w:r>
         <w:rPr>
@@ -228,7 +228,7 @@
         <w:pStyle w:val="BodyText"/>
       </w:pPr>
       <w:r>
-        <w:t xml:space="preserve">Several trends make this analysis timely. First, the subspecialty of Female Pelvic Medicine and Reconstructive Surgery—recently renamed Urogynecology and Reconstructive Pelvic Surgery (URPS)—has grown substantially since achieving American Board of Medical Specialties (ABMS) recognition in 2013,</w:t>
+        <w:t xml:space="preserve">Several trends make this analysis timely. First, the subspecialty of Female Pelvic Medicine and Reconstructive Surgery, recently renamed Urogynecology and Reconstructive Pelvic Surgery (URPS), has grown substantially since achieving American Board of Medical Specialties (ABMS) recognition in 2013,</w:t>
       </w:r>
       <w:r>
         <w:rPr>
@@ -252,7 +252,7 @@
         <w:t xml:space="preserve"> </w:t>
       </w:r>
       <w:r>
-        <w:t xml:space="preserve">Third, there is growing interest in procedural concentration—the degree to which a small number of providers account for a disproportionate share of procedures—as a metric relevant to quality improvement and resource allocation.</w:t>
+        <w:t xml:space="preserve">Third, there is growing interest in procedural concentration, the degree to which a small number of providers account for a disproportionate share of procedures, as a metric relevant to quality improvement and resource allocation.</w:t>
       </w:r>
       <w:r>
         <w:rPr>
@@ -407,7 +407,7 @@
         <w:t xml:space="preserve">sub1startdate</w:t>
       </w:r>
       <w:r>
-        <w:t xml:space="preserve">, which ranges 2013–2024 and is distinct from the initial OB/GYN board date), and classifies earlier years by that year’s CMS provider type; because board certification lags the start of subspecialty practice — the 2013 examination certified physicians already practicing urogynecology, and later diplomates practiced before boarding — it misattributes pre-certification practice years and is an upper bound. Modal and ever-URPS/MIGS schemes were additional sensitivity analyses. Urology-pathway URPS were held fixed in all schemes as no urology-subspecialty certification date was available. The whole-period cross-sectional distribution, concentration, and volume analyses (Tables 1–3) assign each physician their eventual (combined) subspecialty.</w:t>
+        <w:t xml:space="preserve">, which ranges 2013–2024 and is distinct from the initial OB/GYN board date), and classifies earlier years by that year’s CMS provider type; because board certification lags the start of subspecialty practice (the 2013 examination certified physicians already practicing urogynecology, and later diplomates practiced before boarding), it misattributes pre-certification practice years and is an upper bound. Modal and ever-URPS/MIGS schemes were additional sensitivity analyses. Urology-pathway URPS were held fixed in all schemes as no urology-subspecialty certification date was available. The whole-period cross-sectional distribution, concentration, and volume analyses (Tables 1–3) assign each physician their eventual (combined) subspecialty.</w:t>
       </w:r>
     </w:p>
     <w:bookmarkEnd w:id="12"/>
@@ -459,7 +459,7 @@
         <w:t xml:space="preserve"> </w:t>
       </w:r>
       <w:r>
-        <w:t xml:space="preserve">measures — the Gini coefficient (inequality across the whole surgeon-volume distribution) and the Herfindahl–Hirschman Index (HHI, sum of squared per-surgeon shares on a 0–10,000 scale, driven especially by the largest-volume surgeons) — computed on aggregate provider totals and separately for each calendar year. Each physician is the operative production unit; this is surgeon-level procedural concentration and not the antitrust use of HHI for hospital/health-system market competition, so values are not comparable to FTC/DOJ thresholds.</w:t>
+        <w:t xml:space="preserve">measures: the Gini coefficient (inequality across the whole surgeon-volume distribution) and the Herfindahl–Hirschman Index (HHI, the sum of squared per-surgeon shares on a 0–10,000 scale, driven especially by the largest-volume surgeons), both computed on aggregate provider totals and separately for each calendar year. Each physician is the operative production unit; this is surgeon-level procedural concentration and not the antitrust use of HHI for hospital/health-system market competition, so values are not comparable to FTC/DOJ thresholds.</w:t>
       </w:r>
     </w:p>
     <w:p>
@@ -591,7 +591,7 @@
         <w:pStyle w:val="FirstParagraph"/>
       </w:pPr>
       <w:r>
-        <w:t xml:space="preserve">Across the full 11-year window, 1,761 unique physicians billed CPT 57288, accounting for 139,855 observed services in 6,572 physician-year observations. Excluding the truncated 2017 file, the analytic cohort comprised 1,745 unique physicians, 131,637 procedures, and 6,202 physician-year observations. Most physicians were observed only intermittently: 567 (32%) appeared in a single year, 753 (43%) in 2–5 years, 375 (21%) in 6–10 years, and only 66 (4%) in all 11 years — consistent with a workforce in which a minority sustain a durable Medicare sling practice.</w:t>
+        <w:t xml:space="preserve">Across the full 11-year window, 1,761 unique physicians billed CPT 57288, accounting for 139,855 observed services in 6,572 physician-year observations. Excluding the truncated 2017 file, the analytic cohort comprised 1,745 unique physicians, 131,637 procedures, and 6,202 physician-year observations. Most physicians were observed only intermittently: 567 (32%) appeared in a single year, 753 (43%) in 2–5 years, 375 (21%) in 6–10 years, and only 66 (4%) in all 11 years, consistent with a workforce in which a minority sustain a durable Medicare sling practice.</w:t>
       </w:r>
     </w:p>
     <w:p>
@@ -617,7 +617,7 @@
         <w:pStyle w:val="FirstParagraph"/>
       </w:pPr>
       <w:r>
-        <w:t xml:space="preserve">URPS physicians constituted the largest group — 753 physicians, 3,498 physician-years, 80,033 procedures (60.8%), median 19 procedures/year (p25–p75, 14–27) — followed by non-URPS urology (665 physicians; 1,810 physician-years; 34,351 procedures; 26.1%; median 16, 13–22), General OB/GYN (330; 858; 16,391; 12.5%; median 15, 12–22), and MIGS (10; 36; 862; 0.7%; median 16, 12–24) (Table 1). Per-specialty physician counts sum to slightly more than the unique total because 13 physicians changed specialty group across years. Folding urology-pathway urogynecologists into URPS moved 150 physicians (11,503 procedures) from urology relative to an ABOG-only classification.</w:t>
+        <w:t xml:space="preserve">URPS physicians constituted the largest group, with 753 physicians, 3,498 physician-years, 80,033 procedures (60.8%), and a median of 19 procedures/year (p25–p75, 14–27); non-URPS urology followed (665 physicians; 1,810 physician-years; 34,351 procedures; 26.1%; median 16, 13–22), then General OB/GYN (330; 858; 16,391; 12.5%; median 15, 12–22) and MIGS (10; 36; 862; 0.7%; median 16, 12–24) (Table 1). Per-specialty physician counts sum to slightly more than the unique total because 13 physicians changed specialty group across years. Folding urology-pathway urogynecologists into URPS moved 150 physicians (11,503 procedures) from urology relative to an ABOG-only classification.</w:t>
       </w:r>
     </w:p>
     <w:p>
@@ -625,7 +625,7 @@
         <w:pStyle w:val="BodyText"/>
       </w:pPr>
       <w:r>
-        <w:t xml:space="preserve">Modeled separately, each specialty’s annual market share moved significantly and in divergent directions (Table 1): URPS rose from 53.4% (2013) to 63.8% (2023) (+0.90 percentage points/year; 95% CI 0.49 to 1.31; p &lt; 0.001), whereas urology fell from 30.7% to 23.1% (−0.55; 95% CI −0.87 to −0.23; p = 0.004) and General OB/GYN from 15.7% to 12.3% (−0.42; 95% CI −0.68 to −0.16; p = 0.006). MIGS rose descriptively from 0.2% to 0.8% (+0.07/year; n = 10, interpreted with caution). Because total observed volume fell, these are shifts in specialty ownership rather than differential growth. The combined-URPS increase was significant under all classification schemes and bounded by fixed membership (lower bound; gynecologic share 60.8% → 70.1%, +0.84 pp/year) and time-varying certification-gating (upper bound; URPS share 46.3% → 74.2%, +2.28 pp/year, as certification lags practice onset — Table 4).</w:t>
+        <w:t xml:space="preserve">Modeled separately, each specialty’s annual market share moved significantly and in divergent directions (Table 1): URPS rose from 53.4% (2013) to 63.8% (2023) (+0.90 percentage points/year; 95% CI 0.49 to 1.31; p &lt; 0.001), whereas urology fell from 30.7% to 23.1% (−0.55; 95% CI −0.87 to −0.23; p = 0.004) and General OB/GYN from 15.7% to 12.3% (−0.42; 95% CI −0.68 to −0.16; p = 0.006). MIGS rose descriptively from 0.2% to 0.8% (+0.07/year; n = 10, interpreted with caution). Because total observed volume fell, these are shifts in specialty ownership rather than differential growth. The combined-URPS increase was significant under all classification schemes and bounded by fixed membership (lower bound; gynecologic share 60.8% → 70.1%, +0.84 pp/year) and time-varying certification-gating (upper bound; URPS share 46.3% → 74.2%, +2.28 pp/year, as certification lags practice onset; Table 4).</w:t>
       </w:r>
     </w:p>
     <w:p>
@@ -633,7 +633,7 @@
         <w:pStyle w:val="BodyText"/>
       </w:pPr>
       <w:r>
-        <w:t xml:space="preserve">In the Poisson GEE clustered by NPI, adjusted annual volume relative to URPS was significantly lower for every other group — urology rate ratio 0.82 (95% CI 0.70–0.95), General OB/GYN 0.67 (0.50–0.90), and MIGS 0.56 (0.40–0.76) — with a ~11% decline in 2020 (RR 0.89, 0.85–0.92; p &lt; 0.001) and no overall per-physician time trend (year RR 1.00, 0.99–1.00; p = 0.52) (Table 3). The one-value-per-physician secondary analysis agreed (Kruskal-Wallis H = 66.1, df = 3, p &lt; 0.001; URPS exceeded urology and General OB/GYN, pairwise p &lt; 0.001).</w:t>
+        <w:t xml:space="preserve">In the Poisson GEE clustered by NPI, adjusted annual volume relative to URPS was significantly lower for every other group (urology rate ratio 0.82, 95% CI 0.70–0.95; General OB/GYN 0.67, 0.50–0.90; MIGS 0.56, 0.40–0.76), with a ~11% decline in 2020 (RR 0.89, 0.85–0.92; p &lt; 0.001) and no overall per-physician time trend (year RR 1.00, 0.99–1.00; p = 0.52) (Table 3). The one-value-per-physician secondary analysis agreed (Kruskal-Wallis H = 66.1, df = 3, p &lt; 0.001; URPS exceeded urology and General OB/GYN, pairwise p &lt; 0.001).</w:t>
       </w:r>
     </w:p>
     <w:bookmarkEnd w:id="17"/>
@@ -669,7 +669,7 @@
         <w:pStyle w:val="FirstParagraph"/>
       </w:pPr>
       <w:r>
-        <w:t xml:space="preserve">Applying a two-year washout (Table 5), newly observable entrant surgeons numbered 48–184 per year and performed 7.4%–22.5% of that year’s volume, at a low median entrant volume (~13 slings/year) — consistent with providers appearing just above the CMS suppression threshold. Entry collapsed in 2020 (48 entrants; 7.4% of volume) and rebounded in 2022 (168; 22.5%). Continuing surgeons (381–543 per year) performed the large majority of annual volume, and apparent exits ranged from 66 to 230 per year. Across the period URPS contributed the most entrants (440), followed by urology (373), General OB/GYN (189), and MIGS (8). Decomposing the specialty-share changes: the rising URPS share was driven by the largest inflow of newly observable URPS surgeons together with a stable continuing-URPS base (URPS surgeon count 385 → 338; per-physician volume flat), whereas urology’s decline reflected net attrition despite substantial churn — many entrants offset by more exits — and General OB/GYN lost both surgeons and share. Because total volume fell, the gynecologic gain is a redistribution of a shrinking pool toward URPS, not new procedure growth. Given CMS suppression, all counts describe</w:t>
+        <w:t xml:space="preserve">Applying a two-year washout (Table 5), newly observable entrant surgeons numbered 48–184 per year and performed 7.4%–22.5% of that year’s volume, at a low median entrant volume (~13 slings/year) consistent with providers appearing just above the CMS suppression threshold. Entry collapsed in 2020 (48 entrants; 7.4% of volume) and rebounded in 2022 (168; 22.5%). Continuing surgeons (381–543 per year) performed the large majority of annual volume, and apparent exits ranged from 66 to 230 per year. Across the period URPS contributed the most entrants (440), followed by urology (373), General OB/GYN (189), and MIGS (8). Decomposing the specialty-share changes: the rising URPS share was driven by the largest inflow of newly observable URPS surgeons together with a stable continuing-URPS base (URPS surgeon count 385 → 338; per-physician volume flat), whereas urology’s decline reflected net attrition despite substantial churn (many entrants offset by more exits), and General OB/GYN lost both surgeons and share. Because total volume fell, the gynecologic gain is a redistribution of a shrinking pool toward URPS, not new procedure growth. Given CMS suppression, all counts describe</w:t>
       </w:r>
       <w:r>
         <w:t xml:space="preserve"> </w:t>
@@ -799,7 +799,7 @@
         <w:pStyle w:val="BodyText"/>
       </w:pPr>
       <w:r>
-        <w:t xml:space="preserve">Identifying urogynecologists through both the ABOG (obstetrics-gynecology) and ABU (urology) certifying pathways is central to this result, because URPS is certifiable from either residency. Cross-referencing the ABU roster reassigned 150 urology-typed physicians (8.2% of all slings) to URPS, and the finding was robust — the pooled URPS Gini changed negligibly (0.51 → 0.52). A pathway-agnostic definition is important given that urology- and gynecology-based URPS fellows accrue different intraoperative case volumes during training</w:t>
+        <w:t xml:space="preserve">Identifying urogynecologists through both the ABOG (obstetrics-gynecology) and ABU (urology) certifying pathways is central to this result, because URPS is certifiable from either residency. Cross-referencing the ABU roster reassigned 150 urology-typed physicians (8.2% of all slings) to URPS, and the finding was robust: the pooled URPS Gini changed negligibly (0.51 → 0.52). A pathway-agnostic definition is important given that urology- and gynecology-based URPS fellows accrue different intraoperative case volumes during training</w:t>
       </w:r>
       <w:r>
         <w:rPr>
@@ -897,7 +897,7 @@
         <w:t xml:space="preserve"> </w:t>
       </w:r>
       <w:r>
-        <w:t xml:space="preserve">The median observed volumes here (15–19 procedures/year) fall below these thresholds, but the PUF captures only Medicare fee-for-service claims; true per-surgeon volumes — including commercially insured, Medicare Advantage, and younger patients — are higher, and the reported concentration is a lower bound because sub-11-beneficiary providers are suppressed.</w:t>
+        <w:t xml:space="preserve">The median observed volumes here (15–19 procedures/year) fall below these thresholds, but the PUF captures only Medicare fee-for-service claims; true per-surgeon volumes (including commercially insured, Medicare Advantage, and younger patients) are higher, and the reported concentration is a lower bound because sub-11-beneficiary providers are suppressed.</w:t>
       </w:r>
     </w:p>
     <w:bookmarkEnd w:id="23"/>
@@ -939,7 +939,7 @@
         <w:t xml:space="preserve"> </w:t>
       </w:r>
       <w:r>
-        <w:t xml:space="preserve">The significant 2020 decline (rate ratio 0.89) is consistent with pandemic-related deferral of elective surgery and was robust to excluding 2020. Finally, the SUI treatment landscape continues to diversify — urethral bulking agents are now positioned alongside slings as a first-line surgical option</w:t>
+        <w:t xml:space="preserve">The significant 2020 decline (rate ratio 0.89) is consistent with pandemic-related deferral of elective surgery and was robust to excluding 2020. Finally, the SUI treatment landscape continues to diversify (urethral bulking agents are now positioned alongside slings as a first-line surgical option</w:t>
       </w:r>
       <w:r>
         <w:rPr>
@@ -948,10 +948,7 @@
         <w:t xml:space="preserve">3,20</w:t>
       </w:r>
       <w:r>
-        <w:t xml:space="preserve"> </w:t>
-      </w:r>
-      <w:r>
-        <w:t xml:space="preserve">— and whether this differentially affects specialty-specific sling volumes warrants continued surveillance.</w:t>
+        <w:t xml:space="preserve">), and whether this differentially affects specialty-specific sling volumes warrants continued surveillance.</w:t>
       </w:r>
     </w:p>
     <w:bookmarkEnd w:id="24"/>
@@ -969,7 +966,7 @@
         <w:pStyle w:val="FirstParagraph"/>
       </w:pPr>
       <w:r>
-        <w:t xml:space="preserve">Several limitations warrant discussion. First, CMS suppresses provider-level data below 11 beneficiaries, so the lowest-volume providers are unobserved and reported concentration is a lower bound. Second, the PUF captures only fee-for-service Medicare Part B; younger, Medicare Advantage, Medicaid, commercially insured, and uninsured patients are not represented. Third, specialty classification depends on CMS provider type and the ABOG/ABU rosters; providers who completed URPS fellowship but are not board-certified would be misclassified. Fourth, the market-share trend is bounded rather than point-identified. Board certification lags the start of subspecialty practice — physicians complete fellowship and practice urogynecology before sitting for boards, and the 2013 inaugural examination certified an established practicing cohort — so the certification-gated scheme (upper bound) misattributes pre-certification practice years to General OB/GYN or urology, while fixed membership (lower bound) retroactively counts physicians as URPS before they subspecialized. The true trend lies between; a point estimate would require fellowship-completion dates, which are not available. Additionally, ~8% of URPS providers could not be matched to a certification year and urology-pathway URPS were held fixed (no urology-subspecialty date), both of which shrink the upper-bound estimate. Fifth, the exclusion of 2017 removes one year of the time series (the underlying file being truncated); re-running with a complete 2017 file would restore all 11 years. Sixth, Tot_Srvcs may include bilateral or modifier-inflated services.</w:t>
+        <w:t xml:space="preserve">Several limitations warrant discussion. First, CMS suppresses provider-level data below 11 beneficiaries, so the lowest-volume providers are unobserved and reported concentration is a lower bound. Second, the PUF captures only fee-for-service Medicare Part B; younger, Medicare Advantage, Medicaid, commercially insured, and uninsured patients are not represented. Third, specialty classification depends on CMS provider type and the ABOG/ABU rosters; providers who completed URPS fellowship but are not board-certified would be misclassified. Fourth, the market-share trend is bounded rather than point-identified. Board certification lags the start of subspecialty practice (physicians complete fellowship and practice urogynecology before sitting for boards, and the 2013 inaugural examination certified an established practicing cohort), so the certification-gated scheme (upper bound) misattributes pre-certification practice years to General OB/GYN or urology, while fixed membership (lower bound) retroactively counts physicians as URPS before they subspecialized. The true trend lies between; a point estimate would require fellowship-completion dates, which are not available. Additionally, ~8% of URPS providers could not be matched to a certification year and urology-pathway URPS were held fixed (no urology-subspecialty date), both of which shrink the upper-bound estimate. Fifth, the exclusion of 2017 removes one year of the time series (the underlying file being truncated); re-running with a complete 2017 file would restore all 11 years. Sixth, Tot_Srvcs may include bilateral or modifier-inflated services.</w:t>
       </w:r>
     </w:p>
     <w:bookmarkEnd w:id="25"/>
@@ -1939,51 +1936,51 @@
               <w:pStyle w:val="Compact"/>
             </w:pPr>
             <w:r>
-              <w:t xml:space="preserve">—</w:t>
-            </w:r>
-          </w:p>
-        </w:tc>
-        <w:tc>
-          <w:tcPr/>
-          <w:p>
-            <w:pPr>
-              <w:pStyle w:val="Compact"/>
-            </w:pPr>
-            <w:r>
-              <w:t xml:space="preserve">—</w:t>
-            </w:r>
-          </w:p>
-        </w:tc>
-        <w:tc>
-          <w:tcPr/>
-          <w:p>
-            <w:pPr>
-              <w:pStyle w:val="Compact"/>
-            </w:pPr>
-            <w:r>
-              <w:t xml:space="preserve">—</w:t>
-            </w:r>
-          </w:p>
-        </w:tc>
-        <w:tc>
-          <w:tcPr/>
-          <w:p>
-            <w:pPr>
-              <w:pStyle w:val="Compact"/>
-            </w:pPr>
-            <w:r>
-              <w:t xml:space="preserve">—</w:t>
-            </w:r>
-          </w:p>
-        </w:tc>
-        <w:tc>
-          <w:tcPr/>
-          <w:p>
-            <w:pPr>
-              <w:pStyle w:val="Compact"/>
-            </w:pPr>
-            <w:r>
-              <w:t xml:space="preserve">—</w:t>
+              <w:t xml:space="preserve">n/a</w:t>
+            </w:r>
+          </w:p>
+        </w:tc>
+        <w:tc>
+          <w:tcPr/>
+          <w:p>
+            <w:pPr>
+              <w:pStyle w:val="Compact"/>
+            </w:pPr>
+            <w:r>
+              <w:t xml:space="preserve">n/a</w:t>
+            </w:r>
+          </w:p>
+        </w:tc>
+        <w:tc>
+          <w:tcPr/>
+          <w:p>
+            <w:pPr>
+              <w:pStyle w:val="Compact"/>
+            </w:pPr>
+            <w:r>
+              <w:t xml:space="preserve">n/a</w:t>
+            </w:r>
+          </w:p>
+        </w:tc>
+        <w:tc>
+          <w:tcPr/>
+          <w:p>
+            <w:pPr>
+              <w:pStyle w:val="Compact"/>
+            </w:pPr>
+            <w:r>
+              <w:t xml:space="preserve">n/a</w:t>
+            </w:r>
+          </w:p>
+        </w:tc>
+        <w:tc>
+          <w:tcPr/>
+          <w:p>
+            <w:pPr>
+              <w:pStyle w:val="Compact"/>
+            </w:pPr>
+            <w:r>
+              <w:t xml:space="preserve">n/a</w:t>
             </w:r>
           </w:p>
         </w:tc>
@@ -2389,7 +2386,7 @@
         <w:t xml:space="preserve"> </w:t>
       </w:r>
       <w:r>
-        <w:t xml:space="preserve">Repeated-measures model of annual sling volume — adjusted rate ratios from a Poisson GEE clustered by NPI (reference URPS; exchangeable correlation, robust SEs).</w:t>
+        <w:t xml:space="preserve">Repeated-measures model of annual sling volume: adjusted rate ratios from a Poisson GEE clustered by NPI (reference URPS; exchangeable correlation, robust SEs).</w:t>
       </w:r>
     </w:p>
     <w:tbl>
@@ -2705,7 +2702,7 @@
               <w:pStyle w:val="Compact"/>
             </w:pPr>
             <w:r>
-              <w:t xml:space="preserve">Lower bound — gynecologic share (fixed; ABOG-URPS + MIGS + Gen OB/GYN)</w:t>
+              <w:t xml:space="preserve">Lower bound: gynecologic share (fixed; ABOG-URPS + MIGS + Gen OB/GYN)</w:t>
             </w:r>
           </w:p>
         </w:tc>
@@ -2751,7 +2748,7 @@
               <w:pStyle w:val="Compact"/>
             </w:pPr>
             <w:r>
-              <w:t xml:space="preserve">Lower bound — combined-URPS share (fixed)</w:t>
+              <w:t xml:space="preserve">Lower bound: combined-URPS share (fixed)</w:t>
             </w:r>
           </w:p>
         </w:tc>
@@ -2797,18 +2794,18 @@
               <w:pStyle w:val="Compact"/>
             </w:pPr>
             <w:r>
-              <w:t xml:space="preserve">Sensitivity — URPS share (modal)</w:t>
-            </w:r>
-          </w:p>
-        </w:tc>
-        <w:tc>
-          <w:tcPr/>
-          <w:p>
-            <w:pPr>
-              <w:pStyle w:val="Compact"/>
-            </w:pPr>
-            <w:r>
-              <w:t xml:space="preserve">—</w:t>
+              <w:t xml:space="preserve">Sensitivity: URPS share (modal)</w:t>
+            </w:r>
+          </w:p>
+        </w:tc>
+        <w:tc>
+          <w:tcPr/>
+          <w:p>
+            <w:pPr>
+              <w:pStyle w:val="Compact"/>
+            </w:pPr>
+            <w:r>
+              <w:t xml:space="preserve">n/a</w:t>
             </w:r>
           </w:p>
         </w:tc>
@@ -2843,18 +2840,18 @@
               <w:pStyle w:val="Compact"/>
             </w:pPr>
             <w:r>
-              <w:t xml:space="preserve">Sensitivity — URPS share (ever-URPS/MIGS)</w:t>
-            </w:r>
-          </w:p>
-        </w:tc>
-        <w:tc>
-          <w:tcPr/>
-          <w:p>
-            <w:pPr>
-              <w:pStyle w:val="Compact"/>
-            </w:pPr>
-            <w:r>
-              <w:t xml:space="preserve">—</w:t>
+              <w:t xml:space="preserve">Sensitivity: URPS share (ever-URPS/MIGS)</w:t>
+            </w:r>
+          </w:p>
+        </w:tc>
+        <w:tc>
+          <w:tcPr/>
+          <w:p>
+            <w:pPr>
+              <w:pStyle w:val="Compact"/>
+            </w:pPr>
+            <w:r>
+              <w:t xml:space="preserve">n/a</w:t>
             </w:r>
           </w:p>
         </w:tc>
@@ -2893,7 +2890,7 @@
                 <w:b/>
                 <w:bCs/>
               </w:rPr>
-              <w:t xml:space="preserve">Upper bound — URPS share (time-varying, cert-gated)</w:t>
+              <w:t xml:space="preserve">Upper bound: URPS share (time-varying, cert-gated)</w:t>
             </w:r>
           </w:p>
         </w:tc>
@@ -2951,18 +2948,18 @@
               <w:pStyle w:val="Compact"/>
             </w:pPr>
             <w:r>
-              <w:t xml:space="preserve">Upper bound — gynecologic share (time-varying, cert-gated)</w:t>
-            </w:r>
-          </w:p>
-        </w:tc>
-        <w:tc>
-          <w:tcPr/>
-          <w:p>
-            <w:pPr>
-              <w:pStyle w:val="Compact"/>
-            </w:pPr>
-            <w:r>
-              <w:t xml:space="preserve">—</w:t>
+              <w:t xml:space="preserve">Upper bound: gynecologic share (time-varying, cert-gated)</w:t>
+            </w:r>
+          </w:p>
+        </w:tc>
+        <w:tc>
+          <w:tcPr/>
+          <w:p>
+            <w:pPr>
+              <w:pStyle w:val="Compact"/>
+            </w:pPr>
+            <w:r>
+              <w:t xml:space="preserve">n/a</w:t>
             </w:r>
           </w:p>
         </w:tc>
@@ -3136,18 +3133,18 @@
               <w:pStyle w:val="Compact"/>
             </w:pPr>
             <w:r>
-              <w:t xml:space="preserve">—</w:t>
-            </w:r>
-          </w:p>
-        </w:tc>
-        <w:tc>
-          <w:tcPr/>
-          <w:p>
-            <w:pPr>
-              <w:pStyle w:val="Compact"/>
-            </w:pPr>
-            <w:r>
-              <w:t xml:space="preserve">—</w:t>
+              <w:t xml:space="preserve">n/a</w:t>
+            </w:r>
+          </w:p>
+        </w:tc>
+        <w:tc>
+          <w:tcPr/>
+          <w:p>
+            <w:pPr>
+              <w:pStyle w:val="Compact"/>
+            </w:pPr>
+            <w:r>
+              <w:t xml:space="preserve">n/a</w:t>
             </w:r>
           </w:p>
         </w:tc>
@@ -3169,18 +3166,18 @@
               <w:pStyle w:val="Compact"/>
             </w:pPr>
             <w:r>
-              <w:t xml:space="preserve">—</w:t>
-            </w:r>
-          </w:p>
-        </w:tc>
-        <w:tc>
-          <w:tcPr/>
-          <w:p>
-            <w:pPr>
-              <w:pStyle w:val="Compact"/>
-            </w:pPr>
-            <w:r>
-              <w:t xml:space="preserve">—</w:t>
+              <w:t xml:space="preserve">n/a</w:t>
+            </w:r>
+          </w:p>
+        </w:tc>
+        <w:tc>
+          <w:tcPr/>
+          <w:p>
+            <w:pPr>
+              <w:pStyle w:val="Compact"/>
+            </w:pPr>
+            <w:r>
+              <w:t xml:space="preserve">n/a</w:t>
             </w:r>
           </w:p>
         </w:tc>
@@ -3215,18 +3212,18 @@
               <w:pStyle w:val="Compact"/>
             </w:pPr>
             <w:r>
-              <w:t xml:space="preserve">—</w:t>
-            </w:r>
-          </w:p>
-        </w:tc>
-        <w:tc>
-          <w:tcPr/>
-          <w:p>
-            <w:pPr>
-              <w:pStyle w:val="Compact"/>
-            </w:pPr>
-            <w:r>
-              <w:t xml:space="preserve">—</w:t>
+              <w:t xml:space="preserve">n/a</w:t>
+            </w:r>
+          </w:p>
+        </w:tc>
+        <w:tc>
+          <w:tcPr/>
+          <w:p>
+            <w:pPr>
+              <w:pStyle w:val="Compact"/>
+            </w:pPr>
+            <w:r>
+              <w:t xml:space="preserve">n/a</w:t>
             </w:r>
           </w:p>
         </w:tc>
@@ -3248,18 +3245,18 @@
               <w:pStyle w:val="Compact"/>
             </w:pPr>
             <w:r>
-              <w:t xml:space="preserve">—</w:t>
-            </w:r>
-          </w:p>
-        </w:tc>
-        <w:tc>
-          <w:tcPr/>
-          <w:p>
-            <w:pPr>
-              <w:pStyle w:val="Compact"/>
-            </w:pPr>
-            <w:r>
-              <w:t xml:space="preserve">—</w:t>
+              <w:t xml:space="preserve">n/a</w:t>
+            </w:r>
+          </w:p>
+        </w:tc>
+        <w:tc>
+          <w:tcPr/>
+          <w:p>
+            <w:pPr>
+              <w:pStyle w:val="Compact"/>
+            </w:pPr>
+            <w:r>
+              <w:t xml:space="preserve">n/a</w:t>
             </w:r>
           </w:p>
         </w:tc>
@@ -3790,7 +3787,7 @@
               <w:pStyle w:val="Compact"/>
             </w:pPr>
             <w:r>
-              <w:t xml:space="preserve">—</w:t>
+              <w:t xml:space="preserve">n/a</w:t>
             </w:r>
           </w:p>
         </w:tc>
@@ -3869,7 +3866,7 @@
               <w:pStyle w:val="Compact"/>
             </w:pPr>
             <w:r>
-              <w:t xml:space="preserve">—</w:t>
+              <w:t xml:space="preserve">n/a</w:t>
             </w:r>
           </w:p>
         </w:tc>

</xml_diff>

<commit_message>
Apply readability revision to the manuscript
Port the user's readability-revised text into output/manuscript.md: shorter
sentences, clearer paragraph structure, the three main findings stated up
front in the Discussion, simpler explanations of the classification bounds and
concentration measures, and cleaner table captions. All numerical findings,
table values, and references are unchanged. Em dashes introduced by the
revised source were converted to colons, parentheses, or "n/a" per the
no-em-dash rule. docx re-rendered.
</commit_message>
<xml_diff>
--- a/output/manuscript.docx
+++ b/output/manuscript.docx
@@ -2,13 +2,13 @@
 <file path=word/document.xml><?xml version="1.0" encoding="utf-8"?>
 <w:document xmlns:w="http://schemas.openxmlformats.org/wordprocessingml/2006/main" xmlns:m="http://schemas.openxmlformats.org/officeDocument/2006/math" xmlns:r="http://schemas.openxmlformats.org/officeDocument/2006/relationships" xmlns:o="urn:schemas-microsoft-com:office:office" xmlns:v="urn:schemas-microsoft-com:vml" xmlns:w10="urn:schemas-microsoft-com:office:word" xmlns:a="http://schemas.openxmlformats.org/drawingml/2006/main" xmlns:pic="http://schemas.openxmlformats.org/drawingml/2006/picture" xmlns:wp="http://schemas.openxmlformats.org/drawingml/2006/wordprocessingDrawing">
   <w:body>
-    <w:bookmarkStart w:id="32" w:name="X37911c70c823373a9f95609993ef55f8a7f53a9"/>
+    <w:bookmarkStart w:id="32" w:name="X479501af9b671b047bede567e33618d02582bbc"/>
     <w:p>
       <w:pPr>
         <w:pStyle w:val="Heading1"/>
       </w:pPr>
       <w:r>
-        <w:t xml:space="preserve">Specialty Distribution, Procedural Concentration, and Time Trends in Midurethral Sling Surgery Among Medicare Beneficiaries, 2013–2023</w:t>
+        <w:t xml:space="preserve">Specialty Distribution, Procedural Concentration, and Trends in Midurethral Sling Surgery Among Medicare Beneficiaries, 2013–2023</w:t>
       </w:r>
     </w:p>
     <w:p>
@@ -34,55 +34,7 @@
         <w:t xml:space="preserve"> </w:t>
       </w:r>
       <w:r>
-        <w:t xml:space="preserve">This version reflects the revised analysis:</w:t>
-      </w:r>
-      <w:r>
-        <w:t xml:space="preserve"> </w:t>
-      </w:r>
-      <w:r>
-        <w:t xml:space="preserve">(1) URPS combines both training pathways, ABOG (OB/GYN) urogynecologists and</w:t>
-      </w:r>
-      <w:r>
-        <w:t xml:space="preserve"> </w:t>
-      </w:r>
-      <w:r>
-        <w:t xml:space="preserve">ABU (urology) urogynecologists cross-referenced from the American Board of</w:t>
-      </w:r>
-      <w:r>
-        <w:t xml:space="preserve"> </w:t>
-      </w:r>
-      <w:r>
-        <w:t xml:space="preserve">Urology roster; (2) calendar year 2017 is excluded as a truncated PUF release;</w:t>
-      </w:r>
-      <w:r>
-        <w:t xml:space="preserve"> </w:t>
-      </w:r>
-      <w:r>
-        <w:t xml:space="preserve">(3) concentration is reported with both the Gini coefficient and the</w:t>
-      </w:r>
-      <w:r>
-        <w:t xml:space="preserve"> </w:t>
-      </w:r>
-      <w:r>
-        <w:t xml:space="preserve">Herfindahl–Hirschman Index (HHI) at the surgeon level; (4) volume differences</w:t>
-      </w:r>
-      <w:r>
-        <w:t xml:space="preserve"> </w:t>
-      </w:r>
-      <w:r>
-        <w:t xml:space="preserve">are tested with a repeated-measures model accounting for physicians who recur</w:t>
-      </w:r>
-      <w:r>
-        <w:t xml:space="preserve"> </w:t>
-      </w:r>
-      <w:r>
-        <w:t xml:space="preserve">across years; and (5) the specialty-classification choice is examined in a</w:t>
-      </w:r>
-      <w:r>
-        <w:t xml:space="preserve"> </w:t>
-      </w:r>
-      <w:r>
-        <w:t xml:space="preserve">sensitivity analysis. Numbers therefore differ from the original submission.</w:t>
+        <w:t xml:space="preserve">This version incorporates five changes: (1) URPS includes both certification pathways, ABOG (OB/GYN) and ABU (urology); (2) 2017 is excluded because the PUF release was truncated; (3) surgeon-level concentration is reported with both the Gini coefficient and Herfindahl–Hirschman Index (HHI); (4) annual volume is analyzed with a repeated-measures model; and (5) specialty-classification assumptions are examined in sensitivity analyses. These updates changed several estimates from the original submission.</w:t>
       </w:r>
     </w:p>
     <w:bookmarkStart w:id="9" w:name="abstract"/>
@@ -109,7 +61,7 @@
         <w:t xml:space="preserve"> </w:t>
       </w:r>
       <w:r>
-        <w:t xml:space="preserve">To characterize the specialty distribution, annual procedure volumes, and procedural concentration among physicians performing midurethral sling procedures (CPT 57288) in Medicare beneficiaries.</w:t>
+        <w:t xml:space="preserve">To describe the specialty distribution, annual surgeon volume, and procedural concentration of physicians performing midurethral sling surgery (CPT 57288) for Medicare beneficiaries.</w:t>
       </w:r>
     </w:p>
     <w:p>
@@ -127,7 +79,7 @@
         <w:t xml:space="preserve"> </w:t>
       </w:r>
       <w:r>
-        <w:t xml:space="preserve">We analyzed the CMS Medicare Physician and Other Practitioners Public Use File (2013–2023, excluding 2017 as a truncated release). Providers billing CPT 57288 were classified as Urogynecology and Reconstructive Pelvic Surgery (URPS), Minimally Invasive Gynecologic Surgery (MIGS), General OB/GYN, or urology using CMS provider type cross-referenced with the ABOG (OB/GYN pathway) and ABU (urology pathway) subspecialty rosters. Procedural concentration was quantified at the surgeon level using the Gini coefficient and the Herfindahl–Hirschman Index (HHI), overall and per calendar year. Because each physician contributes repeated annual observations, volume differences were modeled with a Poisson generalized estimating equation (GEE) clustered by NPI (adjusted rate ratios, 95% CIs), with a per-physician Kruskal-Wallis secondary analysis. The market-share trend was reported under multiple classification schemes that bracket the truth: fixed-membership (each physician’s eventual subspecialty applied to all years; a lower bound) and time-varying certification-gated (URPS/MIGS only from the ABOG subspecialty certification year; an upper bound, since certification lags practice onset), with modal and ever-URPS/MIGS as additional sensitivity analyses.</w:t>
+        <w:t xml:space="preserve">We analyzed the CMS Medicare Physician and Other Practitioners Public Use File from 2013 through 2023, excluding the truncated 2017 release. Physicians billing CPT 57288 were classified as Urogynecology and Reconstructive Pelvic Surgery (URPS), Minimally Invasive Gynecologic Surgery (MIGS), General OB/GYN, or non-URPS urology by combining CMS provider type with ABOG and ABU subspecialty rosters. We measured surgeon-level concentration with the Gini coefficient and HHI, both overall and by year. Annual volume was modeled with a Poisson generalized estimating equation clustered by NPI; a per-physician Kruskal-Wallis analysis was secondary. Market-share trends were evaluated under fixed-membership and certification-gated classifications designed to bound the likely trend, with modal and ever-URPS/MIGS sensitivity analyses.</w:t>
       </w:r>
     </w:p>
     <w:p>
@@ -145,7 +97,7 @@
         <w:t xml:space="preserve"> </w:t>
       </w:r>
       <w:r>
-        <w:t xml:space="preserve">A total of 1,745 unique physicians billed CPT 57288 (131,637 procedures; 6,202 physician-years) after excluding the truncated 2017 file. URPS physicians represented the largest group, with 753 physicians, 80,033 procedures (60.8%), and a median of 19 procedures/year (p25–p75, 14–27); non-URPS urology followed (665 physicians; 26.1%; median 16), then General OB/GYN (330; 12.5%; median 15) and MIGS (10; 0.7%; median 16). Observed annual procedures declined (16,399 in 2013 to 12,223 in 2023; −469/year, p = 0.03), reaching a low in 2020 (9,228) with partial recovery. In a Poisson GEE clustered by NPI, adjusted annual volume was significantly lower than URPS for every group (urology rate ratio 0.82, 95% CI 0.70–0.95; General OB/GYN 0.67, 0.50–0.90; MIGS 0.56, 0.40–0.76), with a ~11% decline in 2020 (RR 0.89, 0.85–0.92, p &lt; 0.001) and no overall per-physician time trend (RR 1.00, p = 0.52). Among the three well-populated groups, pooled multi-year concentration was modest and lowest for URPS (Gini 0.51, HHI 27; top 20% performed 53.4%); within-year concentration was low and stable (annual Gini ≈ 0.27; no trend, p = 0.82). MIGS (n = 10) is reported descriptively. Modeled by specialty, URPS share rose (+0.90 pp/year, p &lt; 0.001) while urology (−0.55, p = 0.004) and General OB/GYN (−0.42, p = 0.006) declined; the combined URPS increase was significant under every classification scheme, bracketed by fixed-membership classification (lower bound: gynecologic share 60.8% → 70.1%, +0.84 pp/year) and time-varying certification-gated classification (upper bound, as certification lags practice onset: URPS share 46.3% → 74.2%, +2.28 pp/year). Newly observable entrant surgeons (absent the prior two observable years) performed 7–23% of annual volume at low median volume (~13); URPS contributed the most entrants (440 over the period) while urology showed substantial churn (373 entrants despite a declining share).</w:t>
+        <w:t xml:space="preserve">After 2017 was excluded, 1,745 physicians performed 131,637 procedures across 6,202 physician-years. URPS was the largest group (753 physicians; 80,033 procedures, 60.8%; median 19/year [p25–p75, 14–27]), followed by non-URPS urology (665 physicians; 26.1%; median 16), General OB/GYN (330; 12.5%; median 15), and MIGS (10; 0.7%; median 16). Annual procedures declined from 16,399 in 2013 to 12,223 in 2023 (−469/year; p = 0.03), with a low of 9,228 in 2020 and partial recovery thereafter. Compared with URPS, adjusted annual volume was lower for urology (rate ratio [RR] 0.82, 95% CI 0.70–0.95), General OB/GYN (RR 0.67, 0.50–0.90), and MIGS (RR 0.56, 0.40–0.76). Volume fell by approximately 11% in 2020 (RR 0.89, 0.85–0.92; p &lt; 0.001), but per-physician volume did not change overall (RR 1.00; p = 0.52). Among the three well-populated groups, pooled concentration was modest and lowest for URPS (Gini 0.51, HHI 27; top 20% performed 53.4%); within-year concentration remained low and stable (annual Gini approximately 0.27; p for trend = 0.82). URPS share increased by 0.90 percentage points per year (p &lt; 0.001), whereas urology (−0.55; p = 0.004) and General OB/GYN (−0.42; p = 0.006) declined. The increase remained significant under every classification scheme, from a lower-bound gynecologic-share increase of 60.8% to 70.1% (+0.84 percentage points/year) to an upper-bound URPS increase of 46.3% to 74.2% (+2.28 percentage points/year). Newly observable surgeons performed 7%–23% of annual volume at a median of approximately 13 cases; URPS contributed the most entrants (440), while urology showed substantial turnover (373 entrants despite a declining share).</w:t>
       </w:r>
     </w:p>
     <w:p>
@@ -163,7 +115,7 @@
         <w:t xml:space="preserve"> </w:t>
       </w:r>
       <w:r>
-        <w:t xml:space="preserve">URPS physicians perform the majority of midurethral sling procedures in Medicare, with significantly higher adjusted per-physician volume and the most equitable within-group distribution. The rising gynecologic market share reflects attrition of non-URPS providers rather than a more concentrated surgeon pool, with implications for credentialing standards and workforce planning for pelvic floor surgical care.</w:t>
+        <w:t xml:space="preserve">URPS physicians perform most midurethral sling procedures in fee-for-service Medicare and have the highest adjusted per-physician volume and the most even within-group distribution. The rising gynecologic share reflects attrition among non-URPS providers rather than increasing surgeon-level concentration, with implications for credentialing and workforce planning.</w:t>
       </w:r>
     </w:p>
     <w:p>
@@ -188,7 +140,7 @@
         <w:pStyle w:val="FirstParagraph"/>
       </w:pPr>
       <w:r>
-        <w:t xml:space="preserve">The midurethral sling is the most commonly performed surgical procedure for stress urinary incontinence (SUI) and is considered the gold standard treatment when conservative measures fail.</w:t>
+        <w:t xml:space="preserve">Midurethral sling surgery is the most common operation for stress urinary incontinence (SUI) and remains the standard surgical treatment when conservative care fails.</w:t>
       </w:r>
       <w:r>
         <w:rPr>
@@ -200,7 +152,7 @@
         <w:t xml:space="preserve"> </w:t>
       </w:r>
       <w:r>
-        <w:t xml:space="preserve">Coded as CPT 57288, the procedure involves placement of a synthetic mesh sling beneath the mid-urethra to restore continence. Despite its central role in pelvic floor surgery, the specialty distribution and procedural concentration among physicians performing this operation in the Medicare population have not been well characterized.</w:t>
+        <w:t xml:space="preserve">The procedure, coded as CPT 57288, places a synthetic mesh sling beneath the midurethra. Despite its widespread use, little is known about which specialties perform these procedures in the Medicare population or how volume is distributed among surgeons.</w:t>
       </w:r>
     </w:p>
     <w:p>
@@ -208,7 +160,7 @@
         <w:pStyle w:val="BodyText"/>
       </w:pPr>
       <w:r>
-        <w:t xml:space="preserve">Understanding who performs midurethral slings, and how procedure volume is distributed within each specialty, has direct implications for surgical quality, training requirements, and workforce planning. The volume-outcome relationship in surgery is well established: higher-volume surgeons and hospitals tend to achieve better patient outcomes across a range of procedures.</w:t>
+        <w:t xml:space="preserve">These questions matter for surgical quality, training, and workforce planning. Across surgery, higher surgeon and hospital volume is generally associated with better outcomes.</w:t>
       </w:r>
       <w:r>
         <w:rPr>
@@ -220,7 +172,7 @@
         <w:t xml:space="preserve"> </w:t>
       </w:r>
       <w:r>
-        <w:t xml:space="preserve">However, the evidence base for volume thresholds in midurethral sling surgery specifically is limited, and the specialty landscape has evolved considerably over the past decade.</w:t>
+        <w:t xml:space="preserve">Evidence for procedure-specific volume thresholds in midurethral sling surgery is more limited. The specialty mix has also changed during the past decade.</w:t>
       </w:r>
     </w:p>
     <w:p>
@@ -228,7 +180,7 @@
         <w:pStyle w:val="BodyText"/>
       </w:pPr>
       <w:r>
-        <w:t xml:space="preserve">Several trends make this analysis timely. First, the subspecialty of Female Pelvic Medicine and Reconstructive Surgery, recently renamed Urogynecology and Reconstructive Pelvic Surgery (URPS), has grown substantially since achieving American Board of Medical Specialties (ABMS) recognition in 2013,</w:t>
+        <w:t xml:space="preserve">Three developments make this analysis timely. First, Female Pelvic Medicine and Reconstructive Surgery, now named Urogynecology and Reconstructive Pelvic Surgery (URPS), has grown since receiving American Board of Medical Specialties recognition in 2013.</w:t>
       </w:r>
       <w:r>
         <w:rPr>
@@ -240,7 +192,7 @@
         <w:t xml:space="preserve"> </w:t>
       </w:r>
       <w:r>
-        <w:t xml:space="preserve">and is certifiable through both obstetrics-gynecology (ABOG) and urology (ABU) training pathways. Second, the US Food and Drug Administration’s actions on urogynecologic surgical mesh, culminating in the 2019 order to stop selling transvaginal mesh for prolapse, reshaped public perception and may have shifted the procedural landscape for slings.</w:t>
+        <w:t xml:space="preserve">Certification is available through both obstetrics and gynecology (ABOG) and urology (ABU) pathways. Second, US Food and Drug Administration actions on urogynecologic mesh, including the 2019 order ending sales of transvaginal mesh for prolapse, changed public perception and may have affected sling use.</w:t>
       </w:r>
       <w:r>
         <w:rPr>
@@ -252,7 +204,7 @@
         <w:t xml:space="preserve"> </w:t>
       </w:r>
       <w:r>
-        <w:t xml:space="preserve">Third, there is growing interest in procedural concentration, the degree to which a small number of providers account for a disproportionate share of procedures, as a metric relevant to quality improvement and resource allocation.</w:t>
+        <w:t xml:space="preserve">Third, procedural concentration, the extent to which a relatively small group of clinicians performs a large share of procedures, has become relevant to quality improvement and resource allocation.</w:t>
       </w:r>
       <w:r>
         <w:rPr>
@@ -266,7 +218,7 @@
         <w:pStyle w:val="BodyText"/>
       </w:pPr>
       <w:r>
-        <w:t xml:space="preserve">The objective of this study was to characterize the specialty distribution, annual procedure volumes, and procedural concentration among physicians performing midurethral sling procedures in Medicare beneficiaries from 2013 to 2023, and to assess time trends in the gynecologic share of sling procedures.</w:t>
+        <w:t xml:space="preserve">We therefore characterized specialty distribution, annual surgeon volume, and procedural concentration among physicians performing midurethral sling surgery for Medicare beneficiaries from 2013 through 2023. We also evaluated changes in each specialty’s share of procedures over time.</w:t>
       </w:r>
     </w:p>
     <w:bookmarkEnd w:id="10"/>
@@ -293,7 +245,7 @@
         <w:pStyle w:val="FirstParagraph"/>
       </w:pPr>
       <w:r>
-        <w:t xml:space="preserve">We conducted a repeated cross-sectional analysis of the Centers for Medicare &amp; Medicaid Services (CMS) Medicare Physician and Other Practitioners Public Use File (PUF) from 2013 to 2023. This dataset contains 100% of fee-for-service Medicare Part B claims aggregated to the provider-service level, with one row per unique combination of National Provider Identifier (NPI), Healthcare Common Procedure Coding System (HCPCS) code, and place of service per calendar year. The dataset is publicly available and contains no protected health information; institutional review board approval was not required.</w:t>
+        <w:t xml:space="preserve">We conducted a repeated cross-sectional analysis of the Centers for Medicare &amp; Medicaid Services (CMS) Medicare Physician and Other Practitioners Public Use File (PUF) from 2013 through 2023. The PUF contains all fee-for-service Medicare Part B claims aggregated to the provider-service level. Each row represents a unique combination of National Provider Identifier (NPI), Healthcare Common Procedure Coding System code, place of service, and calendar year. Because the dataset is publicly available and contains no protected health information, institutional review board approval was not required.</w:t>
       </w:r>
     </w:p>
     <w:p>
@@ -301,7 +253,7 @@
         <w:pStyle w:val="BodyText"/>
       </w:pPr>
       <w:r>
-        <w:t xml:space="preserve">The 2017 file was excluded from all analyses as a truncated release: it is roughly half the size of adjacent-year files (1.5 GB vs ~2.7 GB) and contains only 376 sling provider-year records versus ~660–810 in neighboring years, producing an artifactual dip that would bias temporal trends.</w:t>
+        <w:t xml:space="preserve">We excluded the 2017 file because the release was truncated. It was approximately half the size of adjacent-year files (1.5 GB vs approximately 2.7 GB) and contained only 376 sling provider-year records, compared with approximately 660–810 in neighboring years. Including this file would create an artifactual decline and bias temporal trends.</w:t>
       </w:r>
     </w:p>
     <w:bookmarkEnd w:id="11"/>
@@ -319,7 +271,7 @@
         <w:pStyle w:val="FirstParagraph"/>
       </w:pPr>
       <w:r>
-        <w:t xml:space="preserve">Providers were classified into four mutually exclusive groups. CMS-reported provider type (Rndrng_Prvdr_Type, which can vary by year) established a baseline of OB/GYN, urology, or other; providers billing CPT 57288 with a non-OB/GYN, non-urology CMS type not found in the ABOG registry were reclassified as urology. OB/GYN providers were then subdivided using the ABOG subspecialty registry:</w:t>
+        <w:t xml:space="preserve">Providers were assigned to four mutually exclusive groups: URPS, MIGS, General OB/GYN, or non-URPS urology. We first used the annual CMS provider type (Rndrng_Prvdr_Type), which may vary by year, to identify OB/GYN, urology, or another specialty. Providers billing CPT 57288 who had neither an OB/GYN nor urology CMS type and were not in the ABOG registry were reclassified as urology. Among OB/GYN physicians, the ABOG subspecialty registry identified</w:t>
       </w:r>
       <w:r>
         <w:t xml:space="preserve"> </w:t>
@@ -331,7 +283,7 @@
         <w:t xml:space="preserve"> </w:t>
       </w:r>
       <w:r>
-        <w:t xml:space="preserve">→ URPS,</w:t>
+        <w:t xml:space="preserve">as URPS and</w:t>
       </w:r>
       <w:r>
         <w:t xml:space="preserve"> </w:t>
@@ -343,7 +295,15 @@
         <w:t xml:space="preserve"> </w:t>
       </w:r>
       <w:r>
-        <w:t xml:space="preserve">→ MIGS, all others → General OB/GYN. Finally, urology-pathway urogynecologists were identified from the American Board of Urology (ABU) roster and folded into a single combined URPS group, leaving urology as non-URPS urology; without this step these fellowship-trained urogynecologists appear only as</w:t>
+        <w:t xml:space="preserve">as MIGS; all other OB/GYN physicians were classified as General OB/GYN.</w:t>
+      </w:r>
+    </w:p>
+    <w:p>
+      <w:pPr>
+        <w:pStyle w:val="BodyText"/>
+      </w:pPr>
+      <w:r>
+        <w:t xml:space="preserve">We then cross-referenced the American Board of Urology roster to identify urology-pathway urogynecologists. These physicians were combined with ABOG-certified urogynecologists in a single URPS group; all remaining urologists were classified as non-URPS urology. Without this step, fellowship-trained urology-pathway urogynecologists would appear only as</w:t>
       </w:r>
       <w:r>
         <w:t xml:space="preserve"> </w:t>
@@ -355,7 +315,7 @@
         <w:t xml:space="preserve"> </w:t>
       </w:r>
       <w:r>
-        <w:t xml:space="preserve">in the PUF. Records from non-OB/GYN, non-urology surgical types too heterogeneous to interpret were excluded.</w:t>
+        <w:t xml:space="preserve">in the PUF. We excluded other surgical provider types because they were too heterogeneous to interpret.</w:t>
       </w:r>
     </w:p>
     <w:p>
@@ -363,51 +323,23 @@
         <w:pStyle w:val="BodyText"/>
       </w:pPr>
       <w:r>
-        <w:t xml:space="preserve">Because the primary conclusion concerns changes in specialty market share, and because 45% of URPS physicians in this cohort were certified after 2013, we bounded the market-share trend with two classification schemes.</w:t>
-      </w:r>
-      <w:r>
-        <w:t xml:space="preserve"> </w:t>
-      </w:r>
-      <w:r>
-        <w:rPr>
-          <w:b/>
-          <w:bCs/>
-        </w:rPr>
-        <w:t xml:space="preserve">Fixed-membership</w:t>
-      </w:r>
-      <w:r>
-        <w:t xml:space="preserve"> </w:t>
-      </w:r>
-      <w:r>
-        <w:t xml:space="preserve">classification assigns each physician’s eventual subspecialty to all study years; because it treats not-yet-certified physicians as already URPS, it is a lower bound on the rate of increase.</w:t>
-      </w:r>
-      <w:r>
-        <w:t xml:space="preserve"> </w:t>
-      </w:r>
-      <w:r>
-        <w:rPr>
-          <w:b/>
-          <w:bCs/>
-        </w:rPr>
-        <w:t xml:space="preserve">Time-varying, certification-gated</w:t>
-      </w:r>
-      <w:r>
-        <w:t xml:space="preserve"> </w:t>
-      </w:r>
-      <w:r>
-        <w:t xml:space="preserve">classification counts a physician as URPS or MIGS only from their ABOG subspecialty certification year onward (from</w:t>
-      </w:r>
-      <w:r>
-        <w:t xml:space="preserve"> </w:t>
-      </w:r>
-      <w:r>
-        <w:rPr>
-          <w:rStyle w:val="VerbatimChar"/>
-        </w:rPr>
-        <w:t xml:space="preserve">sub1startdate</w:t>
-      </w:r>
-      <w:r>
-        <w:t xml:space="preserve">, which ranges 2013–2024 and is distinct from the initial OB/GYN board date), and classifies earlier years by that year’s CMS provider type; because board certification lags the start of subspecialty practice (the 2013 examination certified physicians already practicing urogynecology, and later diplomates practiced before boarding), it misattributes pre-certification practice years and is an upper bound. Modal and ever-URPS/MIGS schemes were additional sensitivity analyses. Urology-pathway URPS were held fixed in all schemes as no urology-subspecialty certification date was available. The whole-period cross-sectional distribution, concentration, and volume analyses (Tables 1–3) assign each physician their eventual (combined) subspecialty.</w:t>
+        <w:t xml:space="preserve">Specialty assignment could affect the estimated market-share trend because 45% of URPS physicians in the cohort were certified after 2013. We therefore used two primary classification schemes to bound the likely change. Fixed-membership classification assigns each physician’s eventual subspecialty to every study year. Because this approach counts physicians as URPS before certification, it provides a lower bound on the rate of increase.</w:t>
+      </w:r>
+    </w:p>
+    <w:p>
+      <w:pPr>
+        <w:pStyle w:val="BodyText"/>
+      </w:pPr>
+      <w:r>
+        <w:t xml:space="preserve">Time-varying, certification-gated classification counts a physician as URPS or MIGS only beginning in the ABOG subspecialty certification year (sub1startdate, 2013–2024, distinct from the initial OB/GYN board date). Earlier years are classified by that year’s CMS provider type. Because certification generally follows the start of subspecialty practice (the 2013 examination certified physicians already practicing urogynecology, and later diplomates also practiced before certification), this approach misclassifies some pre-certification practice years and provides an upper bound.</w:t>
+      </w:r>
+    </w:p>
+    <w:p>
+      <w:pPr>
+        <w:pStyle w:val="BodyText"/>
+      </w:pPr>
+      <w:r>
+        <w:t xml:space="preserve">Modal and ever-URPS/MIGS classifications were additional sensitivity analyses. Urology-pathway URPS classification remained fixed because no urology subspecialty certification date was available. For the whole-period distribution, concentration, and volume analyses (Tables 1–3), each physician was assigned to the eventual combined subspecialty.</w:t>
       </w:r>
     </w:p>
     <w:bookmarkEnd w:id="12"/>
@@ -425,7 +357,7 @@
         <w:pStyle w:val="FirstParagraph"/>
       </w:pPr>
       <w:r>
-        <w:t xml:space="preserve">CMS suppresses provider-service level data when a provider serves fewer than 11 Medicare beneficiaries for a given HCPCS code in a calendar year. All providers in our dataset therefore performed at least 11 midurethral slings per year; the true number of low-volume providers is unknowable. This left-truncation means the concentration metrics reported here are lower bounds.</w:t>
+        <w:t xml:space="preserve">CMS suppresses provider-service data when a provider treats fewer than 11 Medicare beneficiaries for a given code in a calendar year. Every observable provider in this study therefore treated at least 11 Medicare beneficiaries for CPT 57288 that year. Providers below the threshold are not observed, so the true number of low-volume surgeons is unknown and the reported concentration estimates are lower bounds.</w:t>
       </w:r>
     </w:p>
     <w:bookmarkEnd w:id="13"/>
@@ -443,23 +375,7 @@
         <w:pStyle w:val="FirstParagraph"/>
       </w:pPr>
       <w:r>
-        <w:t xml:space="preserve">The primary outcome was the annual midurethral sling count per provider. Procedural concentration was quantified with two complementary</w:t>
-      </w:r>
-      <w:r>
-        <w:t xml:space="preserve"> </w:t>
-      </w:r>
-      <w:r>
-        <w:rPr>
-          <w:b/>
-          <w:bCs/>
-        </w:rPr>
-        <w:t xml:space="preserve">surgeon-level</w:t>
-      </w:r>
-      <w:r>
-        <w:t xml:space="preserve"> </w:t>
-      </w:r>
-      <w:r>
-        <w:t xml:space="preserve">measures: the Gini coefficient (inequality across the whole surgeon-volume distribution) and the Herfindahl–Hirschman Index (HHI, the sum of squared per-surgeon shares on a 0–10,000 scale, driven especially by the largest-volume surgeons), both computed on aggregate provider totals and separately for each calendar year. Each physician is the operative production unit; this is surgeon-level procedural concentration and not the antitrust use of HHI for hospital/health-system market competition, so values are not comparable to FTC/DOJ thresholds.</w:t>
+        <w:t xml:space="preserve">The primary outcome was the annual number of midurethral sling procedures per provider. We measured surgeon-level concentration with two complementary metrics. The Gini coefficient summarizes inequality across the full surgeon-volume distribution. The Herfindahl–Hirschman Index (HHI) sums squared surgeon shares on a 0–10,000 scale and is more sensitive to the largest-volume surgeons. Both measures were calculated from aggregate provider totals and separately for each calendar year.</w:t>
       </w:r>
     </w:p>
     <w:p>
@@ -467,7 +383,7 @@
         <w:pStyle w:val="BodyText"/>
       </w:pPr>
       <w:r>
-        <w:t xml:space="preserve">Because each physician contributes up to ten annual observations, provider-year records are not independent, and rank tests over them are descriptive only. We therefore modeled the annual count with a Poisson generalized estimating equation (GEE) clustered by NPI (exchangeable working correlation, robust standard errors), with fixed effects for specialty (reference URPS), calendar year, specialty × year, and a 2020 (COVID) indicator, reporting adjusted rate ratios with 95% CIs; a negative-binomial mixed model with a random intercept per NPI gave concordant estimates. As a secondary analysis restoring independence, we compared one value per physician (each physician’s median annual volume) across specialties by Kruskal-Wallis and Bonferroni-adjusted pairwise Wilcoxon tests.</w:t>
+        <w:t xml:space="preserve">The physician was the operative production unit in these calculations. Thus, HHI describes surgeon-level procedural concentration rather than hospital or health-system market competition and should not be interpreted using FTC/DOJ antitrust thresholds.</w:t>
       </w:r>
     </w:p>
     <w:p>
@@ -475,7 +391,7 @@
         <w:pStyle w:val="BodyText"/>
       </w:pPr>
       <w:r>
-        <w:t xml:space="preserve">We modeled each specialty’s annual market share separately by ordinary least-squares regression of its annual percentage share on calendar year (URPS, urology, and General OB/GYN; MIGS descriptively given n = 10), in addition to the combined gynecologic share.</w:t>
+        <w:t xml:space="preserve">Because each physician contributed as many as ten annual observations, physician-year records were correlated. We modeled annual procedure count with a Poisson generalized estimating equation clustered by NPI, using an exchangeable working correlation and robust standard errors. Fixed effects included specialty (URPS reference), calendar year, specialty-by-year interaction, and a 2020 COVID indicator. We report adjusted rate ratios with 95% CIs. A negative-binomial mixed model with a random intercept for NPI produced concordant estimates.</w:t>
       </w:r>
     </w:p>
     <w:p>
@@ -483,71 +399,7 @@
         <w:pStyle w:val="BodyText"/>
       </w:pPr>
       <w:r>
-        <w:t xml:space="preserve">To characterize workforce turnover, we classified each observable surgeon in each year, using a two-year washout, as an</w:t>
-      </w:r>
-      <w:r>
-        <w:t xml:space="preserve"> </w:t>
-      </w:r>
-      <w:r>
-        <w:rPr>
-          <w:b/>
-          <w:bCs/>
-        </w:rPr>
-        <w:t xml:space="preserve">entrant</w:t>
-      </w:r>
-      <w:r>
-        <w:t xml:space="preserve"> </w:t>
-      </w:r>
-      <w:r>
-        <w:t xml:space="preserve">(observable that year but absent in both of the two prior observable years),</w:t>
-      </w:r>
-      <w:r>
-        <w:t xml:space="preserve"> </w:t>
-      </w:r>
-      <w:r>
-        <w:rPr>
-          <w:b/>
-          <w:bCs/>
-        </w:rPr>
-        <w:t xml:space="preserve">continuing</w:t>
-      </w:r>
-      <w:r>
-        <w:t xml:space="preserve"> </w:t>
-      </w:r>
-      <w:r>
-        <w:t xml:space="preserve">(observable and not an entrant), or apparently</w:t>
-      </w:r>
-      <w:r>
-        <w:t xml:space="preserve"> </w:t>
-      </w:r>
-      <w:r>
-        <w:rPr>
-          <w:b/>
-          <w:bCs/>
-        </w:rPr>
-        <w:t xml:space="preserve">exiting</w:t>
-      </w:r>
-      <w:r>
-        <w:t xml:space="preserve"> </w:t>
-      </w:r>
-      <w:r>
-        <w:t xml:space="preserve">(observable that year but absent in both of the two subsequent observable years), and computed the entrant share of annual volume, median entrant volume, and entrants by specialty. Because CMS suppression removes providers below 11 beneficiaries, we describe these as</w:t>
-      </w:r>
-      <w:r>
-        <w:t xml:space="preserve"> </w:t>
-      </w:r>
-      <w:r>
-        <w:rPr>
-          <w:i/>
-          <w:iCs/>
-        </w:rPr>
-        <w:t xml:space="preserve">newly observable</w:t>
-      </w:r>
-      <w:r>
-        <w:t xml:space="preserve"> </w:t>
-      </w:r>
-      <w:r>
-        <w:t xml:space="preserve">surgeons rather than definitively new sling surgeons.</w:t>
+        <w:t xml:space="preserve">As a secondary analysis with one independent observation per physician, we compared each physician’s median annual volume across specialties using the Kruskal-Wallis test and Bonferroni-adjusted pairwise Wilcoxon tests.</w:t>
       </w:r>
     </w:p>
     <w:p>
@@ -555,7 +407,7 @@
         <w:pStyle w:val="BodyText"/>
       </w:pPr>
       <w:r>
-        <w:t xml:space="preserve">As a restrained secondary geographic analysis, we tabulated observable surgeons and the URPS share by provider practice state and identified states with no observable URPS surgeon performing at least 11 Medicare slings in any year. Population-based rates (surgeons and procedures per female Medicare beneficiary) were not computed, as fee-for-service denominators with Medicare Advantage adjustment were outside the scope of this analysis.</w:t>
+        <w:t xml:space="preserve">To estimate market-share trends, we separately regressed each specialty’s annual percentage share on calendar year using ordinary least squares. We modeled URPS, urology, General OB/GYN, and the combined gynecologic share; MIGS was described without formal emphasis because only 10 physicians were identified.</w:t>
       </w:r>
     </w:p>
     <w:p>
@@ -563,7 +415,23 @@
         <w:pStyle w:val="BodyText"/>
       </w:pPr>
       <w:r>
-        <w:t xml:space="preserve">All analyses were performed in R 4.4 with package versions locked via renv. The complete pipeline is available at https://github.com/mufflyt/sling-volume-patterns.</w:t>
+        <w:t xml:space="preserve">To describe workforce turnover, we used a two-year washout. A surgeon was classified as an entrant when observable in a given year but absent in both prior observable years; as continuing when observable and not an entrant; and as apparently exiting when absent in both subsequent observable years. We calculated entrant share of annual volume, median entrant volume, and entrants by specialty. Because CMS suppression removes providers below 11 beneficiaries, we use the term newly observable rather than definitively new sling surgeon.</w:t>
+      </w:r>
+    </w:p>
+    <w:p>
+      <w:pPr>
+        <w:pStyle w:val="BodyText"/>
+      </w:pPr>
+      <w:r>
+        <w:t xml:space="preserve">In a secondary geographic analysis, we tabulated observable surgeons and URPS share by practice state and identified states with no observable URPS surgeon performing at least 11 Medicare slings in any study year. We did not calculate population-based rates because fee-for-service denominators adjusted for Medicare Advantage enrollment were outside the scope of this analysis.</w:t>
+      </w:r>
+    </w:p>
+    <w:p>
+      <w:pPr>
+        <w:pStyle w:val="BodyText"/>
+      </w:pPr>
+      <w:r>
+        <w:t xml:space="preserve">Analyses were performed in R 4.4, with package versions locked through renv. The complete analytic pipeline is available at https://github.com/mufflyt/sling-volume-patterns.</w:t>
       </w:r>
     </w:p>
     <w:bookmarkEnd w:id="14"/>
@@ -591,7 +459,7 @@
         <w:pStyle w:val="FirstParagraph"/>
       </w:pPr>
       <w:r>
-        <w:t xml:space="preserve">Across the full 11-year window, 1,761 unique physicians billed CPT 57288, accounting for 139,855 observed services in 6,572 physician-year observations. Excluding the truncated 2017 file, the analytic cohort comprised 1,745 unique physicians, 131,637 procedures, and 6,202 physician-year observations. Most physicians were observed only intermittently: 567 (32%) appeared in a single year, 753 (43%) in 2–5 years, 375 (21%) in 6–10 years, and only 66 (4%) in all 11 years, consistent with a workforce in which a minority sustain a durable Medicare sling practice.</w:t>
+        <w:t xml:space="preserve">Across the full 11-year window, 1,761 physicians billed CPT 57288, accounting for 139,855 observed services and 6,572 physician-years. After the truncated 2017 file was excluded, the analytic cohort included 1,745 physicians, 131,637 procedures, and 6,202 physician-years. Participation was intermittent: 567 physicians (32%) appeared in one year, 753 (43%) in 2–5 years, 375 (21%) in 6–10 years, and 66 (4%) in all 11 years. Thus, only a small proportion maintained an observable Medicare sling practice throughout the study window.</w:t>
       </w:r>
     </w:p>
     <w:p>
@@ -599,7 +467,7 @@
         <w:pStyle w:val="BodyText"/>
       </w:pPr>
       <w:r>
-        <w:t xml:space="preserve">Observed annual procedures declined over the period, from 16,399 in 2013 to 12,223 in 2023 (linear trend −469 procedures/year; p = 0.03), and the number of observable surgeons fell from 812 to 562. Volume reached its low in 2020 (9,228 procedures), consistent with pandemic-related deferral of elective surgery, and partially recovered thereafter (12,053 in 2022; 12,223 in 2023) without returning to pre-2020 levels. A single pooled total would obscure this decline: Medicare sling volume fell over the decade even as its specialty composition shifted.</w:t>
+        <w:t xml:space="preserve">Observed annual volume declined from 16,399 procedures in 2013 to 12,223 in 2023 (linear trend, −469 procedures/year; p = 0.03). The number of observable surgeons also fell, from 812 to 562. Volume reached a low of 9,228 procedures in 2020, consistent with pandemic-related deferral of elective surgery. It partially recovered to 12,053 in 2022 and 12,223 in 2023 but remained below pre-2020 levels. Therefore, the pooled total masks a decade-long decline in Medicare sling volume.</w:t>
       </w:r>
     </w:p>
     <w:bookmarkEnd w:id="16"/>
@@ -617,7 +485,7 @@
         <w:pStyle w:val="FirstParagraph"/>
       </w:pPr>
       <w:r>
-        <w:t xml:space="preserve">URPS physicians constituted the largest group, with 753 physicians, 3,498 physician-years, 80,033 procedures (60.8%), and a median of 19 procedures/year (p25–p75, 14–27); non-URPS urology followed (665 physicians; 1,810 physician-years; 34,351 procedures; 26.1%; median 16, 13–22), then General OB/GYN (330; 858; 16,391; 12.5%; median 15, 12–22) and MIGS (10; 36; 862; 0.7%; median 16, 12–24) (Table 1). Per-specialty physician counts sum to slightly more than the unique total because 13 physicians changed specialty group across years. Folding urology-pathway urogynecologists into URPS moved 150 physicians (11,503 procedures) from urology relative to an ABOG-only classification.</w:t>
+        <w:t xml:space="preserve">URPS was the largest group: 753 physicians contributed 3,498 physician-years and 80,033 procedures (60.8%), with a median annual volume of 19 (p25–p75, 14–27). Non-URPS urology included 665 physicians, 1,810 physician-years, and 34,351 procedures (26.1%; median 16, 13–22). General OB/GYN included 330 physicians, 858 physician-years, and 16,391 procedures (12.5%; median 15, 12–22). MIGS included 10 physicians, 36 physician-years, and 862 procedures (0.7%; median 16, 12–24) (Table 1).</w:t>
       </w:r>
     </w:p>
     <w:p>
@@ -625,7 +493,7 @@
         <w:pStyle w:val="BodyText"/>
       </w:pPr>
       <w:r>
-        <w:t xml:space="preserve">Modeled separately, each specialty’s annual market share moved significantly and in divergent directions (Table 1): URPS rose from 53.4% (2013) to 63.8% (2023) (+0.90 percentage points/year; 95% CI 0.49 to 1.31; p &lt; 0.001), whereas urology fell from 30.7% to 23.1% (−0.55; 95% CI −0.87 to −0.23; p = 0.004) and General OB/GYN from 15.7% to 12.3% (−0.42; 95% CI −0.68 to −0.16; p = 0.006). MIGS rose descriptively from 0.2% to 0.8% (+0.07/year; n = 10, interpreted with caution). Because total observed volume fell, these are shifts in specialty ownership rather than differential growth. The combined-URPS increase was significant under all classification schemes and bounded by fixed membership (lower bound; gynecologic share 60.8% → 70.1%, +0.84 pp/year) and time-varying certification-gating (upper bound; URPS share 46.3% → 74.2%, +2.28 pp/year, as certification lags practice onset; Table 4).</w:t>
+        <w:t xml:space="preserve">Because 13 physicians changed specialty groups across years, specialty-specific physician counts exceed the unique cohort total. Including urology-pathway urogynecologists reassigned 150 physicians and 11,503 procedures from urology to URPS compared with an ABOG-only classification.</w:t>
       </w:r>
     </w:p>
     <w:p>
@@ -633,7 +501,23 @@
         <w:pStyle w:val="BodyText"/>
       </w:pPr>
       <w:r>
-        <w:t xml:space="preserve">In the Poisson GEE clustered by NPI, adjusted annual volume relative to URPS was significantly lower for every other group (urology rate ratio 0.82, 95% CI 0.70–0.95; General OB/GYN 0.67, 0.50–0.90; MIGS 0.56, 0.40–0.76), with a ~11% decline in 2020 (RR 0.89, 0.85–0.92; p &lt; 0.001) and no overall per-physician time trend (year RR 1.00, 0.99–1.00; p = 0.52) (Table 3). The one-value-per-physician secondary analysis agreed (Kruskal-Wallis H = 66.1, df = 3, p &lt; 0.001; URPS exceeded urology and General OB/GYN, pairwise p &lt; 0.001).</w:t>
+        <w:t xml:space="preserve">Annual market shares moved in different directions (Table 1). URPS increased from 53.4% in 2013 to 63.8% in 2023 (+0.90 percentage points/year; 95% CI 0.49–1.31; p &lt; 0.001). Urology decreased from 30.7% to 23.1% (−0.55 percentage points/year; 95% CI −0.87 to −0.23; p = 0.004), and General OB/GYN decreased from 15.7% to 12.3% (−0.42 percentage points/year; 95% CI −0.68 to −0.16; p = 0.006). MIGS increased descriptively from 0.2% to 0.8% (+0.07 percentage points/year), but this estimate is based on only 10 physicians. Because total volume declined, these changes represent redistribution among specialties rather than procedure growth.</w:t>
+      </w:r>
+    </w:p>
+    <w:p>
+      <w:pPr>
+        <w:pStyle w:val="BodyText"/>
+      </w:pPr>
+      <w:r>
+        <w:t xml:space="preserve">The URPS or gynecologic increase was significant under every classification scheme. Fixed membership provided the lower bound: gynecologic share increased from 60.8% to 70.1% (+0.84 percentage points/year). Certification-gated classification provided the upper bound: URPS share increased from 46.3% to 74.2% (+2.28 percentage points/year) (Table 4).</w:t>
+      </w:r>
+    </w:p>
+    <w:p>
+      <w:pPr>
+        <w:pStyle w:val="BodyText"/>
+      </w:pPr>
+      <w:r>
+        <w:t xml:space="preserve">In the Poisson GEE clustered by NPI, adjusted annual volume was lower than URPS for every other group: urology RR 0.82 (95% CI 0.70–0.95), General OB/GYN RR 0.67 (0.50–0.90), and MIGS RR 0.56 (0.40–0.76) (Table 3). Annual volume was approximately 11% lower in 2020 (RR 0.89, 0.85–0.92; p &lt; 0.001). There was no overall change in per-physician volume over time (year RR 1.00, 0.99–1.00; p = 0.52). The one-observation-per-physician secondary analysis was concordant (Kruskal-Wallis H = 66.1, df = 3, p &lt; 0.001); URPS volume exceeded both urology and General OB/GYN in pairwise comparisons (p &lt; 0.001).</w:t>
       </w:r>
     </w:p>
     <w:bookmarkEnd w:id="17"/>
@@ -651,7 +535,23 @@
         <w:pStyle w:val="FirstParagraph"/>
       </w:pPr>
       <w:r>
-        <w:t xml:space="preserve">Pooled multi-year concentration among the three well-populated groups was lowest for URPS (Gini 0.51, HHI 27; top 10% performed 34.3%, top 20% 53.4%), intermediate for urology (Gini 0.52, HHI 35; top 20% 57.5%), and highest for General OB/GYN (Gini 0.55, HHI 89; top 20% 60.8%) (Table 2). Gini and HHI ranked the groups identically, but for all three the HHI was very low in absolute terms (27–89 of 10,000): sling volume is distributed unevenly across many surgeons rather than dominated by a few, and no surgeon approaches a concentrating share. Median annual volume and its upper tail were highest for URPS (median 19, p75 27). Computed separately for each year, within-year concentration was modest and stable (pooled annual Gini 0.26–0.28; no temporal trend, slope ≈ 0.000/year, p = 0.82; annual top-20% ~38%), and no individual group’s annual Gini trended (p &gt; 0.15). Thus sling care did not become concentrated among a shrinking set of high-volume surgeons even as the surgeon pool contracted. MIGS is deliberately excluded from these concentration comparisons: with only 10 physicians (1–4 observable per year), its nominal values (Gini 0.60, HHI 2,919) are numerically extreme but not a clinically stable statement about specialty-wide concentration.</w:t>
+        <w:t xml:space="preserve">Among the three well-populated groups, pooled multi-year concentration was lowest for URPS (Gini 0.51, HHI 27; top 10% performed 34.3% and top 20% performed 53.4%). Concentration was slightly higher for urology (Gini 0.52, HHI 35; top 20% performed 57.5%) and General OB/GYN (Gini 0.55, HHI 89; top 20% performed 60.8%) (Table 2).</w:t>
+      </w:r>
+    </w:p>
+    <w:p>
+      <w:pPr>
+        <w:pStyle w:val="BodyText"/>
+      </w:pPr>
+      <w:r>
+        <w:t xml:space="preserve">The Gini coefficient and HHI ranked the groups identically. However, the absolute HHI values for all three groups were very low (27–89 of 10,000), indicating that sling volume was unevenly distributed across many surgeons rather than dominated by a few. URPS also had the highest median annual volume and upper quartile (median 19; p75 27).</w:t>
+      </w:r>
+    </w:p>
+    <w:p>
+      <w:pPr>
+        <w:pStyle w:val="BodyText"/>
+      </w:pPr>
+      <w:r>
+        <w:t xml:space="preserve">Within-year concentration was low and stable. The pooled annual Gini ranged from 0.26 to 0.28, with no temporal trend (slope approximately 0.000/year; p = 0.82), and the annual top 20% performed approximately 38% of cases. No specialty-specific annual Gini changed significantly (all p &gt; 0.15). Thus, care did not become concentrated among a smaller group of high-volume surgeons as the observable surgeon pool contracted. MIGS was excluded from these comparisons because only 10 physicians were identified (1–4 per year); its nominal Gini of 0.60 and HHI of 2,919 are not stable specialty-wide estimates.</w:t>
       </w:r>
     </w:p>
     <w:bookmarkEnd w:id="18"/>
@@ -669,23 +569,23 @@
         <w:pStyle w:val="FirstParagraph"/>
       </w:pPr>
       <w:r>
-        <w:t xml:space="preserve">Applying a two-year washout (Table 5), newly observable entrant surgeons numbered 48–184 per year and performed 7.4%–22.5% of that year’s volume, at a low median entrant volume (~13 slings/year) consistent with providers appearing just above the CMS suppression threshold. Entry collapsed in 2020 (48 entrants; 7.4% of volume) and rebounded in 2022 (168; 22.5%). Continuing surgeons (381–543 per year) performed the large majority of annual volume, and apparent exits ranged from 66 to 230 per year. Across the period URPS contributed the most entrants (440), followed by urology (373), General OB/GYN (189), and MIGS (8). Decomposing the specialty-share changes: the rising URPS share was driven by the largest inflow of newly observable URPS surgeons together with a stable continuing-URPS base (URPS surgeon count 385 → 338; per-physician volume flat), whereas urology’s decline reflected net attrition despite substantial churn (many entrants offset by more exits), and General OB/GYN lost both surgeons and share. Because total volume fell, the gynecologic gain is a redistribution of a shrinking pool toward URPS, not new procedure growth. Given CMS suppression, all counts describe</w:t>
-      </w:r>
-      <w:r>
-        <w:t xml:space="preserve"> </w:t>
-      </w:r>
-      <w:r>
-        <w:rPr>
-          <w:i/>
-          <w:iCs/>
-        </w:rPr>
-        <w:t xml:space="preserve">newly observable</w:t>
-      </w:r>
-      <w:r>
-        <w:t xml:space="preserve"> </w:t>
-      </w:r>
-      <w:r>
-        <w:t xml:space="preserve">rather than definitively new sling surgeons.</w:t>
+        <w:t xml:space="preserve">Using the two-year washout (Table 5), 48–184 surgeons were newly observable each year and performed 7.4%–22.5% of annual volume. Their median annual volume was low, at approximately 13 procedures, consistent with surgeons appearing just above the CMS suppression threshold. Entry fell to 48 surgeons and 7.4% of volume in 2020, then rebounded to 168 surgeons and 22.5% of volume in 2022. Continuing surgeons (381–543 per year) performed most annual procedures, while apparent exits ranged from 66 to 230 per year.</w:t>
+      </w:r>
+    </w:p>
+    <w:p>
+      <w:pPr>
+        <w:pStyle w:val="BodyText"/>
+      </w:pPr>
+      <w:r>
+        <w:t xml:space="preserve">Across the study period, URPS contributed the most entrants (440), followed by urology (373), General OB/GYN (189), and MIGS (8). The rising URPS share reflected the largest inflow of newly observable surgeons together with a relatively stable continuing-URPS base (URPS surgeon count 385 to 338; per-physician volume unchanged). Urology showed substantial turnover but net attrition, and General OB/GYN lost both surgeons and market share.</w:t>
+      </w:r>
+    </w:p>
+    <w:p>
+      <w:pPr>
+        <w:pStyle w:val="BodyText"/>
+      </w:pPr>
+      <w:r>
+        <w:t xml:space="preserve">Because total volume declined, the gynecologic gain represents a redistribution of a shrinking procedure pool toward URPS, not new procedure growth. All turnover counts describe newly observable rather than definitively new surgeons because low-volume providers are suppressed.</w:t>
       </w:r>
     </w:p>
     <w:bookmarkEnd w:id="19"/>
@@ -703,23 +603,7 @@
         <w:pStyle w:val="FirstParagraph"/>
       </w:pPr>
       <w:r>
-        <w:t xml:space="preserve">Provider practice location spanned 52 states and territories. The URPS share of observable sling surgeons varied widely by state, from 100% (Hawaii) and 82%–85% (Minnesota, District of Columbia, Connecticut) to 15% (Nebraska). Four states or territories had no observable URPS surgeon performing at least 11 Medicare slings in any study year (North Dakota, Alaska, Puerto Rico, Wyoming); given CMS suppression, this indicates the absence of</w:t>
-      </w:r>
-      <w:r>
-        <w:t xml:space="preserve"> </w:t>
-      </w:r>
-      <w:r>
-        <w:rPr>
-          <w:i/>
-          <w:iCs/>
-        </w:rPr>
-        <w:t xml:space="preserve">observable</w:t>
-      </w:r>
-      <w:r>
-        <w:t xml:space="preserve"> </w:t>
-      </w:r>
-      <w:r>
-        <w:t xml:space="preserve">high-volume URPS surgeons, not necessarily the absence of any URPS physician. Population-based rates and formal geographic inequality measures were not computed and are proposed as a separate access-focused analysis.</w:t>
+        <w:t xml:space="preserve">Practice locations spanned 52 states and territories. The URPS share of observable sling surgeons varied from 100% in Hawaii and 82%–85% in Minnesota, the District of Columbia, and Connecticut to 15% in Nebraska. North Dakota, Alaska, Puerto Rico, and Wyoming had no observable URPS surgeon performing at least 11 Medicare slings in any study year. Because of CMS suppression, this finding indicates no observable higher-volume URPS surgeon, not necessarily no URPS physician. Population-based rates and formal geographic inequality measures were reserved for a separate access-focused analysis.</w:t>
       </w:r>
     </w:p>
     <w:bookmarkEnd w:id="20"/>
@@ -738,7 +622,7 @@
         <w:pStyle w:val="FirstParagraph"/>
       </w:pPr>
       <w:r>
-        <w:t xml:space="preserve">This national analysis of Medicare claims from 2013 to 2023 shows that URPS physicians perform the majority of midurethral sling procedures (60.8%), with the highest adjusted per-physician volume and the most equitable within-group distribution. The combined gynecologic share increased significantly over the decade, and workforce decomposition attributes that rise to non-URPS attrition and URPS entry rather than to intensifying individual practice or concentrating care.</w:t>
+        <w:t xml:space="preserve">This national Medicare analysis produced three main findings. First, URPS physicians performed most midurethral sling procedures (60.8%) and had the highest adjusted per-physician volume. Second, the gynecologic share increased over the decade as URPS surgeons entered the observable workforce and non-URPS surgeons left. Third, surgeon-level concentration remained low and stable despite a shrinking surgeon pool. Together, these findings indicate a change in workforce composition rather than intensification of individual practice or concentration of care.</w:t>
       </w:r>
     </w:p>
     <w:bookmarkStart w:id="22" w:name="X91e1c95b037f473535ecf00410a7735e835e926"/>
@@ -755,7 +639,7 @@
         <w:pStyle w:val="FirstParagraph"/>
       </w:pPr>
       <w:r>
-        <w:t xml:space="preserve">Our finding that fellowship-trained urogynecologists perform roughly three-fifths of Medicare slings, with gynecologists collectively performing the majority, is consistent with contemporary practice-pattern data but marks a reversal from earlier Medicare-specific analyses. Using ACS-NSQIP (2006–2013), James et al. found gynecologists performed 74.2% of sling procedures versus 25.8% by urologists,</w:t>
+        <w:t xml:space="preserve">URPS physicians performed approximately three-fifths of Medicare slings, and gynecologists collectively performed the majority. This finding is consistent with contemporary practice-pattern data but reverses earlier Medicare-specific patterns. In ACS-NSQIP data from 2006 through 2013, James et al. reported that gynecologists performed 74.2% of sling procedures and urologists performed 25.8%.</w:t>
       </w:r>
       <w:r>
         <w:rPr>
@@ -767,7 +651,7 @@
         <w:t xml:space="preserve"> </w:t>
       </w:r>
       <w:r>
-        <w:t xml:space="preserve">and Cantrell et al. reported that urogynecologists performed 54% of stress-incontinence procedures at academic centers (2009–2014).</w:t>
+        <w:t xml:space="preserve">Cantrell et al. found that urogynecologists performed 54% of stress-incontinence procedures at academic centers from 2009 through 2014.</w:t>
       </w:r>
       <w:r>
         <w:rPr>
@@ -779,7 +663,7 @@
         <w:t xml:space="preserve"> </w:t>
       </w:r>
       <w:r>
-        <w:t xml:space="preserve">In the Medicare population specifically, however, Rogo-Gupta et al. found that urologists performed the majority of sling operations in 2002–2007.</w:t>
+        <w:t xml:space="preserve">In Medicare data from 2002 through 2007, however, Rogo-Gupta et al. found that urologists performed most sling operations.</w:t>
       </w:r>
       <w:r>
         <w:rPr>
@@ -791,7 +675,7 @@
         <w:t xml:space="preserve"> </w:t>
       </w:r>
       <w:r>
-        <w:t xml:space="preserve">Our data, spanning 2013–2023, show that this historical pattern has reversed, with URPS now accounting for the single largest share.</w:t>
+        <w:t xml:space="preserve">Our 2013–2023 findings indicate that this historical pattern has reversed, with URPS now the largest single specialty group.</w:t>
       </w:r>
     </w:p>
     <w:p>
@@ -799,7 +683,7 @@
         <w:pStyle w:val="BodyText"/>
       </w:pPr>
       <w:r>
-        <w:t xml:space="preserve">Identifying urogynecologists through both the ABOG (obstetrics-gynecology) and ABU (urology) certifying pathways is central to this result, because URPS is certifiable from either residency. Cross-referencing the ABU roster reassigned 150 urology-typed physicians (8.2% of all slings) to URPS, and the finding was robust: the pooled URPS Gini changed negligibly (0.51 → 0.52). A pathway-agnostic definition is important given that urology- and gynecology-based URPS fellows accrue different intraoperative case volumes during training</w:t>
+        <w:t xml:space="preserve">Including both certification pathways was essential to this result. Cross-referencing the ABU roster reassigned 150 urology-typed physicians, representing 8.2% of all sling procedures, to URPS. The concentration estimate was robust: the pooled URPS Gini changed only from 0.51 to 0.52. A pathway-neutral definition also reflects differences in operative case volume between urology- and gynecology-based URPS fellowships</w:t>
       </w:r>
       <w:r>
         <w:rPr>
@@ -811,7 +695,7 @@
         <w:t xml:space="preserve"> </w:t>
       </w:r>
       <w:r>
-        <w:t xml:space="preserve">and that FPMRS exposure during urology residency is variable;</w:t>
+        <w:t xml:space="preserve">and variable FPMRS exposure during urology residency.</w:t>
       </w:r>
       <w:r>
         <w:rPr>
@@ -823,7 +707,7 @@
         <w:t xml:space="preserve"> </w:t>
       </w:r>
       <w:r>
-        <w:t xml:space="preserve">classifying urology-pathway urogynecologists as general urologists would understate the true subspecialty share.</w:t>
+        <w:t xml:space="preserve">Classifying urology-pathway urogynecologists as general urologists would therefore understate the true subspecialty share.</w:t>
       </w:r>
     </w:p>
     <w:bookmarkEnd w:id="22"/>
@@ -841,7 +725,7 @@
         <w:pStyle w:val="FirstParagraph"/>
       </w:pPr>
       <w:r>
-        <w:t xml:space="preserve">Reporting the Gini coefficient and the Herfindahl–Hirschman Index together makes the concentration finding difficult to attribute to a single metric: the two answer related but distinct questions and agree here. Moderate inequality (Gini 0.51–0.55) coexists with very low absolute HHI (27–89 of 10,000), indicating that sling volume is spread unevenly across many surgeons rather than dominated by a few. Treating each physician as the operative production unit is a surgeon-level, not a market-competition, measure and follows workforce-concentration approaches used in other surgical specialties.</w:t>
+        <w:t xml:space="preserve">The Gini coefficient and HHI provide complementary views of concentration, and both supported the same conclusion. Moderate inequality across the full distribution (Gini 0.51–0.55) coexisted with very low absolute HHI values (27–89 of 10,000). In other words, sling volume was distributed unevenly across many surgeons but was not dominated by a few. Because the physician was the production unit, these values describe surgeon-level procedural concentration rather than market competition.</w:t>
       </w:r>
     </w:p>
     <w:p>
@@ -849,7 +733,7 @@
         <w:pStyle w:val="BodyText"/>
       </w:pPr>
       <w:r>
-        <w:t xml:space="preserve">These patterns have clinical significance given the established volume–outcome relationship for midurethral slings. Berger et al. found that higher-volume surgeons had a substantially lower adjusted risk of reoperation for sling failure,</w:t>
+        <w:t xml:space="preserve">These patterns matter because greater surgeon volume has been associated with better outcomes after midurethral sling surgery. Berger et al. reported a lower adjusted risk of reoperation for sling failure among higher-volume surgeons.</w:t>
       </w:r>
       <w:r>
         <w:rPr>
@@ -861,7 +745,7 @@
         <w:t xml:space="preserve"> </w:t>
       </w:r>
       <w:r>
-        <w:t xml:space="preserve">and a systematic review by Cartier et al. found that low-volume surgeons had higher odds of both mesh revision and repeat incontinence procedures.</w:t>
+        <w:t xml:space="preserve">A systematic review by Cartier et al. found that low-volume surgeons had higher odds of mesh revision and repeat incontinence procedures.</w:t>
       </w:r>
       <w:r>
         <w:rPr>
@@ -873,7 +757,7 @@
         <w:t xml:space="preserve"> </w:t>
       </w:r>
       <w:r>
-        <w:t xml:space="preserve">Brennand and Quan identified a threshold effect, with revision odds declining above roughly 50 cases per year,</w:t>
+        <w:t xml:space="preserve">Brennand and Quan observed lower revision odds above approximately 50 cases per year,</w:t>
       </w:r>
       <w:r>
         <w:rPr>
@@ -885,7 +769,7 @@
         <w:t xml:space="preserve"> </w:t>
       </w:r>
       <w:r>
-        <w:t xml:space="preserve">and Holdø and Svenningsen found that greater surgeon experience and annual volume improved objective cure rates.</w:t>
+        <w:t xml:space="preserve">and Holdø and Svenningsen found better objective cure rates with greater surgeon experience and annual volume.</w:t>
       </w:r>
       <w:r>
         <w:rPr>
@@ -897,7 +781,7 @@
         <w:t xml:space="preserve"> </w:t>
       </w:r>
       <w:r>
-        <w:t xml:space="preserve">The median observed volumes here (15–19 procedures/year) fall below these thresholds, but the PUF captures only Medicare fee-for-service claims; true per-surgeon volumes (including commercially insured, Medicare Advantage, and younger patients) are higher, and the reported concentration is a lower bound because sub-11-beneficiary providers are suppressed.</w:t>
+        <w:t xml:space="preserve">The observed Medicare medians of 15–19 procedures per year fall below these thresholds. However, the PUF omits commercially insured, Medicare Advantage, and younger patients, so total practice volume is higher. In addition, providers below the CMS suppression threshold are absent.</w:t>
       </w:r>
     </w:p>
     <w:bookmarkEnd w:id="23"/>
@@ -915,7 +799,15 @@
         <w:pStyle w:val="FirstParagraph"/>
       </w:pPr>
       <w:r>
-        <w:t xml:space="preserve">The repeated-measures model and workforce decomposition together clarify the mechanism behind the rising gynecologic share. Individual physician volume did not change over time (year rate ratio 1.00), while the number of non-URPS surgeons fell sharply and URPS numbers held steady; entrant analysis showed URPS contributing the largest inflow of newly observable surgeons and urology exhibiting churn (many entrants offset by more exits) alongside net decline. The market-share shift is therefore a change in workforce composition superimposed on a shrinking total pool, not intensification of individual practice or concentration of care. This mechanism echoes prior work: Siegal et al. showed that the post-2011 decline in sling placement was driven primarily by non-FPMRS providers, while FPMRS providers maintained their volumes,</w:t>
+        <w:t xml:space="preserve">The repeated-measures model and turnover analysis clarify why the gynecologic share increased. Individual physician volume did not change over time, but the number of non-URPS surgeons fell while the URPS pool remained comparatively stable. URPS also contributed the largest inflow of newly observable surgeons, whereas urology had substantial turnover but a net decline. The market-share shift therefore reflects workforce composition within a shrinking procedure pool, not increasing individual volume or concentration.</w:t>
+      </w:r>
+    </w:p>
+    <w:p>
+      <w:pPr>
+        <w:pStyle w:val="BodyText"/>
+      </w:pPr>
+      <w:r>
+        <w:t xml:space="preserve">This mechanism is consistent with prior work. Siegal et al. found that the post-2011 decline in sling placement was driven mainly by non-FPMRS providers, while FPMRS providers maintained their volumes.</w:t>
       </w:r>
       <w:r>
         <w:rPr>
@@ -927,7 +819,7 @@
         <w:t xml:space="preserve"> </w:t>
       </w:r>
       <w:r>
-        <w:t xml:space="preserve">and Lee et al. documented an approximately 50% national decline in incontinence surgery from 2004 to 2013.</w:t>
+        <w:t xml:space="preserve">Lee et al. documented an approximately 50% national decline in incontinence surgery from 2004 through 2013.</w:t>
       </w:r>
       <w:r>
         <w:rPr>
@@ -939,7 +831,15 @@
         <w:t xml:space="preserve"> </w:t>
       </w:r>
       <w:r>
-        <w:t xml:space="preserve">The significant 2020 decline (rate ratio 0.89) is consistent with pandemic-related deferral of elective surgery and was robust to excluding 2020. Finally, the SUI treatment landscape continues to diversify (urethral bulking agents are now positioned alongside slings as a first-line surgical option</w:t>
+        <w:t xml:space="preserve">The 2020 decline in our study (RR 0.89) is consistent with pandemic-related deferral of elective surgery and remained robust when 2020 was excluded.</w:t>
+      </w:r>
+    </w:p>
+    <w:p>
+      <w:pPr>
+        <w:pStyle w:val="BodyText"/>
+      </w:pPr>
+      <w:r>
+        <w:t xml:space="preserve">The SUI treatment landscape also continues to change. Urethral bulking agents are now positioned alongside slings as a first-line surgical option,</w:t>
       </w:r>
       <w:r>
         <w:rPr>
@@ -948,7 +848,10 @@
         <w:t xml:space="preserve">3,20</w:t>
       </w:r>
       <w:r>
-        <w:t xml:space="preserve">), and whether this differentially affects specialty-specific sling volumes warrants continued surveillance.</w:t>
+        <w:t xml:space="preserve"> </w:t>
+      </w:r>
+      <w:r>
+        <w:t xml:space="preserve">and ongoing surveillance is needed to determine whether this shift affects specialty-specific sling volume.</w:t>
       </w:r>
     </w:p>
     <w:bookmarkEnd w:id="24"/>
@@ -966,7 +869,23 @@
         <w:pStyle w:val="FirstParagraph"/>
       </w:pPr>
       <w:r>
-        <w:t xml:space="preserve">Several limitations warrant discussion. First, CMS suppresses provider-level data below 11 beneficiaries, so the lowest-volume providers are unobserved and reported concentration is a lower bound. Second, the PUF captures only fee-for-service Medicare Part B; younger, Medicare Advantage, Medicaid, commercially insured, and uninsured patients are not represented. Third, specialty classification depends on CMS provider type and the ABOG/ABU rosters; providers who completed URPS fellowship but are not board-certified would be misclassified. Fourth, the market-share trend is bounded rather than point-identified. Board certification lags the start of subspecialty practice (physicians complete fellowship and practice urogynecology before sitting for boards, and the 2013 inaugural examination certified an established practicing cohort), so the certification-gated scheme (upper bound) misattributes pre-certification practice years to General OB/GYN or urology, while fixed membership (lower bound) retroactively counts physicians as URPS before they subspecialized. The true trend lies between; a point estimate would require fellowship-completion dates, which are not available. Additionally, ~8% of URPS providers could not be matched to a certification year and urology-pathway URPS were held fixed (no urology-subspecialty date), both of which shrink the upper-bound estimate. Fifth, the exclusion of 2017 removes one year of the time series (the underlying file being truncated); re-running with a complete 2017 file would restore all 11 years. Sixth, Tot_Srvcs may include bilateral or modifier-inflated services.</w:t>
+        <w:t xml:space="preserve">This study has six limitations. First, CMS suppresses provider-level data for fewer than 11 beneficiaries, so the lowest-volume surgeons are not observed and concentration estimates are lower bounds. Second, the PUF includes only fee-for-service Medicare Part B claims; younger patients and those covered by Medicare Advantage, Medicaid, commercial insurance, or no insurance are not represented.</w:t>
+      </w:r>
+    </w:p>
+    <w:p>
+      <w:pPr>
+        <w:pStyle w:val="BodyText"/>
+      </w:pPr>
+      <w:r>
+        <w:t xml:space="preserve">Third, specialty classification depends on CMS provider type and the ABOG/ABU rosters. Physicians who completed URPS fellowship but were not board-certified may therefore be misclassified. Fourth, the market-share trend is bounded rather than point-identified. Certification follows the start of subspecialty practice, so the certification-gated approach (upper bound) assigns some pre-certification practice years to General OB/GYN or urology. Conversely, fixed membership (lower bound) assigns physicians to URPS before they subspecialized. The true trend lies between these estimates and would require unavailable fellowship-completion dates for point identification.</w:t>
+      </w:r>
+    </w:p>
+    <w:p>
+      <w:pPr>
+        <w:pStyle w:val="BodyText"/>
+      </w:pPr>
+      <w:r>
+        <w:t xml:space="preserve">Approximately 8% of URPS physicians could not be matched to a certification year, and urology-pathway URPS classification remained fixed because no urology subspecialty date was available; both features narrow the upper-bound estimate. Fifth, excluding the truncated 2017 release removes one year from the time series; a complete file would restore all 11 years. Sixth, Tot_Srvcs may include bilateral or modifier-inflated services.</w:t>
       </w:r>
     </w:p>
     <w:bookmarkEnd w:id="25"/>
@@ -984,7 +903,7 @@
         <w:pStyle w:val="FirstParagraph"/>
       </w:pPr>
       <w:r>
-        <w:t xml:space="preserve">This study uses a national, 100% sample of Medicare fee-for-service claims; identifies urogynecologists through both training pathways; reports concentration with two complementary surgeon-level measures at both the pooled and annual level; accounts for the non-independence of repeated physician-year observations with a clustered model; and is fully reproducible.</w:t>
+        <w:t xml:space="preserve">Strengths include a national, complete sample of fee-for-service Medicare claims; identification of urogynecologists through both certification pathways; complementary surgeon-level concentration measures calculated both overall and by year; a model that accounts for repeated observations within physicians; and a fully reproducible analytic pipeline.</w:t>
       </w:r>
     </w:p>
     <w:bookmarkEnd w:id="26"/>
@@ -1003,7 +922,7 @@
         <w:pStyle w:val="FirstParagraph"/>
       </w:pPr>
       <w:r>
-        <w:t xml:space="preserve">In this national Medicare cohort, URPS physicians perform the majority of midurethral slings with the highest adjusted per-physician volume and the most equitable within-group distribution. The growing gynecologic market share is driven by attrition of non-URPS providers rather than by increasing surgeon-level concentration, with implications for training requirements, credentialing standards, and access to pelvic floor surgical care.</w:t>
+        <w:t xml:space="preserve">In this national Medicare cohort, URPS physicians performed most midurethral slings, had the highest adjusted per-physician volume, and had the most even within-group volume distribution. The growing gynecologic share reflected attrition among non-URPS providers rather than increasing surgeon-level concentration. These workforce shifts should inform training requirements, credentialing standards, and access planning for pelvic floor surgical care.</w:t>
       </w:r>
     </w:p>
     <w:bookmarkEnd w:id="28"/>
@@ -1268,7 +1187,7 @@
         <w:t xml:space="preserve"> </w:t>
       </w:r>
       <w:r>
-        <w:t xml:space="preserve">Specialty distribution and market-share trends of CPT 57288 providers, Medicare PUF 2013–2023 (2017 excluded; combined URPS). Δ share = annual percentage-point change in market share (OLS on calendar year). Physician counts sum to more than the unique total (1,745) because 13 physicians changed specialty group across years.</w:t>
+        <w:t xml:space="preserve">Specialty distribution and market-share trends among physicians billing CPT 57288, Medicare PUF 2013–2023 (2017 excluded; combined URPS). Δ share is the annual percentage-point change from ordinary least-squares regression on calendar year. Specialty-specific physician counts exceed 1,745 because 13 physicians changed groups across years.</w:t>
       </w:r>
     </w:p>
     <w:tbl>
@@ -1279,16 +1198,16 @@
         <w:tblLook w:firstRow="1" w:lastRow="0" w:firstColumn="0" w:lastColumn="0" w:noHBand="0" w:noVBand="0" w:val="0020"/>
       </w:tblPr>
       <w:tblGrid>
-        <w:gridCol w:w="645"/>
-        <w:gridCol w:w="1056"/>
-        <w:gridCol w:w="997"/>
-        <w:gridCol w:w="645"/>
-        <w:gridCol w:w="586"/>
-        <w:gridCol w:w="1290"/>
-        <w:gridCol w:w="645"/>
-        <w:gridCol w:w="645"/>
-        <w:gridCol w:w="1232"/>
-        <w:gridCol w:w="176"/>
+        <w:gridCol w:w="609"/>
+        <w:gridCol w:w="1052"/>
+        <w:gridCol w:w="941"/>
+        <w:gridCol w:w="664"/>
+        <w:gridCol w:w="553"/>
+        <w:gridCol w:w="1218"/>
+        <w:gridCol w:w="664"/>
+        <w:gridCol w:w="664"/>
+        <w:gridCol w:w="1163"/>
+        <w:gridCol w:w="387"/>
       </w:tblGrid>
       <w:tr>
         <w:trPr>
@@ -1310,6 +1229,7 @@
           <w:p>
             <w:pPr>
               <w:pStyle w:val="Compact"/>
+              <w:jc w:val="center"/>
             </w:pPr>
             <w:r>
               <w:t xml:space="preserve">Unique physicians</w:t>
@@ -1321,6 +1241,7 @@
           <w:p>
             <w:pPr>
               <w:pStyle w:val="Compact"/>
+              <w:jc w:val="center"/>
             </w:pPr>
             <w:r>
               <w:t xml:space="preserve">Physician-years</w:t>
@@ -1332,6 +1253,7 @@
           <w:p>
             <w:pPr>
               <w:pStyle w:val="Compact"/>
+              <w:jc w:val="center"/>
             </w:pPr>
             <w:r>
               <w:t xml:space="preserve">Procedures</w:t>
@@ -1343,6 +1265,7 @@
           <w:p>
             <w:pPr>
               <w:pStyle w:val="Compact"/>
+              <w:jc w:val="center"/>
             </w:pPr>
             <w:r>
               <w:t xml:space="preserve">% of all</w:t>
@@ -1354,6 +1277,7 @@
           <w:p>
             <w:pPr>
               <w:pStyle w:val="Compact"/>
+              <w:jc w:val="center"/>
             </w:pPr>
             <w:r>
               <w:t xml:space="preserve">Median vol (p25–p75)</w:t>
@@ -1365,6 +1289,7 @@
           <w:p>
             <w:pPr>
               <w:pStyle w:val="Compact"/>
+              <w:jc w:val="center"/>
             </w:pPr>
             <w:r>
               <w:t xml:space="preserve">2013 share</w:t>
@@ -1376,6 +1301,7 @@
           <w:p>
             <w:pPr>
               <w:pStyle w:val="Compact"/>
+              <w:jc w:val="center"/>
             </w:pPr>
             <w:r>
               <w:t xml:space="preserve">2023 share</w:t>
@@ -1387,6 +1313,7 @@
           <w:p>
             <w:pPr>
               <w:pStyle w:val="Compact"/>
+              <w:jc w:val="center"/>
             </w:pPr>
             <w:r>
               <w:t xml:space="preserve">Δ share/yr (95% CI)</w:t>
@@ -1398,6 +1325,7 @@
           <w:p>
             <w:pPr>
               <w:pStyle w:val="Compact"/>
+              <w:jc w:val="center"/>
             </w:pPr>
             <w:r>
               <w:t xml:space="preserve">p</w:t>
@@ -1422,6 +1350,7 @@
           <w:p>
             <w:pPr>
               <w:pStyle w:val="Compact"/>
+              <w:jc w:val="center"/>
             </w:pPr>
             <w:r>
               <w:t xml:space="preserve">753</w:t>
@@ -1433,6 +1362,7 @@
           <w:p>
             <w:pPr>
               <w:pStyle w:val="Compact"/>
+              <w:jc w:val="center"/>
             </w:pPr>
             <w:r>
               <w:t xml:space="preserve">3,498</w:t>
@@ -1444,6 +1374,7 @@
           <w:p>
             <w:pPr>
               <w:pStyle w:val="Compact"/>
+              <w:jc w:val="center"/>
             </w:pPr>
             <w:r>
               <w:t xml:space="preserve">80,033</w:t>
@@ -1455,6 +1386,7 @@
           <w:p>
             <w:pPr>
               <w:pStyle w:val="Compact"/>
+              <w:jc w:val="center"/>
             </w:pPr>
             <w:r>
               <w:t xml:space="preserve">60.8%</w:t>
@@ -1466,6 +1398,7 @@
           <w:p>
             <w:pPr>
               <w:pStyle w:val="Compact"/>
+              <w:jc w:val="center"/>
             </w:pPr>
             <w:r>
               <w:t xml:space="preserve">19 (14–27)</w:t>
@@ -1477,6 +1410,7 @@
           <w:p>
             <w:pPr>
               <w:pStyle w:val="Compact"/>
+              <w:jc w:val="center"/>
             </w:pPr>
             <w:r>
               <w:t xml:space="preserve">53.4%</w:t>
@@ -1488,6 +1422,7 @@
           <w:p>
             <w:pPr>
               <w:pStyle w:val="Compact"/>
+              <w:jc w:val="center"/>
             </w:pPr>
             <w:r>
               <w:t xml:space="preserve">63.8%</w:t>
@@ -1499,6 +1434,7 @@
           <w:p>
             <w:pPr>
               <w:pStyle w:val="Compact"/>
+              <w:jc w:val="center"/>
             </w:pPr>
             <w:r>
               <w:t xml:space="preserve">+0.90 (0.49 to 1.31)</w:t>
@@ -1510,6 +1446,7 @@
           <w:p>
             <w:pPr>
               <w:pStyle w:val="Compact"/>
+              <w:jc w:val="center"/>
             </w:pPr>
             <w:r>
               <w:t xml:space="preserve">&lt;0.001</w:t>
@@ -1534,6 +1471,7 @@
           <w:p>
             <w:pPr>
               <w:pStyle w:val="Compact"/>
+              <w:jc w:val="center"/>
             </w:pPr>
             <w:r>
               <w:t xml:space="preserve">665</w:t>
@@ -1545,6 +1483,7 @@
           <w:p>
             <w:pPr>
               <w:pStyle w:val="Compact"/>
+              <w:jc w:val="center"/>
             </w:pPr>
             <w:r>
               <w:t xml:space="preserve">1,810</w:t>
@@ -1556,6 +1495,7 @@
           <w:p>
             <w:pPr>
               <w:pStyle w:val="Compact"/>
+              <w:jc w:val="center"/>
             </w:pPr>
             <w:r>
               <w:t xml:space="preserve">34,351</w:t>
@@ -1567,6 +1507,7 @@
           <w:p>
             <w:pPr>
               <w:pStyle w:val="Compact"/>
+              <w:jc w:val="center"/>
             </w:pPr>
             <w:r>
               <w:t xml:space="preserve">26.1%</w:t>
@@ -1578,6 +1519,7 @@
           <w:p>
             <w:pPr>
               <w:pStyle w:val="Compact"/>
+              <w:jc w:val="center"/>
             </w:pPr>
             <w:r>
               <w:t xml:space="preserve">16 (13–22)</w:t>
@@ -1589,6 +1531,7 @@
           <w:p>
             <w:pPr>
               <w:pStyle w:val="Compact"/>
+              <w:jc w:val="center"/>
             </w:pPr>
             <w:r>
               <w:t xml:space="preserve">30.7%</w:t>
@@ -1600,6 +1543,7 @@
           <w:p>
             <w:pPr>
               <w:pStyle w:val="Compact"/>
+              <w:jc w:val="center"/>
             </w:pPr>
             <w:r>
               <w:t xml:space="preserve">23.1%</w:t>
@@ -1611,6 +1555,7 @@
           <w:p>
             <w:pPr>
               <w:pStyle w:val="Compact"/>
+              <w:jc w:val="center"/>
             </w:pPr>
             <w:r>
               <w:t xml:space="preserve">−0.55 (−0.87 to −0.23)</w:t>
@@ -1622,6 +1567,7 @@
           <w:p>
             <w:pPr>
               <w:pStyle w:val="Compact"/>
+              <w:jc w:val="center"/>
             </w:pPr>
             <w:r>
               <w:t xml:space="preserve">0.004</w:t>
@@ -1646,6 +1592,7 @@
           <w:p>
             <w:pPr>
               <w:pStyle w:val="Compact"/>
+              <w:jc w:val="center"/>
             </w:pPr>
             <w:r>
               <w:t xml:space="preserve">330</w:t>
@@ -1657,6 +1604,7 @@
           <w:p>
             <w:pPr>
               <w:pStyle w:val="Compact"/>
+              <w:jc w:val="center"/>
             </w:pPr>
             <w:r>
               <w:t xml:space="preserve">858</w:t>
@@ -1668,6 +1616,7 @@
           <w:p>
             <w:pPr>
               <w:pStyle w:val="Compact"/>
+              <w:jc w:val="center"/>
             </w:pPr>
             <w:r>
               <w:t xml:space="preserve">16,391</w:t>
@@ -1679,6 +1628,7 @@
           <w:p>
             <w:pPr>
               <w:pStyle w:val="Compact"/>
+              <w:jc w:val="center"/>
             </w:pPr>
             <w:r>
               <w:t xml:space="preserve">12.5%</w:t>
@@ -1690,6 +1640,7 @@
           <w:p>
             <w:pPr>
               <w:pStyle w:val="Compact"/>
+              <w:jc w:val="center"/>
             </w:pPr>
             <w:r>
               <w:t xml:space="preserve">15 (12–22)</w:t>
@@ -1701,6 +1652,7 @@
           <w:p>
             <w:pPr>
               <w:pStyle w:val="Compact"/>
+              <w:jc w:val="center"/>
             </w:pPr>
             <w:r>
               <w:t xml:space="preserve">15.7%</w:t>
@@ -1712,6 +1664,7 @@
           <w:p>
             <w:pPr>
               <w:pStyle w:val="Compact"/>
+              <w:jc w:val="center"/>
             </w:pPr>
             <w:r>
               <w:t xml:space="preserve">12.3%</w:t>
@@ -1723,6 +1676,7 @@
           <w:p>
             <w:pPr>
               <w:pStyle w:val="Compact"/>
+              <w:jc w:val="center"/>
             </w:pPr>
             <w:r>
               <w:t xml:space="preserve">−0.42 (−0.68 to −0.16)</w:t>
@@ -1734,6 +1688,7 @@
           <w:p>
             <w:pPr>
               <w:pStyle w:val="Compact"/>
+              <w:jc w:val="center"/>
             </w:pPr>
             <w:r>
               <w:t xml:space="preserve">0.006</w:t>
@@ -1758,6 +1713,7 @@
           <w:p>
             <w:pPr>
               <w:pStyle w:val="Compact"/>
+              <w:jc w:val="center"/>
             </w:pPr>
             <w:r>
               <w:t xml:space="preserve">10</w:t>
@@ -1769,6 +1725,7 @@
           <w:p>
             <w:pPr>
               <w:pStyle w:val="Compact"/>
+              <w:jc w:val="center"/>
             </w:pPr>
             <w:r>
               <w:t xml:space="preserve">36</w:t>
@@ -1780,6 +1737,7 @@
           <w:p>
             <w:pPr>
               <w:pStyle w:val="Compact"/>
+              <w:jc w:val="center"/>
             </w:pPr>
             <w:r>
               <w:t xml:space="preserve">862</w:t>
@@ -1791,6 +1749,7 @@
           <w:p>
             <w:pPr>
               <w:pStyle w:val="Compact"/>
+              <w:jc w:val="center"/>
             </w:pPr>
             <w:r>
               <w:t xml:space="preserve">0.7%</w:t>
@@ -1802,6 +1761,7 @@
           <w:p>
             <w:pPr>
               <w:pStyle w:val="Compact"/>
+              <w:jc w:val="center"/>
             </w:pPr>
             <w:r>
               <w:t xml:space="preserve">16 (12–24)</w:t>
@@ -1813,6 +1773,7 @@
           <w:p>
             <w:pPr>
               <w:pStyle w:val="Compact"/>
+              <w:jc w:val="center"/>
             </w:pPr>
             <w:r>
               <w:t xml:space="preserve">0.2%</w:t>
@@ -1824,6 +1785,7 @@
           <w:p>
             <w:pPr>
               <w:pStyle w:val="Compact"/>
+              <w:jc w:val="center"/>
             </w:pPr>
             <w:r>
               <w:t xml:space="preserve">0.8%</w:t>
@@ -1835,6 +1797,7 @@
           <w:p>
             <w:pPr>
               <w:pStyle w:val="Compact"/>
+              <w:jc w:val="center"/>
             </w:pPr>
             <w:r>
               <w:t xml:space="preserve">+0.07 (0.02 to 0.12)*</w:t>
@@ -1846,6 +1809,7 @@
           <w:p>
             <w:pPr>
               <w:pStyle w:val="Compact"/>
+              <w:jc w:val="center"/>
             </w:pPr>
             <w:r>
               <w:t xml:space="preserve">0.008</w:t>
@@ -1874,6 +1838,7 @@
           <w:p>
             <w:pPr>
               <w:pStyle w:val="Compact"/>
+              <w:jc w:val="center"/>
             </w:pPr>
             <w:r>
               <w:rPr>
@@ -1889,6 +1854,7 @@
           <w:p>
             <w:pPr>
               <w:pStyle w:val="Compact"/>
+              <w:jc w:val="center"/>
             </w:pPr>
             <w:r>
               <w:rPr>
@@ -1904,6 +1870,7 @@
           <w:p>
             <w:pPr>
               <w:pStyle w:val="Compact"/>
+              <w:jc w:val="center"/>
             </w:pPr>
             <w:r>
               <w:rPr>
@@ -1919,6 +1886,7 @@
           <w:p>
             <w:pPr>
               <w:pStyle w:val="Compact"/>
+              <w:jc w:val="center"/>
             </w:pPr>
             <w:r>
               <w:rPr>
@@ -1934,6 +1902,7 @@
           <w:p>
             <w:pPr>
               <w:pStyle w:val="Compact"/>
+              <w:jc w:val="center"/>
             </w:pPr>
             <w:r>
               <w:t xml:space="preserve">n/a</w:t>
@@ -1945,6 +1914,7 @@
           <w:p>
             <w:pPr>
               <w:pStyle w:val="Compact"/>
+              <w:jc w:val="center"/>
             </w:pPr>
             <w:r>
               <w:t xml:space="preserve">n/a</w:t>
@@ -1956,6 +1926,7 @@
           <w:p>
             <w:pPr>
               <w:pStyle w:val="Compact"/>
+              <w:jc w:val="center"/>
             </w:pPr>
             <w:r>
               <w:t xml:space="preserve">n/a</w:t>
@@ -1967,6 +1938,7 @@
           <w:p>
             <w:pPr>
               <w:pStyle w:val="Compact"/>
+              <w:jc w:val="center"/>
             </w:pPr>
             <w:r>
               <w:t xml:space="preserve">n/a</w:t>
@@ -1978,6 +1950,7 @@
           <w:p>
             <w:pPr>
               <w:pStyle w:val="Compact"/>
+              <w:jc w:val="center"/>
             </w:pPr>
             <w:r>
               <w:t xml:space="preserve">n/a</w:t>
@@ -1991,7 +1964,7 @@
         <w:pStyle w:val="BodyText"/>
       </w:pPr>
       <w:r>
-        <w:t xml:space="preserve">*MIGS (n = 10) reported descriptively; too few physicians for a stable specialty-wide inference.</w:t>
+        <w:t xml:space="preserve">*MIGS estimates are descriptive because only 10 physicians were identified.</w:t>
       </w:r>
     </w:p>
     <w:p>
@@ -2009,7 +1982,7 @@
         <w:t xml:space="preserve"> </w:t>
       </w:r>
       <w:r>
-        <w:t xml:space="preserve">Procedural concentration by specialty (aggregate provider-level volumes): Gini and HHI (surgeon-level).</w:t>
+        <w:t xml:space="preserve">Surgeon-level procedural concentration by specialty, based on aggregate provider volume.</w:t>
       </w:r>
     </w:p>
     <w:tbl>
@@ -2047,6 +2020,7 @@
           <w:p>
             <w:pPr>
               <w:pStyle w:val="Compact"/>
+              <w:jc w:val="center"/>
             </w:pPr>
             <w:r>
               <w:t xml:space="preserve">N providers</w:t>
@@ -2058,6 +2032,7 @@
           <w:p>
             <w:pPr>
               <w:pStyle w:val="Compact"/>
+              <w:jc w:val="center"/>
             </w:pPr>
             <w:r>
               <w:t xml:space="preserve">Gini</w:t>
@@ -2069,6 +2044,7 @@
           <w:p>
             <w:pPr>
               <w:pStyle w:val="Compact"/>
+              <w:jc w:val="center"/>
             </w:pPr>
             <w:r>
               <w:t xml:space="preserve">HHI (0–10,000)</w:t>
@@ -2080,6 +2056,7 @@
           <w:p>
             <w:pPr>
               <w:pStyle w:val="Compact"/>
+              <w:jc w:val="center"/>
             </w:pPr>
             <w:r>
               <w:t xml:space="preserve">% by top 10%</w:t>
@@ -2091,6 +2068,7 @@
           <w:p>
             <w:pPr>
               <w:pStyle w:val="Compact"/>
+              <w:jc w:val="center"/>
             </w:pPr>
             <w:r>
               <w:t xml:space="preserve">% by top 20%</w:t>
@@ -2115,6 +2093,7 @@
           <w:p>
             <w:pPr>
               <w:pStyle w:val="Compact"/>
+              <w:jc w:val="center"/>
             </w:pPr>
             <w:r>
               <w:t xml:space="preserve">753</w:t>
@@ -2126,6 +2105,7 @@
           <w:p>
             <w:pPr>
               <w:pStyle w:val="Compact"/>
+              <w:jc w:val="center"/>
             </w:pPr>
             <w:r>
               <w:t xml:space="preserve">0.51</w:t>
@@ -2137,6 +2117,7 @@
           <w:p>
             <w:pPr>
               <w:pStyle w:val="Compact"/>
+              <w:jc w:val="center"/>
             </w:pPr>
             <w:r>
               <w:t xml:space="preserve">27</w:t>
@@ -2148,6 +2129,7 @@
           <w:p>
             <w:pPr>
               <w:pStyle w:val="Compact"/>
+              <w:jc w:val="center"/>
             </w:pPr>
             <w:r>
               <w:t xml:space="preserve">34.3%</w:t>
@@ -2159,6 +2141,7 @@
           <w:p>
             <w:pPr>
               <w:pStyle w:val="Compact"/>
+              <w:jc w:val="center"/>
             </w:pPr>
             <w:r>
               <w:t xml:space="preserve">53.4%</w:t>
@@ -2183,6 +2166,7 @@
           <w:p>
             <w:pPr>
               <w:pStyle w:val="Compact"/>
+              <w:jc w:val="center"/>
             </w:pPr>
             <w:r>
               <w:t xml:space="preserve">665</w:t>
@@ -2194,6 +2178,7 @@
           <w:p>
             <w:pPr>
               <w:pStyle w:val="Compact"/>
+              <w:jc w:val="center"/>
             </w:pPr>
             <w:r>
               <w:t xml:space="preserve">0.52</w:t>
@@ -2205,6 +2190,7 @@
           <w:p>
             <w:pPr>
               <w:pStyle w:val="Compact"/>
+              <w:jc w:val="center"/>
             </w:pPr>
             <w:r>
               <w:t xml:space="preserve">35</w:t>
@@ -2216,6 +2202,7 @@
           <w:p>
             <w:pPr>
               <w:pStyle w:val="Compact"/>
+              <w:jc w:val="center"/>
             </w:pPr>
             <w:r>
               <w:t xml:space="preserve">38.5%</w:t>
@@ -2227,6 +2214,7 @@
           <w:p>
             <w:pPr>
               <w:pStyle w:val="Compact"/>
+              <w:jc w:val="center"/>
             </w:pPr>
             <w:r>
               <w:t xml:space="preserve">57.5%</w:t>
@@ -2251,6 +2239,7 @@
           <w:p>
             <w:pPr>
               <w:pStyle w:val="Compact"/>
+              <w:jc w:val="center"/>
             </w:pPr>
             <w:r>
               <w:t xml:space="preserve">330</w:t>
@@ -2262,6 +2251,7 @@
           <w:p>
             <w:pPr>
               <w:pStyle w:val="Compact"/>
+              <w:jc w:val="center"/>
             </w:pPr>
             <w:r>
               <w:t xml:space="preserve">0.55</w:t>
@@ -2273,6 +2263,7 @@
           <w:p>
             <w:pPr>
               <w:pStyle w:val="Compact"/>
+              <w:jc w:val="center"/>
             </w:pPr>
             <w:r>
               <w:t xml:space="preserve">89</w:t>
@@ -2284,6 +2275,7 @@
           <w:p>
             <w:pPr>
               <w:pStyle w:val="Compact"/>
+              <w:jc w:val="center"/>
             </w:pPr>
             <w:r>
               <w:t xml:space="preserve">43.2%</w:t>
@@ -2295,6 +2287,7 @@
           <w:p>
             <w:pPr>
               <w:pStyle w:val="Compact"/>
+              <w:jc w:val="center"/>
             </w:pPr>
             <w:r>
               <w:t xml:space="preserve">60.8%</w:t>
@@ -2319,6 +2312,7 @@
           <w:p>
             <w:pPr>
               <w:pStyle w:val="Compact"/>
+              <w:jc w:val="center"/>
             </w:pPr>
             <w:r>
               <w:t xml:space="preserve">10</w:t>
@@ -2330,6 +2324,7 @@
           <w:p>
             <w:pPr>
               <w:pStyle w:val="Compact"/>
+              <w:jc w:val="center"/>
             </w:pPr>
             <w:r>
               <w:t xml:space="preserve">0.60</w:t>
@@ -2341,6 +2336,7 @@
           <w:p>
             <w:pPr>
               <w:pStyle w:val="Compact"/>
+              <w:jc w:val="center"/>
             </w:pPr>
             <w:r>
               <w:t xml:space="preserve">2,919</w:t>
@@ -2352,6 +2348,7 @@
           <w:p>
             <w:pPr>
               <w:pStyle w:val="Compact"/>
+              <w:jc w:val="center"/>
             </w:pPr>
             <w:r>
               <w:t xml:space="preserve">48.4%</w:t>
@@ -2363,6 +2360,7 @@
           <w:p>
             <w:pPr>
               <w:pStyle w:val="Compact"/>
+              <w:jc w:val="center"/>
             </w:pPr>
             <w:r>
               <w:t xml:space="preserve">68.2%</w:t>
@@ -2386,7 +2384,7 @@
         <w:t xml:space="preserve"> </w:t>
       </w:r>
       <w:r>
-        <w:t xml:space="preserve">Repeated-measures model of annual sling volume: adjusted rate ratios from a Poisson GEE clustered by NPI (reference URPS; exchangeable correlation, robust SEs).</w:t>
+        <w:t xml:space="preserve">Adjusted rate ratios for annual sling volume from a Poisson GEE clustered by NPI (URPS reference; exchangeable correlation; robust standard errors).</w:t>
       </w:r>
     </w:p>
     <w:tbl>
@@ -2420,6 +2418,7 @@
           <w:p>
             <w:pPr>
               <w:pStyle w:val="Compact"/>
+              <w:jc w:val="center"/>
             </w:pPr>
             <w:r>
               <w:t xml:space="preserve">Rate ratio (95% CI)</w:t>
@@ -2431,6 +2430,7 @@
           <w:p>
             <w:pPr>
               <w:pStyle w:val="Compact"/>
+              <w:jc w:val="center"/>
             </w:pPr>
             <w:r>
               <w:t xml:space="preserve">p-value</w:t>
@@ -2455,6 +2455,7 @@
           <w:p>
             <w:pPr>
               <w:pStyle w:val="Compact"/>
+              <w:jc w:val="center"/>
             </w:pPr>
             <w:r>
               <w:t xml:space="preserve">0.82 (0.70–0.95)</w:t>
@@ -2466,6 +2467,7 @@
           <w:p>
             <w:pPr>
               <w:pStyle w:val="Compact"/>
+              <w:jc w:val="center"/>
             </w:pPr>
             <w:r>
               <w:t xml:space="preserve">0.008</w:t>
@@ -2490,6 +2492,7 @@
           <w:p>
             <w:pPr>
               <w:pStyle w:val="Compact"/>
+              <w:jc w:val="center"/>
             </w:pPr>
             <w:r>
               <w:t xml:space="preserve">0.67 (0.50–0.90)</w:t>
@@ -2501,6 +2504,7 @@
           <w:p>
             <w:pPr>
               <w:pStyle w:val="Compact"/>
+              <w:jc w:val="center"/>
             </w:pPr>
             <w:r>
               <w:t xml:space="preserve">0.008</w:t>
@@ -2525,6 +2529,7 @@
           <w:p>
             <w:pPr>
               <w:pStyle w:val="Compact"/>
+              <w:jc w:val="center"/>
             </w:pPr>
             <w:r>
               <w:t xml:space="preserve">0.56 (0.40–0.76)</w:t>
@@ -2536,9 +2541,10 @@
           <w:p>
             <w:pPr>
               <w:pStyle w:val="Compact"/>
-            </w:pPr>
-            <w:r>
-              <w:t xml:space="preserve">&lt; 0.001</w:t>
+              <w:jc w:val="center"/>
+            </w:pPr>
+            <w:r>
+              <w:t xml:space="preserve">&lt;0.001</w:t>
             </w:r>
           </w:p>
         </w:tc>
@@ -2560,6 +2566,7 @@
           <w:p>
             <w:pPr>
               <w:pStyle w:val="Compact"/>
+              <w:jc w:val="center"/>
             </w:pPr>
             <w:r>
               <w:t xml:space="preserve">1.00 (0.99–1.00)</w:t>
@@ -2571,6 +2578,7 @@
           <w:p>
             <w:pPr>
               <w:pStyle w:val="Compact"/>
+              <w:jc w:val="center"/>
             </w:pPr>
             <w:r>
               <w:t xml:space="preserve">0.52</w:t>
@@ -2595,6 +2603,7 @@
           <w:p>
             <w:pPr>
               <w:pStyle w:val="Compact"/>
+              <w:jc w:val="center"/>
             </w:pPr>
             <w:r>
               <w:t xml:space="preserve">0.89 (0.85–0.92)</w:t>
@@ -2606,9 +2615,10 @@
           <w:p>
             <w:pPr>
               <w:pStyle w:val="Compact"/>
-            </w:pPr>
-            <w:r>
-              <w:t xml:space="preserve">&lt; 0.001</w:t>
+              <w:jc w:val="center"/>
+            </w:pPr>
+            <w:r>
+              <w:t xml:space="preserve">&lt;0.001</w:t>
             </w:r>
           </w:p>
         </w:tc>
@@ -2629,7 +2639,7 @@
         <w:t xml:space="preserve"> </w:t>
       </w:r>
       <w:r>
-        <w:t xml:space="preserve">Market-share trends under classification schemes that bracket the true trend. Fixed-membership is a lower bound (treats not-yet-certified physicians as already URPS); time-varying certification-gated is an upper bound (board certification lags practice onset). All schemes are significant and positive.</w:t>
+        <w:t xml:space="preserve">Market-share trends under classification schemes that bound the likely trend. Fixed membership provides a lower bound because it treats not-yet-certified physicians as URPS; certification-gated classification provides an upper bound because certification follows practice onset. All estimated trends are positive and statistically significant.</w:t>
       </w:r>
     </w:p>
     <w:tbl>
@@ -2665,6 +2675,7 @@
           <w:p>
             <w:pPr>
               <w:pStyle w:val="Compact"/>
+              <w:jc w:val="center"/>
             </w:pPr>
             <w:r>
               <w:t xml:space="preserve">2013 → 2023</w:t>
@@ -2676,6 +2687,7 @@
           <w:p>
             <w:pPr>
               <w:pStyle w:val="Compact"/>
+              <w:jc w:val="center"/>
             </w:pPr>
             <w:r>
               <w:t xml:space="preserve">Slope (pp/year)</w:t>
@@ -2687,6 +2699,7 @@
           <w:p>
             <w:pPr>
               <w:pStyle w:val="Compact"/>
+              <w:jc w:val="center"/>
             </w:pPr>
             <w:r>
               <w:t xml:space="preserve">p-value</w:t>
@@ -2711,6 +2724,7 @@
           <w:p>
             <w:pPr>
               <w:pStyle w:val="Compact"/>
+              <w:jc w:val="center"/>
             </w:pPr>
             <w:r>
               <w:t xml:space="preserve">60.8% → 70.1%</w:t>
@@ -2722,6 +2736,7 @@
           <w:p>
             <w:pPr>
               <w:pStyle w:val="Compact"/>
+              <w:jc w:val="center"/>
             </w:pPr>
             <w:r>
               <w:t xml:space="preserve">0.84</w:t>
@@ -2733,9 +2748,10 @@
           <w:p>
             <w:pPr>
               <w:pStyle w:val="Compact"/>
-            </w:pPr>
-            <w:r>
-              <w:t xml:space="preserve">&lt; 0.001</w:t>
+              <w:jc w:val="center"/>
+            </w:pPr>
+            <w:r>
+              <w:t xml:space="preserve">&lt;0.001</w:t>
             </w:r>
           </w:p>
         </w:tc>
@@ -2757,6 +2773,7 @@
           <w:p>
             <w:pPr>
               <w:pStyle w:val="Compact"/>
+              <w:jc w:val="center"/>
             </w:pPr>
             <w:r>
               <w:t xml:space="preserve">53.4% → 63.8%</w:t>
@@ -2768,6 +2785,7 @@
           <w:p>
             <w:pPr>
               <w:pStyle w:val="Compact"/>
+              <w:jc w:val="center"/>
             </w:pPr>
             <w:r>
               <w:t xml:space="preserve">0.90</w:t>
@@ -2779,9 +2797,10 @@
           <w:p>
             <w:pPr>
               <w:pStyle w:val="Compact"/>
-            </w:pPr>
-            <w:r>
-              <w:t xml:space="preserve">&lt; 0.001</w:t>
+              <w:jc w:val="center"/>
+            </w:pPr>
+            <w:r>
+              <w:t xml:space="preserve">&lt;0.001</w:t>
             </w:r>
           </w:p>
         </w:tc>
@@ -2803,6 +2822,7 @@
           <w:p>
             <w:pPr>
               <w:pStyle w:val="Compact"/>
+              <w:jc w:val="center"/>
             </w:pPr>
             <w:r>
               <w:t xml:space="preserve">n/a</w:t>
@@ -2814,6 +2834,7 @@
           <w:p>
             <w:pPr>
               <w:pStyle w:val="Compact"/>
+              <w:jc w:val="center"/>
             </w:pPr>
             <w:r>
               <w:t xml:space="preserve">0.98</w:t>
@@ -2825,9 +2846,10 @@
           <w:p>
             <w:pPr>
               <w:pStyle w:val="Compact"/>
-            </w:pPr>
-            <w:r>
-              <w:t xml:space="preserve">&lt; 0.001</w:t>
+              <w:jc w:val="center"/>
+            </w:pPr>
+            <w:r>
+              <w:t xml:space="preserve">&lt;0.001</w:t>
             </w:r>
           </w:p>
         </w:tc>
@@ -2849,6 +2871,7 @@
           <w:p>
             <w:pPr>
               <w:pStyle w:val="Compact"/>
+              <w:jc w:val="center"/>
             </w:pPr>
             <w:r>
               <w:t xml:space="preserve">n/a</w:t>
@@ -2860,6 +2883,7 @@
           <w:p>
             <w:pPr>
               <w:pStyle w:val="Compact"/>
+              <w:jc w:val="center"/>
             </w:pPr>
             <w:r>
               <w:t xml:space="preserve">0.96</w:t>
@@ -2871,6 +2895,7 @@
           <w:p>
             <w:pPr>
               <w:pStyle w:val="Compact"/>
+              <w:jc w:val="center"/>
             </w:pPr>
             <w:r>
               <w:t xml:space="preserve">0.001</w:t>
@@ -2899,6 +2924,7 @@
           <w:p>
             <w:pPr>
               <w:pStyle w:val="Compact"/>
+              <w:jc w:val="center"/>
             </w:pPr>
             <w:r>
               <w:rPr>
@@ -2914,6 +2940,7 @@
           <w:p>
             <w:pPr>
               <w:pStyle w:val="Compact"/>
+              <w:jc w:val="center"/>
             </w:pPr>
             <w:r>
               <w:rPr>
@@ -2929,13 +2956,14 @@
           <w:p>
             <w:pPr>
               <w:pStyle w:val="Compact"/>
+              <w:jc w:val="center"/>
             </w:pPr>
             <w:r>
               <w:rPr>
                 <w:b/>
                 <w:bCs/>
               </w:rPr>
-              <w:t xml:space="preserve">&lt; 0.001</w:t>
+              <w:t xml:space="preserve">&lt;0.001</w:t>
             </w:r>
           </w:p>
         </w:tc>
@@ -2957,6 +2985,7 @@
           <w:p>
             <w:pPr>
               <w:pStyle w:val="Compact"/>
+              <w:jc w:val="center"/>
             </w:pPr>
             <w:r>
               <w:t xml:space="preserve">n/a</w:t>
@@ -2968,6 +2997,7 @@
           <w:p>
             <w:pPr>
               <w:pStyle w:val="Compact"/>
+              <w:jc w:val="center"/>
             </w:pPr>
             <w:r>
               <w:t xml:space="preserve">1.33</w:t>
@@ -2979,9 +3009,10 @@
           <w:p>
             <w:pPr>
               <w:pStyle w:val="Compact"/>
-            </w:pPr>
-            <w:r>
-              <w:t xml:space="preserve">&lt; 0.001</w:t>
+              <w:jc w:val="center"/>
+            </w:pPr>
+            <w:r>
+              <w:t xml:space="preserve">&lt;0.001</w:t>
             </w:r>
           </w:p>
         </w:tc>
@@ -3002,7 +3033,7 @@
         <w:t xml:space="preserve"> </w:t>
       </w:r>
       <w:r>
-        <w:t xml:space="preserve">Annual sling workforce dynamics (newly observable surgeons; two-year washout). Entrants were absent in both prior observable years; exiting surgeons were absent in both subsequent observable years. Entrant/continuing counts are undefined for the first two years and exiting counts for the last two.</w:t>
+        <w:t xml:space="preserve">Annual sling workforce dynamics using a two-year washout. Entrants were absent in both prior observable years; apparent exits were absent in both subsequent observable years. Entrant and continuing counts are undefined for the first two years, and exit counts are undefined for the last two years.</w:t>
       </w:r>
     </w:p>
     <w:tbl>
@@ -3013,13 +3044,13 @@
         <w:tblLook w:firstRow="1" w:lastRow="0" w:firstColumn="0" w:lastColumn="0" w:noHBand="0" w:noVBand="0" w:val="0020"/>
       </w:tblPr>
       <w:tblGrid>
-        <w:gridCol w:w="516"/>
-        <w:gridCol w:w="946"/>
-        <w:gridCol w:w="860"/>
-        <w:gridCol w:w="946"/>
-        <w:gridCol w:w="774"/>
-        <w:gridCol w:w="1893"/>
-        <w:gridCol w:w="1980"/>
+        <w:gridCol w:w="505"/>
+        <w:gridCol w:w="1011"/>
+        <w:gridCol w:w="842"/>
+        <w:gridCol w:w="1011"/>
+        <w:gridCol w:w="758"/>
+        <w:gridCol w:w="1853"/>
+        <w:gridCol w:w="1937"/>
       </w:tblGrid>
       <w:tr>
         <w:trPr>
@@ -3030,6 +3061,7 @@
           <w:p>
             <w:pPr>
               <w:pStyle w:val="Compact"/>
+              <w:jc w:val="center"/>
             </w:pPr>
             <w:r>
               <w:t xml:space="preserve">Year</w:t>
@@ -3041,6 +3073,7 @@
           <w:p>
             <w:pPr>
               <w:pStyle w:val="Compact"/>
+              <w:jc w:val="center"/>
             </w:pPr>
             <w:r>
               <w:t xml:space="preserve">Observable</w:t>
@@ -3052,6 +3085,7 @@
           <w:p>
             <w:pPr>
               <w:pStyle w:val="Compact"/>
+              <w:jc w:val="center"/>
             </w:pPr>
             <w:r>
               <w:t xml:space="preserve">Entrants</w:t>
@@ -3063,6 +3097,7 @@
           <w:p>
             <w:pPr>
               <w:pStyle w:val="Compact"/>
+              <w:jc w:val="center"/>
             </w:pPr>
             <w:r>
               <w:t xml:space="preserve">Continuing</w:t>
@@ -3074,6 +3109,7 @@
           <w:p>
             <w:pPr>
               <w:pStyle w:val="Compact"/>
+              <w:jc w:val="center"/>
             </w:pPr>
             <w:r>
               <w:t xml:space="preserve">Exiting</w:t>
@@ -3085,6 +3121,7 @@
           <w:p>
             <w:pPr>
               <w:pStyle w:val="Compact"/>
+              <w:jc w:val="center"/>
             </w:pPr>
             <w:r>
               <w:t xml:space="preserve">% volume by entrants</w:t>
@@ -3096,6 +3133,7 @@
           <w:p>
             <w:pPr>
               <w:pStyle w:val="Compact"/>
+              <w:jc w:val="center"/>
             </w:pPr>
             <w:r>
               <w:t xml:space="preserve">Median entrant volume</w:t>
@@ -3109,6 +3147,7 @@
           <w:p>
             <w:pPr>
               <w:pStyle w:val="Compact"/>
+              <w:jc w:val="center"/>
             </w:pPr>
             <w:r>
               <w:t xml:space="preserve">2013</w:t>
@@ -3120,6 +3159,7 @@
           <w:p>
             <w:pPr>
               <w:pStyle w:val="Compact"/>
+              <w:jc w:val="center"/>
             </w:pPr>
             <w:r>
               <w:t xml:space="preserve">812</w:t>
@@ -3131,6 +3171,7 @@
           <w:p>
             <w:pPr>
               <w:pStyle w:val="Compact"/>
+              <w:jc w:val="center"/>
             </w:pPr>
             <w:r>
               <w:t xml:space="preserve">n/a</w:t>
@@ -3142,6 +3183,7 @@
           <w:p>
             <w:pPr>
               <w:pStyle w:val="Compact"/>
+              <w:jc w:val="center"/>
             </w:pPr>
             <w:r>
               <w:t xml:space="preserve">n/a</w:t>
@@ -3153,6 +3195,7 @@
           <w:p>
             <w:pPr>
               <w:pStyle w:val="Compact"/>
+              <w:jc w:val="center"/>
             </w:pPr>
             <w:r>
               <w:t xml:space="preserve">214</w:t>
@@ -3164,6 +3207,7 @@
           <w:p>
             <w:pPr>
               <w:pStyle w:val="Compact"/>
+              <w:jc w:val="center"/>
             </w:pPr>
             <w:r>
               <w:t xml:space="preserve">n/a</w:t>
@@ -3175,6 +3219,7 @@
           <w:p>
             <w:pPr>
               <w:pStyle w:val="Compact"/>
+              <w:jc w:val="center"/>
             </w:pPr>
             <w:r>
               <w:t xml:space="preserve">n/a</w:t>
@@ -3188,6 +3233,7 @@
           <w:p>
             <w:pPr>
               <w:pStyle w:val="Compact"/>
+              <w:jc w:val="center"/>
             </w:pPr>
             <w:r>
               <w:t xml:space="preserve">2014</w:t>
@@ -3199,6 +3245,7 @@
           <w:p>
             <w:pPr>
               <w:pStyle w:val="Compact"/>
+              <w:jc w:val="center"/>
             </w:pPr>
             <w:r>
               <w:t xml:space="preserve">685</w:t>
@@ -3210,6 +3257,7 @@
           <w:p>
             <w:pPr>
               <w:pStyle w:val="Compact"/>
+              <w:jc w:val="center"/>
             </w:pPr>
             <w:r>
               <w:t xml:space="preserve">n/a</w:t>
@@ -3221,6 +3269,7 @@
           <w:p>
             <w:pPr>
               <w:pStyle w:val="Compact"/>
+              <w:jc w:val="center"/>
             </w:pPr>
             <w:r>
               <w:t xml:space="preserve">n/a</w:t>
@@ -3232,6 +3281,7 @@
           <w:p>
             <w:pPr>
               <w:pStyle w:val="Compact"/>
+              <w:jc w:val="center"/>
             </w:pPr>
             <w:r>
               <w:t xml:space="preserve">164</w:t>
@@ -3243,6 +3293,7 @@
           <w:p>
             <w:pPr>
               <w:pStyle w:val="Compact"/>
+              <w:jc w:val="center"/>
             </w:pPr>
             <w:r>
               <w:t xml:space="preserve">n/a</w:t>
@@ -3254,6 +3305,7 @@
           <w:p>
             <w:pPr>
               <w:pStyle w:val="Compact"/>
+              <w:jc w:val="center"/>
             </w:pPr>
             <w:r>
               <w:t xml:space="preserve">n/a</w:t>
@@ -3267,6 +3319,7 @@
           <w:p>
             <w:pPr>
               <w:pStyle w:val="Compact"/>
+              <w:jc w:val="center"/>
             </w:pPr>
             <w:r>
               <w:t xml:space="preserve">2015</w:t>
@@ -3278,6 +3331,7 @@
           <w:p>
             <w:pPr>
               <w:pStyle w:val="Compact"/>
+              <w:jc w:val="center"/>
             </w:pPr>
             <w:r>
               <w:t xml:space="preserve">655</w:t>
@@ -3289,6 +3343,7 @@
           <w:p>
             <w:pPr>
               <w:pStyle w:val="Compact"/>
+              <w:jc w:val="center"/>
             </w:pPr>
             <w:r>
               <w:t xml:space="preserve">127</w:t>
@@ -3300,6 +3355,7 @@
           <w:p>
             <w:pPr>
               <w:pStyle w:val="Compact"/>
+              <w:jc w:val="center"/>
             </w:pPr>
             <w:r>
               <w:t xml:space="preserve">528</w:t>
@@ -3311,6 +3367,7 @@
           <w:p>
             <w:pPr>
               <w:pStyle w:val="Compact"/>
+              <w:jc w:val="center"/>
             </w:pPr>
             <w:r>
               <w:t xml:space="preserve">136</w:t>
@@ -3322,6 +3379,7 @@
           <w:p>
             <w:pPr>
               <w:pStyle w:val="Compact"/>
+              <w:jc w:val="center"/>
             </w:pPr>
             <w:r>
               <w:t xml:space="preserve">14.2%</w:t>
@@ -3333,6 +3391,7 @@
           <w:p>
             <w:pPr>
               <w:pStyle w:val="Compact"/>
+              <w:jc w:val="center"/>
             </w:pPr>
             <w:r>
               <w:t xml:space="preserve">13</w:t>
@@ -3346,6 +3405,7 @@
           <w:p>
             <w:pPr>
               <w:pStyle w:val="Compact"/>
+              <w:jc w:val="center"/>
             </w:pPr>
             <w:r>
               <w:t xml:space="preserve">2016</w:t>
@@ -3357,6 +3417,7 @@
           <w:p>
             <w:pPr>
               <w:pStyle w:val="Compact"/>
+              <w:jc w:val="center"/>
             </w:pPr>
             <w:r>
               <w:t xml:space="preserve">701</w:t>
@@ -3368,6 +3429,7 @@
           <w:p>
             <w:pPr>
               <w:pStyle w:val="Compact"/>
+              <w:jc w:val="center"/>
             </w:pPr>
             <w:r>
               <w:t xml:space="preserve">158</w:t>
@@ -3379,6 +3441,7 @@
           <w:p>
             <w:pPr>
               <w:pStyle w:val="Compact"/>
+              <w:jc w:val="center"/>
             </w:pPr>
             <w:r>
               <w:t xml:space="preserve">543</w:t>
@@ -3390,6 +3453,7 @@
           <w:p>
             <w:pPr>
               <w:pStyle w:val="Compact"/>
+              <w:jc w:val="center"/>
             </w:pPr>
             <w:r>
               <w:t xml:space="preserve">219</w:t>
@@ -3401,6 +3465,7 @@
           <w:p>
             <w:pPr>
               <w:pStyle w:val="Compact"/>
+              <w:jc w:val="center"/>
             </w:pPr>
             <w:r>
               <w:t xml:space="preserve">15.3%</w:t>
@@ -3412,6 +3477,7 @@
           <w:p>
             <w:pPr>
               <w:pStyle w:val="Compact"/>
+              <w:jc w:val="center"/>
             </w:pPr>
             <w:r>
               <w:t xml:space="preserve">13</w:t>
@@ -3425,6 +3491,7 @@
           <w:p>
             <w:pPr>
               <w:pStyle w:val="Compact"/>
+              <w:jc w:val="center"/>
             </w:pPr>
             <w:r>
               <w:t xml:space="preserve">2018</w:t>
@@ -3436,6 +3503,7 @@
           <w:p>
             <w:pPr>
               <w:pStyle w:val="Compact"/>
+              <w:jc w:val="center"/>
             </w:pPr>
             <w:r>
               <w:t xml:space="preserve">672</w:t>
@@ -3447,6 +3515,7 @@
           <w:p>
             <w:pPr>
               <w:pStyle w:val="Compact"/>
+              <w:jc w:val="center"/>
             </w:pPr>
             <w:r>
               <w:t xml:space="preserve">184</w:t>
@@ -3458,6 +3527,7 @@
           <w:p>
             <w:pPr>
               <w:pStyle w:val="Compact"/>
+              <w:jc w:val="center"/>
             </w:pPr>
             <w:r>
               <w:t xml:space="preserve">488</w:t>
@@ -3469,6 +3539,7 @@
           <w:p>
             <w:pPr>
               <w:pStyle w:val="Compact"/>
+              <w:jc w:val="center"/>
             </w:pPr>
             <w:r>
               <w:t xml:space="preserve">154</w:t>
@@ -3480,6 +3551,7 @@
           <w:p>
             <w:pPr>
               <w:pStyle w:val="Compact"/>
+              <w:jc w:val="center"/>
             </w:pPr>
             <w:r>
               <w:t xml:space="preserve">20.6%</w:t>
@@ -3491,6 +3563,7 @@
           <w:p>
             <w:pPr>
               <w:pStyle w:val="Compact"/>
+              <w:jc w:val="center"/>
             </w:pPr>
             <w:r>
               <w:t xml:space="preserve">14</w:t>
@@ -3504,6 +3577,7 @@
           <w:p>
             <w:pPr>
               <w:pStyle w:val="Compact"/>
+              <w:jc w:val="center"/>
             </w:pPr>
             <w:r>
               <w:t xml:space="preserve">2019</w:t>
@@ -3515,6 +3589,7 @@
           <w:p>
             <w:pPr>
               <w:pStyle w:val="Compact"/>
+              <w:jc w:val="center"/>
             </w:pPr>
             <w:r>
               <w:t xml:space="preserve">650</w:t>
@@ -3526,6 +3601,7 @@
           <w:p>
             <w:pPr>
               <w:pStyle w:val="Compact"/>
+              <w:jc w:val="center"/>
             </w:pPr>
             <w:r>
               <w:t xml:space="preserve">122</w:t>
@@ -3537,6 +3613,7 @@
           <w:p>
             <w:pPr>
               <w:pStyle w:val="Compact"/>
+              <w:jc w:val="center"/>
             </w:pPr>
             <w:r>
               <w:t xml:space="preserve">528</w:t>
@@ -3548,6 +3625,7 @@
           <w:p>
             <w:pPr>
               <w:pStyle w:val="Compact"/>
+              <w:jc w:val="center"/>
             </w:pPr>
             <w:r>
               <w:t xml:space="preserve">230</w:t>
@@ -3559,6 +3637,7 @@
           <w:p>
             <w:pPr>
               <w:pStyle w:val="Compact"/>
+              <w:jc w:val="center"/>
             </w:pPr>
             <w:r>
               <w:t xml:space="preserve">12.4%</w:t>
@@ -3570,6 +3649,7 @@
           <w:p>
             <w:pPr>
               <w:pStyle w:val="Compact"/>
+              <w:jc w:val="center"/>
             </w:pPr>
             <w:r>
               <w:t xml:space="preserve">13</w:t>
@@ -3583,6 +3663,7 @@
           <w:p>
             <w:pPr>
               <w:pStyle w:val="Compact"/>
+              <w:jc w:val="center"/>
             </w:pPr>
             <w:r>
               <w:t xml:space="preserve">2020</w:t>
@@ -3594,6 +3675,7 @@
           <w:p>
             <w:pPr>
               <w:pStyle w:val="Compact"/>
+              <w:jc w:val="center"/>
             </w:pPr>
             <w:r>
               <w:t xml:space="preserve">445</w:t>
@@ -3605,6 +3687,7 @@
           <w:p>
             <w:pPr>
               <w:pStyle w:val="Compact"/>
+              <w:jc w:val="center"/>
             </w:pPr>
             <w:r>
               <w:t xml:space="preserve">48</w:t>
@@ -3616,6 +3699,7 @@
           <w:p>
             <w:pPr>
               <w:pStyle w:val="Compact"/>
+              <w:jc w:val="center"/>
             </w:pPr>
             <w:r>
               <w:t xml:space="preserve">397</w:t>
@@ -3627,6 +3711,7 @@
           <w:p>
             <w:pPr>
               <w:pStyle w:val="Compact"/>
+              <w:jc w:val="center"/>
             </w:pPr>
             <w:r>
               <w:t xml:space="preserve">66</w:t>
@@ -3638,6 +3723,7 @@
           <w:p>
             <w:pPr>
               <w:pStyle w:val="Compact"/>
+              <w:jc w:val="center"/>
             </w:pPr>
             <w:r>
               <w:t xml:space="preserve">7.4%</w:t>
@@ -3649,6 +3735,7 @@
           <w:p>
             <w:pPr>
               <w:pStyle w:val="Compact"/>
+              <w:jc w:val="center"/>
             </w:pPr>
             <w:r>
               <w:t xml:space="preserve">13</w:t>
@@ -3662,6 +3749,7 @@
           <w:p>
             <w:pPr>
               <w:pStyle w:val="Compact"/>
+              <w:jc w:val="center"/>
             </w:pPr>
             <w:r>
               <w:t xml:space="preserve">2021</w:t>
@@ -3673,6 +3761,7 @@
           <w:p>
             <w:pPr>
               <w:pStyle w:val="Compact"/>
+              <w:jc w:val="center"/>
             </w:pPr>
             <w:r>
               <w:t xml:space="preserve">458</w:t>
@@ -3684,6 +3773,7 @@
           <w:p>
             <w:pPr>
               <w:pStyle w:val="Compact"/>
+              <w:jc w:val="center"/>
             </w:pPr>
             <w:r>
               <w:t xml:space="preserve">77</w:t>
@@ -3695,6 +3785,7 @@
           <w:p>
             <w:pPr>
               <w:pStyle w:val="Compact"/>
+              <w:jc w:val="center"/>
             </w:pPr>
             <w:r>
               <w:t xml:space="preserve">381</w:t>
@@ -3706,6 +3797,7 @@
           <w:p>
             <w:pPr>
               <w:pStyle w:val="Compact"/>
+              <w:jc w:val="center"/>
             </w:pPr>
             <w:r>
               <w:t xml:space="preserve">81</w:t>
@@ -3717,6 +3809,7 @@
           <w:p>
             <w:pPr>
               <w:pStyle w:val="Compact"/>
+              <w:jc w:val="center"/>
             </w:pPr>
             <w:r>
               <w:t xml:space="preserve">12.1%</w:t>
@@ -3728,6 +3821,7 @@
           <w:p>
             <w:pPr>
               <w:pStyle w:val="Compact"/>
+              <w:jc w:val="center"/>
             </w:pPr>
             <w:r>
               <w:t xml:space="preserve">13</w:t>
@@ -3741,6 +3835,7 @@
           <w:p>
             <w:pPr>
               <w:pStyle w:val="Compact"/>
+              <w:jc w:val="center"/>
             </w:pPr>
             <w:r>
               <w:t xml:space="preserve">2022</w:t>
@@ -3752,6 +3847,7 @@
           <w:p>
             <w:pPr>
               <w:pStyle w:val="Compact"/>
+              <w:jc w:val="center"/>
             </w:pPr>
             <w:r>
               <w:t xml:space="preserve">562</w:t>
@@ -3763,6 +3859,7 @@
           <w:p>
             <w:pPr>
               <w:pStyle w:val="Compact"/>
+              <w:jc w:val="center"/>
             </w:pPr>
             <w:r>
               <w:t xml:space="preserve">168</w:t>
@@ -3774,6 +3871,7 @@
           <w:p>
             <w:pPr>
               <w:pStyle w:val="Compact"/>
+              <w:jc w:val="center"/>
             </w:pPr>
             <w:r>
               <w:t xml:space="preserve">394</w:t>
@@ -3785,6 +3883,7 @@
           <w:p>
             <w:pPr>
               <w:pStyle w:val="Compact"/>
+              <w:jc w:val="center"/>
             </w:pPr>
             <w:r>
               <w:t xml:space="preserve">n/a</w:t>
@@ -3796,6 +3895,7 @@
           <w:p>
             <w:pPr>
               <w:pStyle w:val="Compact"/>
+              <w:jc w:val="center"/>
             </w:pPr>
             <w:r>
               <w:t xml:space="preserve">22.5%</w:t>
@@ -3807,6 +3907,7 @@
           <w:p>
             <w:pPr>
               <w:pStyle w:val="Compact"/>
+              <w:jc w:val="center"/>
             </w:pPr>
             <w:r>
               <w:t xml:space="preserve">14</w:t>
@@ -3820,6 +3921,7 @@
           <w:p>
             <w:pPr>
               <w:pStyle w:val="Compact"/>
+              <w:jc w:val="center"/>
             </w:pPr>
             <w:r>
               <w:t xml:space="preserve">2023</w:t>
@@ -3831,6 +3933,7 @@
           <w:p>
             <w:pPr>
               <w:pStyle w:val="Compact"/>
+              <w:jc w:val="center"/>
             </w:pPr>
             <w:r>
               <w:t xml:space="preserve">562</w:t>
@@ -3842,6 +3945,7 @@
           <w:p>
             <w:pPr>
               <w:pStyle w:val="Compact"/>
+              <w:jc w:val="center"/>
             </w:pPr>
             <w:r>
               <w:t xml:space="preserve">126</w:t>
@@ -3853,6 +3957,7 @@
           <w:p>
             <w:pPr>
               <w:pStyle w:val="Compact"/>
+              <w:jc w:val="center"/>
             </w:pPr>
             <w:r>
               <w:t xml:space="preserve">436</w:t>
@@ -3864,6 +3969,7 @@
           <w:p>
             <w:pPr>
               <w:pStyle w:val="Compact"/>
+              <w:jc w:val="center"/>
             </w:pPr>
             <w:r>
               <w:t xml:space="preserve">n/a</w:t>
@@ -3875,6 +3981,7 @@
           <w:p>
             <w:pPr>
               <w:pStyle w:val="Compact"/>
+              <w:jc w:val="center"/>
             </w:pPr>
             <w:r>
               <w:t xml:space="preserve">15.7%</w:t>
@@ -3886,6 +3993,7 @@
           <w:p>
             <w:pPr>
               <w:pStyle w:val="Compact"/>
+              <w:jc w:val="center"/>
             </w:pPr>
             <w:r>
               <w:t xml:space="preserve">13</w:t>
@@ -3899,7 +4007,7 @@
         <w:pStyle w:val="BodyText"/>
       </w:pPr>
       <w:r>
-        <w:t xml:space="preserve">Entrants by specialty over the period: URPS 440, urology 373, General OB/GYN 189, MIGS 8.</w:t>
+        <w:t xml:space="preserve">Entrants by specialty: URPS, 440; urology, 373; General OB/GYN, 189; MIGS, 8.</w:t>
       </w:r>
     </w:p>
     <w:p>
@@ -3934,7 +4042,7 @@
         <w:t xml:space="preserve"> </w:t>
       </w:r>
       <w:r>
-        <w:t xml:space="preserve">Market share of midurethral sling procedures (CPT 57288) by specialty group, Medicare PUF 2013–2023 (2017 excluded). The URPS/gynecologic share rose significantly under every classification scheme; fixed-membership classification (+0.84 pp/year, gynecologic share 60.8% → 70.1%) and time-varying certification-gated classification (+2.28 pp/year, URPS share 46.3% → 74.2%) bracket the true trend.</w:t>
+        <w:t xml:space="preserve">Market share of midurethral sling procedures (CPT 57288) by specialty, Medicare PUF 2013–2023 (2017 excluded). The URPS or gynecologic share increased under every classification scheme. Fixed membership (gynecologic share 60.8% to 70.1%; +0.84 percentage points/year) and certification-gated classification (URPS share 46.3% to 74.2%; +2.28 percentage points/year) bound the likely trend.</w:t>
       </w:r>
     </w:p>
     <w:p>
@@ -3952,7 +4060,7 @@
         <w:t xml:space="preserve"> </w:t>
       </w:r>
       <w:r>
-        <w:t xml:space="preserve">Distribution of annual midurethral sling volume by specialty group (violin + box plots, log scale). The minimum observable volume is 11 due to CMS cell suppression.</w:t>
+        <w:t xml:space="preserve">Annual midurethral sling volume by specialty (violin and box plots; logarithmic scale). The minimum observable volume is 11 because of CMS cell suppression.</w:t>
       </w:r>
     </w:p>
     <w:p>
@@ -3970,7 +4078,7 @@
         <w:t xml:space="preserve"> </w:t>
       </w:r>
       <w:r>
-        <w:t xml:space="preserve">Lorenz curves of procedural concentration by specialty. Curves farther from the diagonal indicate greater concentration; URPS (Gini 0.51) is closest to equality, MIGS (0.60) farthest.</w:t>
+        <w:t xml:space="preserve">Lorenz curves of procedural concentration by specialty. Greater distance from the diagonal indicates greater concentration. URPS (Gini 0.51) is closest to equality; MIGS (0.60) is farthest.</w:t>
       </w:r>
     </w:p>
     <w:p>
@@ -3988,7 +4096,7 @@
         <w:t xml:space="preserve"> </w:t>
       </w:r>
       <w:r>
-        <w:t xml:space="preserve">Annual procedural concentration by specialty (Gini, HHI, top-20% and bottom-50% shares) per calendar year; within-year concentration is low and stable. MIGS excluded from these panels (too few surgeons/year for a stable estimate).</w:t>
+        <w:t xml:space="preserve">Annual concentration by specialty, measured by Gini, HHI, top-20% share, and bottom-50% share. Within-year concentration was low and stable. MIGS was excluded because too few surgeons were observed each year for stable estimates.</w:t>
       </w:r>
     </w:p>
     <w:p>
@@ -4006,7 +4114,7 @@
         <w:t xml:space="preserve"> </w:t>
       </w:r>
       <w:r>
-        <w:t xml:space="preserve">Observable surgeons and total procedure volume per year by specialty; the surgeon-pool decline is concentrated in urology and General OB/GYN.</w:t>
+        <w:t xml:space="preserve">Observable surgeons and total procedure volume by year and specialty. The decline in the surgeon pool was concentrated in urology and General OB/GYN.</w:t>
       </w:r>
     </w:p>
     <w:bookmarkEnd w:id="31"/>

</xml_diff>

<commit_message>
Replace repository links with availability on request
The data-availability statement and the Methods reproducibility sentence both
pointed at the project repository. Point both at the corresponding author on
reasonable request instead, and drop the parenthetical about making the
repository public with a tagged release at acceptance.

Re-rendered; no repository references remain in the source or the docx.

Co-Authored-By: Claude Opus 5 (1M context) <noreply@anthropic.com>
</commit_message>
<xml_diff>
--- a/output/manuscript.docx
+++ b/output/manuscript.docx
@@ -228,31 +228,7 @@
         <w:t xml:space="preserve"> </w:t>
       </w:r>
       <w:r>
-        <w:t xml:space="preserve">The analytic code and non-restricted derived outputs, together with this manuscript source, are available at</w:t>
-      </w:r>
-      <w:r>
-        <w:t xml:space="preserve"> </w:t>
-      </w:r>
-      <w:hyperlink r:id="rId9">
-        <w:r>
-          <w:rPr>
-            <w:rStyle w:val="Hyperlink"/>
-          </w:rPr>
-          <w:t xml:space="preserve">https://github.com/mufflyt/sling-volume-patterns</w:t>
-        </w:r>
-      </w:hyperlink>
-      <w:r>
-        <w:t xml:space="preserve"> </w:t>
-      </w:r>
-      <w:r>
-        <w:rPr>
-          <w:i/>
-          <w:iCs/>
-        </w:rPr>
-        <w:t xml:space="preserve">(repository to be made public, with a tagged release, at acceptance)</w:t>
-      </w:r>
-      <w:r>
-        <w:t xml:space="preserve">. The CMS Medicare Physician and Other Practitioners Public Use File and the CMS Program Statistics Original Medicare Enrollment tables are publicly available from data.cms.gov. The ABOG and ABU board-certification rosters used for specialty linkage are subject to source-specific permissions and may not be redistributable; provenance and derived crosswalk documentation are provided in the repository.</w:t>
+        <w:t xml:space="preserve">The analytic code and non-restricted derived outputs, together with this manuscript source, are available from the corresponding author on reasonable request. The CMS Medicare Physician and Other Practitioners Public Use File and the CMS Program Statistics Original Medicare Enrollment tables are publicly available from data.cms.gov. The ABOG and ABU board-certification rosters used for specialty linkage are subject to source-specific permissions and may not be redistributable; provenance and derived crosswalk documentation are available with the analytic code.</w:t>
       </w:r>
     </w:p>
     <w:p>
@@ -280,7 +256,7 @@
         </w:pict>
       </w:r>
     </w:p>
-    <w:bookmarkStart w:id="10" w:name="abstract"/>
+    <w:bookmarkStart w:id="9" w:name="abstract"/>
     <w:p>
       <w:pPr>
         <w:pStyle w:val="Heading2"/>
@@ -386,8 +362,8 @@
         </w:pict>
       </w:r>
     </w:p>
-    <w:bookmarkEnd w:id="10"/>
-    <w:bookmarkStart w:id="11" w:name="simply-stated"/>
+    <w:bookmarkEnd w:id="9"/>
+    <w:bookmarkStart w:id="10" w:name="simply-stated"/>
     <w:p>
       <w:pPr>
         <w:pStyle w:val="Heading2"/>
@@ -404,8 +380,8 @@
         <w:t xml:space="preserve">Sling surgery treats stress urinary incontinence, which causes urine leakage with coughing, laughing, or exercise. We studied traditional Medicare billing records from 2013 through 2023 to learn which doctors performed these operations and how the work was shared. Urogynecologists performed most of the reported surgeries, and their share increased over time. The total number of reported surgeries fell. Some of that decline occurred because fewer people were enrolled in traditional Medicare, although a smaller true decline may remain. The work stayed spread across many surgeons rather than becoming centered in a small group. These data cannot show which specialty has the best outcomes or who should be allowed to perform the operation.</w:t>
       </w:r>
     </w:p>
-    <w:bookmarkEnd w:id="11"/>
-    <w:bookmarkStart w:id="12" w:name="why-this-matters"/>
+    <w:bookmarkEnd w:id="10"/>
+    <w:bookmarkStart w:id="11" w:name="why-this-matters"/>
     <w:p>
       <w:pPr>
         <w:pStyle w:val="Heading2"/>
@@ -429,8 +405,8 @@
         </w:pict>
       </w:r>
     </w:p>
-    <w:bookmarkEnd w:id="12"/>
-    <w:bookmarkStart w:id="13" w:name="introduction"/>
+    <w:bookmarkEnd w:id="11"/>
+    <w:bookmarkStart w:id="12" w:name="introduction"/>
     <w:p>
       <w:pPr>
         <w:pStyle w:val="Heading2"/>
@@ -537,8 +513,8 @@
         <w:t xml:space="preserve">We therefore examined specialty distribution, annual clinician volume, and surgeon-level concentration among clinicians reporting CPT 57288 services in fee-for-service Medicare from 2013 through 2023. We also evaluated changes in each specialty’s share of observable services.</w:t>
       </w:r>
     </w:p>
-    <w:bookmarkEnd w:id="13"/>
-    <w:bookmarkStart w:id="18" w:name="materials-and-methods"/>
+    <w:bookmarkEnd w:id="12"/>
+    <w:bookmarkStart w:id="17" w:name="materials-and-methods"/>
     <w:p>
       <w:pPr>
         <w:pStyle w:val="Heading2"/>
@@ -547,7 +523,7 @@
         <w:t xml:space="preserve">Materials and Methods</w:t>
       </w:r>
     </w:p>
-    <w:bookmarkStart w:id="14" w:name="study-design-and-data-source"/>
+    <w:bookmarkStart w:id="13" w:name="study-design-and-data-source"/>
     <w:p>
       <w:pPr>
         <w:pStyle w:val="Heading3"/>
@@ -572,8 +548,8 @@
         <w:t xml:space="preserve">Before analysis, we verified all 11 annual PUF releases against the CMS file specifications and confirmed that each expected year was complete.</w:t>
       </w:r>
     </w:p>
-    <w:bookmarkEnd w:id="14"/>
-    <w:bookmarkStart w:id="15" w:name="specialty-classification"/>
+    <w:bookmarkEnd w:id="13"/>
+    <w:bookmarkStart w:id="14" w:name="specialty-classification"/>
     <w:p>
       <w:pPr>
         <w:pStyle w:val="Heading3"/>
@@ -639,8 +615,8 @@
         <w:t xml:space="preserve">Modal and ever-URPS/MIGS classifications were additional sensitivity analyses. Urology-pathway URPS status remained fixed because the ABU roster did not include a subspecialty certification date. For pooled distribution, concentration, and volume analyses (Tables 1–3), each physician was assigned to the eventual combined specialty group.</w:t>
       </w:r>
     </w:p>
-    <w:bookmarkEnd w:id="15"/>
-    <w:bookmarkStart w:id="16" w:name="cms-data-suppression"/>
+    <w:bookmarkEnd w:id="14"/>
+    <w:bookmarkStart w:id="15" w:name="cms-data-suppression"/>
     <w:p>
       <w:pPr>
         <w:pStyle w:val="Heading3"/>
@@ -657,8 +633,8 @@
         <w:t xml:space="preserve">CMS suppresses provider-service records when a clinician treats fewer than 11 Medicare beneficiaries for a given code in a calendar year. Every observable physician-year in this study therefore represents at least 11 beneficiaries with CPT 57288. Clinicians below that threshold are not visible, so the number and volume of low-volume surgeons cannot be recovered from the PUF. Because suppression may affect the Gini coefficient and HHI differently, full-market concentration is not identified. We therefore report bootstrap confidence intervals and a sensitivity analysis that adds hypothetical suppressed low-volume providers before recalculating concentration.</w:t>
       </w:r>
     </w:p>
-    <w:bookmarkEnd w:id="16"/>
-    <w:bookmarkStart w:id="17" w:name="X46ca734e3ebd5db0ec3b7b3638b7437bae62243"/>
+    <w:bookmarkEnd w:id="15"/>
+    <w:bookmarkStart w:id="16" w:name="X46ca734e3ebd5db0ec3b7b3638b7437bae62243"/>
     <w:p>
       <w:pPr>
         <w:pStyle w:val="Heading3"/>
@@ -728,26 +704,12 @@
         <w:pStyle w:val="BodyText"/>
       </w:pPr>
       <w:r>
-        <w:t xml:space="preserve">Analyses were performed in R version 4.4, with package versions locked through renv. The complete analytic pipeline is available at</w:t>
-      </w:r>
-      <w:r>
-        <w:t xml:space="preserve"> </w:t>
-      </w:r>
-      <w:hyperlink r:id="rId9">
-        <w:r>
-          <w:rPr>
-            <w:rStyle w:val="Hyperlink"/>
-          </w:rPr>
-          <w:t xml:space="preserve">https://github.com/mufflyt/sling-volume-patterns</w:t>
-        </w:r>
-      </w:hyperlink>
-      <w:r>
-        <w:t xml:space="preserve">.</w:t>
+        <w:t xml:space="preserve">Analyses were performed in R version 4.4, with package versions locked through renv. The complete analytic pipeline is available from the corresponding author on reasonable request.</w:t>
       </w:r>
     </w:p>
+    <w:bookmarkEnd w:id="16"/>
     <w:bookmarkEnd w:id="17"/>
-    <w:bookmarkEnd w:id="18"/>
-    <w:bookmarkStart w:id="23" w:name="results"/>
+    <w:bookmarkStart w:id="22" w:name="results"/>
     <w:p>
       <w:pPr>
         <w:pStyle w:val="Heading2"/>
@@ -756,7 +718,7 @@
         <w:t xml:space="preserve">Results</w:t>
       </w:r>
     </w:p>
-    <w:bookmarkStart w:id="19" w:name="cohort-and-annual-volume"/>
+    <w:bookmarkStart w:id="18" w:name="cohort-and-annual-volume"/>
     <w:p>
       <w:pPr>
         <w:pStyle w:val="Heading3"/>
@@ -781,8 +743,8 @@
         <w:t xml:space="preserve">The observed count of reported services fell from 14,939 in 2013 to 10,349 in 2023 (-30.7%). Over the same period the female Part B fee-for-service population contracted from 18.35 million to 15.65 million beneficiaries (-14.7%). In a Poisson model of the annual service count with log fee-for-service enrollment as an offset and a 2020 indicator, the observable utilization rate declined -2.4% per year (rate ratio 0.976, 95% CI 0.955-0.997; about -21.7% over the decade), but with only 11 annual observations and the pandemic interruption this trend was not statistically robust (dispersion-adjusted p = 0.060). The rate reached a low of 45.5 per 100,000 in 2020, consistent with pandemic-related deferral of elective surgery, then partially recovered. The number of observable surgeons also fell, from 742 to 466. A clinically meaningful decline in observable utilization thus remains possible, but the raw service-count drop overstates it because much of that drop reflects the shrinking fee-for-service denominator; because CMS suppresses low-volume physician-years, this is an observable-services rate, not the total national fee-for-service rate.</w:t>
       </w:r>
     </w:p>
-    <w:bookmarkEnd w:id="19"/>
-    <w:bookmarkStart w:id="20" w:name="specialty-distribution-and-trends"/>
+    <w:bookmarkEnd w:id="18"/>
+    <w:bookmarkStart w:id="19" w:name="specialty-distribution-and-trends"/>
     <w:p>
       <w:pPr>
         <w:pStyle w:val="Heading3"/>
@@ -831,8 +793,8 @@
         <w:t xml:space="preserve">In the Poisson GEE clustered by NPI (reference = OB/GYN-pathway URPS; calendar year centered at 2018), adjusted annual volume at mid-study was lower than OB/GYN-pathway URPS for every other group, including urology-pathway URPS (RR 0.75 (0.66–0.84)), non-URPS urology (RR 0.70 (0.58–0.84)), other non-URPS OB/GYN (RR 0.60 (0.38–0.94)), and MIGS (RR 0.78 (0.47–1.31)) (Table 3). Annual volume was approximately 12% lower in 2020 (RR 0.87 (0.84–0.91); p &lt; 0.001). The specialty-by-year interaction showed that per-physician volume was essentially flat over time for the well-populated groups (OB/GYN-pathway URPS RR 0.999 (0.990-1.007), p = 0.794; urology-pathway URPS RR 0.988 (0.974-1.002), p = 0.091; non-URPS urology RR 0.986 (0.968-1.004), p = 0.132; other OB/GYN RR 0.996 (0.972-1.021), p = 0.764), increasing only for the 10-physician MIGS group (RR 1.086 (1.032-1.142); p = 0.002) (Table 3). A negative-binomial mixed model with a random intercept per NPI reproduced the direction but with attenuated magnitude (urology RR 0.78 (0.74–0.82), General OB/GYN RR 0.81 (0.77–0.85), 2020 RR 0.90 (0.87–0.93)); the attenuation is expected because the GEE estimates a population-averaged (marginal) rate ratio whereas the mixed model estimates a physician-conditional one. The one-observation-per-physician secondary analysis agreed (Kruskal-Wallis H = 96.3, df = 4, p &lt; 0.001); URPS volume exceeded urology and other OB/GYN in pairwise comparisons (p &lt; 0.001), with no significant URPS-MIGS difference. Because these models condition on the physician-year being observable above the CMS reporting threshold, the estimand is annual service volume among observable physician-years, not full-workforce practice volume; if non-URPS physicians more often fall below the threshold, the URPS volume advantage may be overstated.</w:t>
       </w:r>
     </w:p>
-    <w:bookmarkEnd w:id="20"/>
-    <w:bookmarkStart w:id="21" w:name="surgeon-volume-and-concentration"/>
+    <w:bookmarkEnd w:id="19"/>
+    <w:bookmarkStart w:id="20" w:name="surgeon-volume-and-concentration"/>
     <w:p>
       <w:pPr>
         <w:pStyle w:val="Heading3"/>
@@ -857,8 +819,8 @@
         <w:t xml:space="preserve">Pooled multi-year concentration was moderate: the Gini coefficient was 0.51 (95% CI 0.48-0.53) for OB/GYN-pathway URPS, 0.52 (95% CI 0.49-0.55) for non-URPS urology, and 0.56 (95% CI 0.52-0.60) for other non-URPS OB/GYN (Table 2). Bootstrap comparisons showed no difference between URPS and urology (difference -0.016 (95% CI -0.050 to +0.021)), whereas URPS was modestly less concentrated than other non-URPS OB/GYN (-0.056 (95% CI -0.097 to -0.010), confidence interval excluding zero). Normalized HHI values were near zero. The effective provider count represented 50% of OB/GYN-pathway URPS physicians, 42% of non-URPS urologists, and 33% of other non-URPS OB/GYN physicians, indicating broad distribution with somewhat greater inequality in the smaller groups. A sensitivity analysis that added hypothetical suppressed low-volume providers increased the Gini, particularly under the 50% scenario (Supplementary Table S8); it therefore supports the narrow conclusion that observable services were not dominated by a handful of surgeons, but not a precise estimate of full-market concentration. MIGS estimates were considered exploratory because only 10 physicians were identified.</w:t>
       </w:r>
     </w:p>
-    <w:bookmarkEnd w:id="21"/>
-    <w:bookmarkStart w:id="22" w:name="observable-participation-over-time"/>
+    <w:bookmarkEnd w:id="20"/>
+    <w:bookmarkStart w:id="21" w:name="observable-participation-over-time"/>
     <w:p>
       <w:pPr>
         <w:pStyle w:val="Heading3"/>
@@ -899,9 +861,9 @@
         <w:t xml:space="preserve">Observable surgeons and the URPS share by practice state are reported as an exploratory secondary analysis in Supplementary Table S7. Because state-by-sex fee-for-service denominators were not available and CMS suppression removes low-volume providers, we do not draw access conclusions from these counts; population-based geographic analysis is reserved for a separate access-focused study.</w:t>
       </w:r>
     </w:p>
+    <w:bookmarkEnd w:id="21"/>
     <w:bookmarkEnd w:id="22"/>
-    <w:bookmarkEnd w:id="23"/>
-    <w:bookmarkStart w:id="29" w:name="discussion"/>
+    <w:bookmarkStart w:id="28" w:name="discussion"/>
     <w:p>
       <w:pPr>
         <w:pStyle w:val="Heading2"/>
@@ -918,7 +880,7 @@
         <w:t xml:space="preserve">This analysis yielded three principal findings. First, URPS physicians, identified through either certification pathway, performed the majority of observable sling services (69.3%; OB/GYN pathway 59.8%, urology pathway 9.5%), and OB/GYN-pathway URPS had the highest adjusted annual volume. Second, under fixed-membership classification the all-pathway URPS share increased substantially, from 58.6% to 75.4%, driven primarily by the OB/GYN pathway, while non-URPS participation declined. Third, within-year surgeon concentration remained stable despite a smaller observable surgeon pool. These findings describe a shift in claims-visible fee-for-service practice rather than increasing individual volume or concentration. They should be interpreted as practice patterns, not direct evidence of entry into or exit from the clinical workforce.</w:t>
       </w:r>
     </w:p>
-    <w:bookmarkStart w:id="24" w:name="specialty-distribution-in-context"/>
+    <w:bookmarkStart w:id="23" w:name="specialty-distribution-in-context"/>
     <w:p>
       <w:pPr>
         <w:pStyle w:val="Heading3"/>
@@ -1003,8 +965,8 @@
         <w:t xml:space="preserve">Classifying these subspecialists as general urologists would understate the URPS share and overstate non-URPS urology.</w:t>
       </w:r>
     </w:p>
-    <w:bookmarkEnd w:id="24"/>
-    <w:bookmarkStart w:id="25" w:name="X20e52b27fb040b539cc76dcaad27d56a4599e1f"/>
+    <w:bookmarkEnd w:id="23"/>
+    <w:bookmarkStart w:id="24" w:name="X20e52b27fb040b539cc76dcaad27d56a4599e1f"/>
     <w:p>
       <w:pPr>
         <w:pStyle w:val="Heading3"/>
@@ -1077,8 +1039,8 @@
         <w:t xml:space="preserve">The fee-for-service Medicare medians of 15–19 observable services per year cannot be compared directly with all-payer thresholds. The PUF excludes younger patients, Medicare Advantage, commercial insurance, and physician-years below the suppression threshold; total surgeon volume may therefore exceed the observed Medicare count, but cannot be inferred precisely.</w:t>
       </w:r>
     </w:p>
-    <w:bookmarkEnd w:id="25"/>
-    <w:bookmarkStart w:id="26" w:name="Xeba63cdbe7e55f692c5bff6cdf1a4548a22ac38"/>
+    <w:bookmarkEnd w:id="24"/>
+    <w:bookmarkStart w:id="25" w:name="Xeba63cdbe7e55f692c5bff6cdf1a4548a22ac38"/>
     <w:p>
       <w:pPr>
         <w:pStyle w:val="Heading3"/>
@@ -1147,8 +1109,8 @@
         <w:t xml:space="preserve">and continued surveillance will be needed to determine whether changing treatment preferences alter specialty-specific sling volume.</w:t>
       </w:r>
     </w:p>
-    <w:bookmarkEnd w:id="26"/>
-    <w:bookmarkStart w:id="27" w:name="limitations"/>
+    <w:bookmarkEnd w:id="25"/>
+    <w:bookmarkStart w:id="26" w:name="limitations"/>
     <w:p>
       <w:pPr>
         <w:pStyle w:val="Heading3"/>
@@ -1181,8 +1143,8 @@
         <w:t xml:space="preserve">Approximately 8% of URPS physicians lacked a matched certification year, and urology-pathway URPS status remained fixed because a urology subspecialty certification date was unavailable. Finally, reported line-service units (Tot_Srvcs) may not correspond exactly to unique operations because of claim-line, unit-count, and modifier conventions, and should be interpreted as reported services rather than unique operations.</w:t>
       </w:r>
     </w:p>
-    <w:bookmarkEnd w:id="27"/>
-    <w:bookmarkStart w:id="28" w:name="strengths"/>
+    <w:bookmarkEnd w:id="26"/>
+    <w:bookmarkStart w:id="27" w:name="strengths"/>
     <w:p>
       <w:pPr>
         <w:pStyle w:val="Heading3"/>
@@ -1199,9 +1161,9 @@
         <w:t xml:space="preserve">Strengths include a national sample of publicly reported, nonsuppressed fee-for-service provider-service records; identification of URPS physicians through both certification pathways; explicit separation of organizational and ambiguous billers; within-year and pooled concentration measures with bootstrap confidence intervals; models that account for repeated physician observations; multiple classification sensitivities; and a fully reproducible analytic pipeline.</w:t>
       </w:r>
     </w:p>
+    <w:bookmarkEnd w:id="27"/>
     <w:bookmarkEnd w:id="28"/>
-    <w:bookmarkEnd w:id="29"/>
-    <w:bookmarkStart w:id="30" w:name="conclusions"/>
+    <w:bookmarkStart w:id="29" w:name="conclusions"/>
     <w:p>
       <w:pPr>
         <w:pStyle w:val="Heading2"/>
@@ -1218,8 +1180,8 @@
         <w:t xml:space="preserve">Among physician-years observable in fee-for-service Medicare, URPS physicians performed most reported sling services for stress urinary incontinence, and their share increased from 2013 through 2023. The increase was driven primarily by the OB/GYN pathway and declining observable participation among non-URPS clinicians, not by increasing surgeon-level concentration. Because the PUF excludes low-volume physician-years and Medicare Advantage claims and does not distinguish synthetic midurethral from fascial sling procedures, these results describe observable Medicare service patterns rather than the complete national sling market or clinical workforce. All-payer studies linking volume, outcomes, and geographic access are needed before drawing credentialing conclusions.</w:t>
       </w:r>
     </w:p>
-    <w:bookmarkEnd w:id="30"/>
-    <w:bookmarkStart w:id="32" w:name="references"/>
+    <w:bookmarkEnd w:id="29"/>
+    <w:bookmarkStart w:id="31" w:name="references"/>
     <w:p>
       <w:pPr>
         <w:pStyle w:val="Heading2"/>
@@ -1302,7 +1264,7 @@
       <w:r>
         <w:t xml:space="preserve"> </w:t>
       </w:r>
-      <w:hyperlink r:id="rId31">
+      <w:hyperlink r:id="rId30">
         <w:r>
           <w:rPr>
             <w:rStyle w:val="Hyperlink"/>
@@ -1489,8 +1451,8 @@
         </w:pict>
       </w:r>
     </w:p>
-    <w:bookmarkEnd w:id="32"/>
-    <w:bookmarkStart w:id="33" w:name="tables"/>
+    <w:bookmarkEnd w:id="31"/>
+    <w:bookmarkStart w:id="32" w:name="tables"/>
     <w:p>
       <w:pPr>
         <w:pStyle w:val="Heading2"/>
@@ -3722,8 +3684,8 @@
         </w:pict>
       </w:r>
     </w:p>
-    <w:bookmarkEnd w:id="33"/>
-    <w:bookmarkStart w:id="43" w:name="figures"/>
+    <w:bookmarkEnd w:id="32"/>
+    <w:bookmarkStart w:id="42" w:name="figures"/>
     <w:p>
       <w:pPr>
         <w:pStyle w:val="Heading2"/>
@@ -3741,18 +3703,18 @@
           <wp:inline>
             <wp:extent cx="5334000" cy="3259666"/>
             <wp:effectExtent b="0" l="0" r="0" t="0"/>
-            <wp:docPr descr="" title="" id="35" name="Picture"/>
+            <wp:docPr descr="" title="" id="34" name="Picture"/>
             <a:graphic>
               <a:graphicData uri="http://schemas.openxmlformats.org/drawingml/2006/picture">
                 <pic:pic>
                   <pic:nvPicPr>
-                    <pic:cNvPr descr="/Volumes/MufflySamsung%201/sling-volume-patterns/output/figures/figure_rate_per_100k.png" id="36" name="Picture"/>
+                    <pic:cNvPr descr="/Volumes/MufflySamsung%201/sling-volume-patterns/output/figures/figure_rate_per_100k.png" id="35" name="Picture"/>
                     <pic:cNvPicPr>
                       <a:picLocks noChangeArrowheads="1" noChangeAspect="1"/>
                     </pic:cNvPicPr>
                   </pic:nvPicPr>
                   <pic:blipFill>
-                    <a:blip r:embed="rId34"/>
+                    <a:blip r:embed="rId33"/>
                     <a:stretch>
                       <a:fillRect/>
                     </a:stretch>
@@ -3806,18 +3768,18 @@
           <wp:inline>
             <wp:extent cx="5334000" cy="3368842"/>
             <wp:effectExtent b="0" l="0" r="0" t="0"/>
-            <wp:docPr descr="" title="" id="38" name="Picture"/>
+            <wp:docPr descr="" title="" id="37" name="Picture"/>
             <a:graphic>
               <a:graphicData uri="http://schemas.openxmlformats.org/drawingml/2006/picture">
                 <pic:pic>
                   <pic:nvPicPr>
-                    <pic:cNvPr descr="/Volumes/MufflySamsung%201/sling-volume-patterns/output/figures/figure_market_share.png" id="39" name="Picture"/>
+                    <pic:cNvPr descr="/Volumes/MufflySamsung%201/sling-volume-patterns/output/figures/figure_market_share.png" id="38" name="Picture"/>
                     <pic:cNvPicPr>
                       <a:picLocks noChangeArrowheads="1" noChangeAspect="1"/>
                     </pic:cNvPicPr>
                   </pic:nvPicPr>
                   <pic:blipFill>
-                    <a:blip r:embed="rId37"/>
+                    <a:blip r:embed="rId36"/>
                     <a:stretch>
                       <a:fillRect/>
                     </a:stretch>
@@ -3871,18 +3833,18 @@
           <wp:inline>
             <wp:extent cx="5334000" cy="3879272"/>
             <wp:effectExtent b="0" l="0" r="0" t="0"/>
-            <wp:docPr descr="" title="" id="41" name="Picture"/>
+            <wp:docPr descr="" title="" id="40" name="Picture"/>
             <a:graphic>
               <a:graphicData uri="http://schemas.openxmlformats.org/drawingml/2006/picture">
                 <pic:pic>
                   <pic:nvPicPr>
-                    <pic:cNvPr descr="/Volumes/MufflySamsung%201/sling-volume-patterns/output/figures/figure_classification_flow.png" id="42" name="Picture"/>
+                    <pic:cNvPr descr="/Volumes/MufflySamsung%201/sling-volume-patterns/output/figures/figure_classification_flow.png" id="41" name="Picture"/>
                     <pic:cNvPicPr>
                       <a:picLocks noChangeArrowheads="1" noChangeAspect="1"/>
                     </pic:cNvPicPr>
                   </pic:nvPicPr>
                   <pic:blipFill>
-                    <a:blip r:embed="rId40"/>
+                    <a:blip r:embed="rId39"/>
                     <a:stretch>
                       <a:fillRect/>
                     </a:stretch>
@@ -3934,8 +3896,8 @@
         </w:pict>
       </w:r>
     </w:p>
-    <w:bookmarkEnd w:id="43"/>
-    <w:bookmarkStart w:id="44" w:name="supplementary-information"/>
+    <w:bookmarkEnd w:id="42"/>
+    <w:bookmarkStart w:id="43" w:name="supplementary-information"/>
     <w:p>
       <w:pPr>
         <w:pStyle w:val="Heading2"/>
@@ -17201,8 +17163,8 @@
         </w:pict>
       </w:r>
     </w:p>
-    <w:bookmarkEnd w:id="44"/>
-    <w:bookmarkStart w:id="57" w:name="supplementary-figures"/>
+    <w:bookmarkEnd w:id="43"/>
+    <w:bookmarkStart w:id="56" w:name="supplementary-figures"/>
     <w:p>
       <w:pPr>
         <w:pStyle w:val="Heading2"/>
@@ -17220,18 +17182,18 @@
           <wp:inline>
             <wp:extent cx="5334000" cy="3810000"/>
             <wp:effectExtent b="0" l="0" r="0" t="0"/>
-            <wp:docPr descr="" title="" id="46" name="Picture"/>
+            <wp:docPr descr="" title="" id="45" name="Picture"/>
             <a:graphic>
               <a:graphicData uri="http://schemas.openxmlformats.org/drawingml/2006/picture">
                 <pic:pic>
                   <pic:nvPicPr>
-                    <pic:cNvPr descr="/Volumes/MufflySamsung%201/sling-volume-patterns/output/figures/figure_2_volume_distribution.png" id="47" name="Picture"/>
+                    <pic:cNvPr descr="/Volumes/MufflySamsung%201/sling-volume-patterns/output/figures/figure_2_volume_distribution.png" id="46" name="Picture"/>
                     <pic:cNvPicPr>
                       <a:picLocks noChangeArrowheads="1" noChangeAspect="1"/>
                     </pic:cNvPicPr>
                   </pic:nvPicPr>
                   <pic:blipFill>
-                    <a:blip r:embed="rId45"/>
+                    <a:blip r:embed="rId44"/>
                     <a:stretch>
                       <a:fillRect/>
                     </a:stretch>
@@ -17285,18 +17247,18 @@
           <wp:inline>
             <wp:extent cx="5334000" cy="5334000"/>
             <wp:effectExtent b="0" l="0" r="0" t="0"/>
-            <wp:docPr descr="" title="" id="49" name="Picture"/>
+            <wp:docPr descr="" title="" id="48" name="Picture"/>
             <a:graphic>
               <a:graphicData uri="http://schemas.openxmlformats.org/drawingml/2006/picture">
                 <pic:pic>
                   <pic:nvPicPr>
-                    <pic:cNvPr descr="/Volumes/MufflySamsung%201/sling-volume-patterns/output/figures/figure_3_lorenz_curve.png" id="50" name="Picture"/>
+                    <pic:cNvPr descr="/Volumes/MufflySamsung%201/sling-volume-patterns/output/figures/figure_3_lorenz_curve.png" id="49" name="Picture"/>
                     <pic:cNvPicPr>
                       <a:picLocks noChangeArrowheads="1" noChangeAspect="1"/>
                     </pic:cNvPicPr>
                   </pic:nvPicPr>
                   <pic:blipFill>
-                    <a:blip r:embed="rId48"/>
+                    <a:blip r:embed="rId47"/>
                     <a:stretch>
                       <a:fillRect/>
                     </a:stretch>
@@ -17350,18 +17312,18 @@
           <wp:inline>
             <wp:extent cx="5334000" cy="4148666"/>
             <wp:effectExtent b="0" l="0" r="0" t="0"/>
-            <wp:docPr descr="" title="" id="52" name="Picture"/>
+            <wp:docPr descr="" title="" id="51" name="Picture"/>
             <a:graphic>
               <a:graphicData uri="http://schemas.openxmlformats.org/drawingml/2006/picture">
                 <pic:pic>
                   <pic:nvPicPr>
-                    <pic:cNvPr descr="/Volumes/MufflySamsung%201/sling-volume-patterns/output/figures/figure_4_concentration_trends.png" id="53" name="Picture"/>
+                    <pic:cNvPr descr="/Volumes/MufflySamsung%201/sling-volume-patterns/output/figures/figure_4_concentration_trends.png" id="52" name="Picture"/>
                     <pic:cNvPicPr>
                       <a:picLocks noChangeArrowheads="1" noChangeAspect="1"/>
                     </pic:cNvPicPr>
                   </pic:nvPicPr>
                   <pic:blipFill>
-                    <a:blip r:embed="rId51"/>
+                    <a:blip r:embed="rId50"/>
                     <a:stretch>
                       <a:fillRect/>
                     </a:stretch>
@@ -17415,18 +17377,18 @@
           <wp:inline>
             <wp:extent cx="5334000" cy="2963333"/>
             <wp:effectExtent b="0" l="0" r="0" t="0"/>
-            <wp:docPr descr="" title="" id="55" name="Picture"/>
+            <wp:docPr descr="" title="" id="54" name="Picture"/>
             <a:graphic>
               <a:graphicData uri="http://schemas.openxmlformats.org/drawingml/2006/picture">
                 <pic:pic>
                   <pic:nvPicPr>
-                    <pic:cNvPr descr="/Volumes/MufflySamsung%201/sling-volume-patterns/output/figures/figure_5_supply_trends.png" id="56" name="Picture"/>
+                    <pic:cNvPr descr="/Volumes/MufflySamsung%201/sling-volume-patterns/output/figures/figure_5_supply_trends.png" id="55" name="Picture"/>
                     <pic:cNvPicPr>
                       <a:picLocks noChangeArrowheads="1" noChangeAspect="1"/>
                     </pic:cNvPicPr>
                   </pic:nvPicPr>
                   <pic:blipFill>
-                    <a:blip r:embed="rId54"/>
+                    <a:blip r:embed="rId53"/>
                     <a:stretch>
                       <a:fillRect/>
                     </a:stretch>
@@ -17471,7 +17433,7 @@
         <w:t xml:space="preserve">Observable surgeons and total reported services by year and specialty. The decline in the observable surgeon pool was concentrated in urology and General OB/GYN.</w:t>
       </w:r>
     </w:p>
-    <w:bookmarkEnd w:id="57"/>
+    <w:bookmarkEnd w:id="56"/>
     <w:sectPr>
       <w:lnNumType w:countBy="1" w:distance="360" w:restart="continuous"/>
       <w:footnotePr>

</xml_diff>